<commit_message>
Pavadinimai1Funkcija pridėtas Pito vamzdelių koeficientų parinkimas
</commit_message>
<xml_diff>
--- a/AtmintinėFunkcijos.docx
+++ b/AtmintinėFunkcijos.docx
@@ -201,6 +201,33 @@
           <w:rFonts w:ascii="Times New Roman" w:hAnsi="Times New Roman" w:cs="Times New Roman"/>
         </w:rPr>
         <w:t>D  stulpelį, pradedant nuo D5.</w:t>
+      </w:r>
+    </w:p>
+    <w:p>
+      <w:pPr>
+        <w:spacing w:after="0"/>
+        <w:jc w:val="both"/>
+        <w:rPr>
+          <w:rFonts w:ascii="Times New Roman" w:hAnsi="Times New Roman" w:cs="Times New Roman"/>
+        </w:rPr>
+      </w:pPr>
+      <w:r>
+        <w:rPr>
+          <w:rFonts w:ascii="Times New Roman" w:hAnsi="Times New Roman" w:cs="Times New Roman"/>
+        </w:rPr>
+        <w:t xml:space="preserve">2. Pavadinimai1Funkcija.py surašo lentelės pavadinimą ir stulpelių pavadinimus lape „Greitis“. </w:t>
+      </w:r>
+      <w:r>
+        <w:rPr>
+          <w:rFonts w:ascii="Times New Roman" w:hAnsi="Times New Roman" w:cs="Times New Roman"/>
+        </w:rPr>
+        <w:t>Įrašo skerspjūvio matmenis, suskaičiuoja skerspjūvio plotą</w:t>
+      </w:r>
+      <w:r>
+        <w:rPr>
+          <w:rFonts w:ascii="Times New Roman" w:hAnsi="Times New Roman" w:cs="Times New Roman"/>
+        </w:rPr>
+        <w:t>, pagal matavimo taškų skaičių sulieja A, B, C stulpelius.</w:t>
       </w:r>
     </w:p>
     <w:sectPr>
@@ -1429,6 +1456,26 @@
 </file>
 
 <file path=customXml/item1.xml><?xml version="1.0" encoding="utf-8"?>
+<p:properties xmlns:p="http://schemas.microsoft.com/office/2006/metadata/properties" xmlns:xsi="http://www.w3.org/2001/XMLSchema-instance" xmlns:pc="http://schemas.microsoft.com/office/infopath/2007/PartnerControls">
+  <documentManagement>
+    <lcf76f155ced4ddcb4097134ff3c332f xmlns="453e7e53-5eb2-45cf-b2ab-34c867e554b8">
+      <Terms xmlns="http://schemas.microsoft.com/office/infopath/2007/PartnerControls"/>
+    </lcf76f155ced4ddcb4097134ff3c332f>
+    <TaxCatchAll xmlns="aa0d983d-359a-438c-9953-3af1a8ac0831" xsi:nil="true"/>
+  </documentManagement>
+</p:properties>
+</file>
+
+<file path=customXml/item2.xml><?xml version="1.0" encoding="utf-8"?>
+<?mso-contentType ?>
+<FormTemplates xmlns="http://schemas.microsoft.com/sharepoint/v3/contenttype/forms">
+  <Display>DocumentLibraryForm</Display>
+  <Edit>DocumentLibraryForm</Edit>
+  <New>DocumentLibraryForm</New>
+</FormTemplates>
+</file>
+
+<file path=customXml/item3.xml><?xml version="1.0" encoding="utf-8"?>
 <ct:contentTypeSchema xmlns:ct="http://schemas.microsoft.com/office/2006/metadata/contentType" xmlns:ma="http://schemas.microsoft.com/office/2006/metadata/properties/metaAttributes" ct:_="" ma:_="" ma:contentTypeName="Dokumentas" ma:contentTypeID="0x010100BAB57CF81AE55C4698AAD22D302297F0" ma:contentTypeVersion="18" ma:contentTypeDescription="Kurkite naują dokumentą." ma:contentTypeScope="" ma:versionID="49ab401eb4052690d2a2629974c22fd6">
   <xsd:schema xmlns:xsd="http://www.w3.org/2001/XMLSchema" xmlns:xs="http://www.w3.org/2001/XMLSchema" xmlns:p="http://schemas.microsoft.com/office/2006/metadata/properties" xmlns:ns2="453e7e53-5eb2-45cf-b2ab-34c867e554b8" xmlns:ns3="aa0d983d-359a-438c-9953-3af1a8ac0831" targetNamespace="http://schemas.microsoft.com/office/2006/metadata/properties" ma:root="true" ma:fieldsID="ab9969d50e0b13c63bc5bd0499c928dc" ns2:_="" ns3:_="">
     <xsd:import namespace="453e7e53-5eb2-45cf-b2ab-34c867e554b8"/>
@@ -1683,34 +1730,40 @@
 </ct:contentTypeSchema>
 </file>
 
-<file path=customXml/item2.xml><?xml version="1.0" encoding="utf-8"?>
-<?mso-contentType ?>
-<FormTemplates xmlns="http://schemas.microsoft.com/sharepoint/v3/contenttype/forms">
-  <Display>DocumentLibraryForm</Display>
-  <Edit>DocumentLibraryForm</Edit>
-  <New>DocumentLibraryForm</New>
-</FormTemplates>
-</file>
-
-<file path=customXml/item3.xml><?xml version="1.0" encoding="utf-8"?>
-<p:properties xmlns:p="http://schemas.microsoft.com/office/2006/metadata/properties" xmlns:xsi="http://www.w3.org/2001/XMLSchema-instance" xmlns:pc="http://schemas.microsoft.com/office/infopath/2007/PartnerControls">
-  <documentManagement>
-    <lcf76f155ced4ddcb4097134ff3c332f xmlns="453e7e53-5eb2-45cf-b2ab-34c867e554b8">
-      <Terms xmlns="http://schemas.microsoft.com/office/infopath/2007/PartnerControls"/>
-    </lcf76f155ced4ddcb4097134ff3c332f>
-    <TaxCatchAll xmlns="aa0d983d-359a-438c-9953-3af1a8ac0831" xsi:nil="true"/>
-  </documentManagement>
-</p:properties>
-</file>
-
 <file path=customXml/itemProps1.xml><?xml version="1.0" encoding="utf-8"?>
-<ds:datastoreItem xmlns:ds="http://schemas.openxmlformats.org/officeDocument/2006/customXml" ds:itemID="{CC52CDA6-DE27-4DDF-B41E-8471831E0206}"/>
+<ds:datastoreItem xmlns:ds="http://schemas.openxmlformats.org/officeDocument/2006/customXml" ds:itemID="{52F8D590-B38F-4B4A-8BDD-FD59D16A4DE7}">
+  <ds:schemaRefs>
+    <ds:schemaRef ds:uri="http://schemas.microsoft.com/office/2006/metadata/properties"/>
+    <ds:schemaRef ds:uri="http://schemas.microsoft.com/office/infopath/2007/PartnerControls"/>
+    <ds:schemaRef ds:uri="453e7e53-5eb2-45cf-b2ab-34c867e554b8"/>
+    <ds:schemaRef ds:uri="aa0d983d-359a-438c-9953-3af1a8ac0831"/>
+  </ds:schemaRefs>
+</ds:datastoreItem>
 </file>
 
 <file path=customXml/itemProps2.xml><?xml version="1.0" encoding="utf-8"?>
-<ds:datastoreItem xmlns:ds="http://schemas.openxmlformats.org/officeDocument/2006/customXml" ds:itemID="{47D7D20A-5C87-427E-8B8D-3343B9C6406D}"/>
+<ds:datastoreItem xmlns:ds="http://schemas.openxmlformats.org/officeDocument/2006/customXml" ds:itemID="{47D7D20A-5C87-427E-8B8D-3343B9C6406D}">
+  <ds:schemaRefs>
+    <ds:schemaRef ds:uri="http://schemas.microsoft.com/sharepoint/v3/contenttype/forms"/>
+  </ds:schemaRefs>
+</ds:datastoreItem>
 </file>
 
 <file path=customXml/itemProps3.xml><?xml version="1.0" encoding="utf-8"?>
-<ds:datastoreItem xmlns:ds="http://schemas.openxmlformats.org/officeDocument/2006/customXml" ds:itemID="{52F8D590-B38F-4B4A-8BDD-FD59D16A4DE7}"/>
+<ds:datastoreItem xmlns:ds="http://schemas.openxmlformats.org/officeDocument/2006/customXml" ds:itemID="{CC52CDA6-DE27-4DDF-B41E-8471831E0206}">
+  <ds:schemaRefs>
+    <ds:schemaRef ds:uri="http://schemas.microsoft.com/office/2006/metadata/contentType"/>
+    <ds:schemaRef ds:uri="http://schemas.microsoft.com/office/2006/metadata/properties/metaAttributes"/>
+    <ds:schemaRef ds:uri="http://www.w3.org/2001/XMLSchema"/>
+    <ds:schemaRef ds:uri="http://schemas.microsoft.com/office/2006/metadata/properties"/>
+    <ds:schemaRef ds:uri="453e7e53-5eb2-45cf-b2ab-34c867e554b8"/>
+    <ds:schemaRef ds:uri="aa0d983d-359a-438c-9953-3af1a8ac0831"/>
+    <ds:schemaRef ds:uri="http://schemas.microsoft.com/office/2006/documentManagement/types"/>
+    <ds:schemaRef ds:uri="http://schemas.microsoft.com/office/infopath/2007/PartnerControls"/>
+    <ds:schemaRef ds:uri="http://schemas.openxmlformats.org/package/2006/metadata/core-properties"/>
+    <ds:schemaRef ds:uri="http://purl.org/dc/elements/1.1/"/>
+    <ds:schemaRef ds:uri="http://purl.org/dc/terms/"/>
+    <ds:schemaRef ds:uri="http://schemas.microsoft.com/internal/obd"/>
+  </ds:schemaRefs>
+</ds:datastoreItem>
 </file>
</xml_diff>

<commit_message>
Pridįtas Skesrpjūvio ploto skaičiavimas
</commit_message>
<xml_diff>
--- a/AtmintinėFunkcijos.docx
+++ b/AtmintinėFunkcijos.docx
@@ -242,21 +242,7 @@
         <w:rPr>
           <w:rFonts w:ascii="Times New Roman" w:hAnsi="Times New Roman" w:cs="Times New Roman"/>
         </w:rPr>
-        <w:t xml:space="preserve"> Parenka </w:t>
-      </w:r>
-      <w:proofErr w:type="spellStart"/>
-      <w:r>
-        <w:rPr>
-          <w:rFonts w:ascii="Times New Roman" w:hAnsi="Times New Roman" w:cs="Times New Roman"/>
-        </w:rPr>
-        <w:t>Pito</w:t>
-      </w:r>
-      <w:proofErr w:type="spellEnd"/>
-      <w:r>
-        <w:rPr>
-          <w:rFonts w:ascii="Times New Roman" w:hAnsi="Times New Roman" w:cs="Times New Roman"/>
-        </w:rPr>
-        <w:t xml:space="preserve"> vamzdelio koeficientą ir išplėstinės neapibrėžties koeficientą, užpildo </w:t>
+        <w:t xml:space="preserve"> Parenka Pito vamzdelio koeficientą ir išplėstinės neapibrėžties koeficientą, užpildo </w:t>
       </w:r>
       <w:r>
         <w:rPr>
@@ -264,19 +250,11 @@
         </w:rPr>
         <w:t>lapo „Greitis“ „</w:t>
       </w:r>
-      <w:proofErr w:type="spellStart"/>
-      <w:r>
-        <w:rPr>
-          <w:rFonts w:ascii="Times New Roman" w:hAnsi="Times New Roman" w:cs="Times New Roman"/>
-        </w:rPr>
-        <w:t>Pito</w:t>
-      </w:r>
-      <w:proofErr w:type="spellEnd"/>
-      <w:r>
-        <w:rPr>
-          <w:rFonts w:ascii="Times New Roman" w:hAnsi="Times New Roman" w:cs="Times New Roman"/>
-        </w:rPr>
-        <w:t xml:space="preserve"> vamzdelio koeficientas, K</w:t>
+      <w:r>
+        <w:rPr>
+          <w:rFonts w:ascii="Times New Roman" w:hAnsi="Times New Roman" w:cs="Times New Roman"/>
+        </w:rPr>
+        <w:t>Pito vamzdelio koeficientas, K</w:t>
       </w:r>
       <w:r>
         <w:rPr>
@@ -288,27 +266,85 @@
         <w:rPr>
           <w:rFonts w:ascii="Times New Roman" w:hAnsi="Times New Roman" w:cs="Times New Roman"/>
         </w:rPr>
-        <w:t xml:space="preserve">Išplėstinės neapibrėžties </w:t>
-      </w:r>
-      <w:proofErr w:type="spellStart"/>
-      <w:r>
-        <w:rPr>
-          <w:rFonts w:ascii="Times New Roman" w:hAnsi="Times New Roman" w:cs="Times New Roman"/>
-        </w:rPr>
-        <w:t>koef</w:t>
-      </w:r>
-      <w:proofErr w:type="spellEnd"/>
-      <w:r>
-        <w:rPr>
-          <w:rFonts w:ascii="Times New Roman" w:hAnsi="Times New Roman" w:cs="Times New Roman"/>
-        </w:rPr>
-        <w:t>. A</w:t>
+        <w:t>Išplėstinės neapibrėžties koef. A</w:t>
       </w:r>
       <w:r>
         <w:rPr>
           <w:rFonts w:ascii="Times New Roman" w:hAnsi="Times New Roman" w:cs="Times New Roman"/>
         </w:rPr>
         <w:t>“ reikšmes.</w:t>
+      </w:r>
+    </w:p>
+    <w:p>
+      <w:pPr>
+        <w:spacing w:after="0"/>
+        <w:jc w:val="both"/>
+        <w:rPr>
+          <w:rFonts w:ascii="Times New Roman" w:hAnsi="Times New Roman" w:cs="Times New Roman"/>
+        </w:rPr>
+      </w:pPr>
+    </w:p>
+    <w:p>
+      <w:pPr>
+        <w:spacing w:after="0"/>
+        <w:jc w:val="both"/>
+        <w:rPr>
+          <w:rFonts w:ascii="Times New Roman" w:hAnsi="Times New Roman" w:cs="Times New Roman"/>
+        </w:rPr>
+      </w:pPr>
+      <w:r>
+        <w:rPr>
+          <w:rFonts w:ascii="Times New Roman" w:hAnsi="Times New Roman" w:cs="Times New Roman"/>
+        </w:rPr>
+        <w:t xml:space="preserve">3. Pavadinimai2Funkcija.py surašo visų </w:t>
+      </w:r>
+      <w:r>
+        <w:rPr>
+          <w:rFonts w:ascii="Times New Roman" w:hAnsi="Times New Roman" w:cs="Times New Roman"/>
+        </w:rPr>
+        <w:t xml:space="preserve">„Rezultatai.xlsx“ lapuose (išskyrus „Greitis“) lentelių pavadinimus ir lentelių stulpelių pavadinimus. </w:t>
+      </w:r>
+      <w:r>
+        <w:rPr>
+          <w:rFonts w:ascii="Times New Roman" w:hAnsi="Times New Roman" w:cs="Times New Roman"/>
+        </w:rPr>
+        <w:t xml:space="preserve">Lape „Paėmimas“ įrašo priklausomai nuo ortakio </w:t>
+      </w:r>
+      <w:r>
+        <w:rPr>
+          <w:rFonts w:ascii="Times New Roman" w:hAnsi="Times New Roman" w:cs="Times New Roman"/>
+        </w:rPr>
+        <w:t xml:space="preserve">skerspjūvio ploto „Ortakio skersmuo“ arba „Ortakio vidiniai matmenys“ ir įrašo reikšmę į </w:t>
+      </w:r>
+      <w:r>
+        <w:rPr>
+          <w:rFonts w:ascii="Times New Roman" w:hAnsi="Times New Roman" w:cs="Times New Roman"/>
+        </w:rPr>
+        <w:t>D6 langelį.</w:t>
+      </w:r>
+      <w:r>
+        <w:rPr>
+          <w:rFonts w:ascii="Times New Roman" w:hAnsi="Times New Roman" w:cs="Times New Roman"/>
+        </w:rPr>
+        <w:t xml:space="preserve"> Suskaičiuoja skerspjūvio plotą ir įrašo reik</w:t>
+      </w:r>
+      <w:r>
+        <w:rPr>
+          <w:rFonts w:ascii="Times New Roman" w:hAnsi="Times New Roman" w:cs="Times New Roman"/>
+        </w:rPr>
+        <w:t>šmę į „</w:t>
+      </w:r>
+      <w:r>
+        <w:rPr>
+          <w:rFonts w:ascii="Times New Roman" w:hAnsi="Times New Roman" w:cs="Times New Roman"/>
+        </w:rPr>
+        <w:t>Skerspjūvio plotas A (m2)</w:t>
+      </w:r>
+      <w:r>
+        <w:rPr>
+          <w:rFonts w:ascii="Times New Roman" w:hAnsi="Times New Roman" w:cs="Times New Roman"/>
+        </w:rPr>
+        <w:t>“ E6 langelį.</w:t>
       </w:r>
     </w:p>
     <w:sectPr>

</xml_diff>

<commit_message>
Įvestas Skaiciavimai.py sustabdymas pradiniu duomenu ivedimui ir nuskaitymui
</commit_message>
<xml_diff>
--- a/AtmintinėFunkcijos.docx
+++ b/AtmintinėFunkcijos.docx
@@ -368,7 +368,58 @@
         <w:rPr>
           <w:rFonts w:ascii="Times New Roman" w:hAnsi="Times New Roman" w:cs="Times New Roman"/>
         </w:rPr>
-        <w:t xml:space="preserve">4. SverimasSPFunkcija.py pagal SVP nuspalvoja </w:t>
+        <w:t xml:space="preserve">4. GreitisSPFunkcija.py </w:t>
+      </w:r>
+      <w:r>
+        <w:rPr>
+          <w:rFonts w:ascii="Times New Roman" w:hAnsi="Times New Roman" w:cs="Times New Roman"/>
+        </w:rPr>
+        <w:t xml:space="preserve">pagal SVP </w:t>
+      </w:r>
+      <w:r>
+        <w:rPr>
+          <w:rFonts w:ascii="Times New Roman" w:hAnsi="Times New Roman" w:cs="Times New Roman"/>
+        </w:rPr>
+        <w:t xml:space="preserve">„Rezultatai.xlsx“ lape „Greitis“ </w:t>
+      </w:r>
+      <w:r>
+        <w:rPr>
+          <w:rFonts w:ascii="Times New Roman" w:hAnsi="Times New Roman" w:cs="Times New Roman"/>
+        </w:rPr>
+        <w:t>nuspalvoja lentelę, surašo eilutėse esančius pavadinimus, nubraižo rėmelius.</w:t>
+      </w:r>
+    </w:p>
+    <w:p>
+      <w:pPr>
+        <w:spacing w:after="0"/>
+        <w:jc w:val="both"/>
+        <w:rPr>
+          <w:rFonts w:ascii="Times New Roman" w:hAnsi="Times New Roman" w:cs="Times New Roman"/>
+        </w:rPr>
+      </w:pPr>
+      <w:r>
+        <w:rPr>
+          <w:rFonts w:ascii="Times New Roman" w:hAnsi="Times New Roman" w:cs="Times New Roman"/>
+        </w:rPr>
+        <w:t>5</w:t>
+      </w:r>
+      <w:r>
+        <w:rPr>
+          <w:rFonts w:ascii="Times New Roman" w:hAnsi="Times New Roman" w:cs="Times New Roman"/>
+        </w:rPr>
+        <w:t xml:space="preserve">. SverimasSPFunkcija.py pagal SVP </w:t>
+      </w:r>
+      <w:r>
+        <w:rPr>
+          <w:rFonts w:ascii="Times New Roman" w:hAnsi="Times New Roman" w:cs="Times New Roman"/>
+        </w:rPr>
+        <w:t xml:space="preserve">„Rezultatai.xlsx“ lape „Svėrimas“ </w:t>
+      </w:r>
+      <w:r>
+        <w:rPr>
+          <w:rFonts w:ascii="Times New Roman" w:hAnsi="Times New Roman" w:cs="Times New Roman"/>
+        </w:rPr>
+        <w:t xml:space="preserve">nuspalvoja </w:t>
       </w:r>
       <w:r>
         <w:rPr>
@@ -1603,26 +1654,6 @@
 </file>
 
 <file path=customXml/item1.xml><?xml version="1.0" encoding="utf-8"?>
-<p:properties xmlns:p="http://schemas.microsoft.com/office/2006/metadata/properties" xmlns:xsi="http://www.w3.org/2001/XMLSchema-instance" xmlns:pc="http://schemas.microsoft.com/office/infopath/2007/PartnerControls">
-  <documentManagement>
-    <lcf76f155ced4ddcb4097134ff3c332f xmlns="453e7e53-5eb2-45cf-b2ab-34c867e554b8">
-      <Terms xmlns="http://schemas.microsoft.com/office/infopath/2007/PartnerControls"/>
-    </lcf76f155ced4ddcb4097134ff3c332f>
-    <TaxCatchAll xmlns="aa0d983d-359a-438c-9953-3af1a8ac0831" xsi:nil="true"/>
-  </documentManagement>
-</p:properties>
-</file>
-
-<file path=customXml/item2.xml><?xml version="1.0" encoding="utf-8"?>
-<?mso-contentType ?>
-<FormTemplates xmlns="http://schemas.microsoft.com/sharepoint/v3/contenttype/forms">
-  <Display>DocumentLibraryForm</Display>
-  <Edit>DocumentLibraryForm</Edit>
-  <New>DocumentLibraryForm</New>
-</FormTemplates>
-</file>
-
-<file path=customXml/item3.xml><?xml version="1.0" encoding="utf-8"?>
 <ct:contentTypeSchema xmlns:ct="http://schemas.microsoft.com/office/2006/metadata/contentType" xmlns:ma="http://schemas.microsoft.com/office/2006/metadata/properties/metaAttributes" ct:_="" ma:_="" ma:contentTypeName="Dokumentas" ma:contentTypeID="0x010100BAB57CF81AE55C4698AAD22D302297F0" ma:contentTypeVersion="18" ma:contentTypeDescription="Kurkite naują dokumentą." ma:contentTypeScope="" ma:versionID="49ab401eb4052690d2a2629974c22fd6">
   <xsd:schema xmlns:xsd="http://www.w3.org/2001/XMLSchema" xmlns:xs="http://www.w3.org/2001/XMLSchema" xmlns:p="http://schemas.microsoft.com/office/2006/metadata/properties" xmlns:ns2="453e7e53-5eb2-45cf-b2ab-34c867e554b8" xmlns:ns3="aa0d983d-359a-438c-9953-3af1a8ac0831" targetNamespace="http://schemas.microsoft.com/office/2006/metadata/properties" ma:root="true" ma:fieldsID="ab9969d50e0b13c63bc5bd0499c928dc" ns2:_="" ns3:_="">
     <xsd:import namespace="453e7e53-5eb2-45cf-b2ab-34c867e554b8"/>
@@ -1877,26 +1908,27 @@
 </ct:contentTypeSchema>
 </file>
 
-<file path=customXml/itemProps1.xml><?xml version="1.0" encoding="utf-8"?>
-<ds:datastoreItem xmlns:ds="http://schemas.openxmlformats.org/officeDocument/2006/customXml" ds:itemID="{52F8D590-B38F-4B4A-8BDD-FD59D16A4DE7}">
-  <ds:schemaRefs>
-    <ds:schemaRef ds:uri="http://schemas.microsoft.com/office/2006/metadata/properties"/>
-    <ds:schemaRef ds:uri="http://schemas.microsoft.com/office/infopath/2007/PartnerControls"/>
-    <ds:schemaRef ds:uri="453e7e53-5eb2-45cf-b2ab-34c867e554b8"/>
-    <ds:schemaRef ds:uri="aa0d983d-359a-438c-9953-3af1a8ac0831"/>
-  </ds:schemaRefs>
-</ds:datastoreItem>
+<file path=customXml/item2.xml><?xml version="1.0" encoding="utf-8"?>
+<?mso-contentType ?>
+<FormTemplates xmlns="http://schemas.microsoft.com/sharepoint/v3/contenttype/forms">
+  <Display>DocumentLibraryForm</Display>
+  <Edit>DocumentLibraryForm</Edit>
+  <New>DocumentLibraryForm</New>
+</FormTemplates>
 </file>
 
-<file path=customXml/itemProps2.xml><?xml version="1.0" encoding="utf-8"?>
-<ds:datastoreItem xmlns:ds="http://schemas.openxmlformats.org/officeDocument/2006/customXml" ds:itemID="{47D7D20A-5C87-427E-8B8D-3343B9C6406D}">
-  <ds:schemaRefs>
-    <ds:schemaRef ds:uri="http://schemas.microsoft.com/sharepoint/v3/contenttype/forms"/>
-  </ds:schemaRefs>
-</ds:datastoreItem>
+<file path=customXml/item3.xml><?xml version="1.0" encoding="utf-8"?>
+<p:properties xmlns:p="http://schemas.microsoft.com/office/2006/metadata/properties" xmlns:xsi="http://www.w3.org/2001/XMLSchema-instance" xmlns:pc="http://schemas.microsoft.com/office/infopath/2007/PartnerControls">
+  <documentManagement>
+    <lcf76f155ced4ddcb4097134ff3c332f xmlns="453e7e53-5eb2-45cf-b2ab-34c867e554b8">
+      <Terms xmlns="http://schemas.microsoft.com/office/infopath/2007/PartnerControls"/>
+    </lcf76f155ced4ddcb4097134ff3c332f>
+    <TaxCatchAll xmlns="aa0d983d-359a-438c-9953-3af1a8ac0831" xsi:nil="true"/>
+  </documentManagement>
+</p:properties>
 </file>
 
-<file path=customXml/itemProps3.xml><?xml version="1.0" encoding="utf-8"?>
+<file path=customXml/itemProps1.xml><?xml version="1.0" encoding="utf-8"?>
 <ds:datastoreItem xmlns:ds="http://schemas.openxmlformats.org/officeDocument/2006/customXml" ds:itemID="{CC52CDA6-DE27-4DDF-B41E-8471831E0206}">
   <ds:schemaRefs>
     <ds:schemaRef ds:uri="http://schemas.microsoft.com/office/2006/metadata/contentType"/>
@@ -1913,4 +1945,23 @@
     <ds:schemaRef ds:uri="http://schemas.microsoft.com/internal/obd"/>
   </ds:schemaRefs>
 </ds:datastoreItem>
+</file>
+
+<file path=customXml/itemProps2.xml><?xml version="1.0" encoding="utf-8"?>
+<ds:datastoreItem xmlns:ds="http://schemas.openxmlformats.org/officeDocument/2006/customXml" ds:itemID="{47D7D20A-5C87-427E-8B8D-3343B9C6406D}">
+  <ds:schemaRefs>
+    <ds:schemaRef ds:uri="http://schemas.microsoft.com/sharepoint/v3/contenttype/forms"/>
+  </ds:schemaRefs>
+</ds:datastoreItem>
+</file>
+
+<file path=customXml/itemProps3.xml><?xml version="1.0" encoding="utf-8"?>
+<ds:datastoreItem xmlns:ds="http://schemas.openxmlformats.org/officeDocument/2006/customXml" ds:itemID="{52F8D590-B38F-4B4A-8BDD-FD59D16A4DE7}">
+  <ds:schemaRefs>
+    <ds:schemaRef ds:uri="http://schemas.microsoft.com/office/2006/metadata/properties"/>
+    <ds:schemaRef ds:uri="http://schemas.microsoft.com/office/infopath/2007/PartnerControls"/>
+    <ds:schemaRef ds:uri="453e7e53-5eb2-45cf-b2ab-34c867e554b8"/>
+    <ds:schemaRef ds:uri="aa0d983d-359a-438c-9953-3af1a8ac0831"/>
+  </ds:schemaRefs>
+</ds:datastoreItem>
 </file>
</xml_diff>

<commit_message>
Pridėtas duomenų perkėlimas į Aerodinamikos, Svėrimo ir Koncentracijos lapus
</commit_message>
<xml_diff>
--- a/AtmintinėFunkcijos.docx
+++ b/AtmintinėFunkcijos.docx
@@ -368,25 +368,67 @@
         <w:rPr>
           <w:rFonts w:ascii="Times New Roman" w:hAnsi="Times New Roman" w:cs="Times New Roman"/>
         </w:rPr>
-        <w:t xml:space="preserve">4. GreitisSPFunkcija.py </w:t>
-      </w:r>
-      <w:r>
-        <w:rPr>
-          <w:rFonts w:ascii="Times New Roman" w:hAnsi="Times New Roman" w:cs="Times New Roman"/>
-        </w:rPr>
-        <w:t xml:space="preserve">pagal SVP </w:t>
-      </w:r>
-      <w:r>
-        <w:rPr>
-          <w:rFonts w:ascii="Times New Roman" w:hAnsi="Times New Roman" w:cs="Times New Roman"/>
-        </w:rPr>
-        <w:t xml:space="preserve">„Rezultatai.xlsx“ lape „Greitis“ </w:t>
-      </w:r>
-      <w:r>
-        <w:rPr>
-          <w:rFonts w:ascii="Times New Roman" w:hAnsi="Times New Roman" w:cs="Times New Roman"/>
-        </w:rPr>
-        <w:t>nuspalvoja lentelę, surašo eilutėse esančius pavadinimus, nubraižo rėmelius.</w:t>
+        <w:t>4. Pradiniai1Funkcija.py sukuria „Pradiniai.xlsx“ failą su lapais „Pradiniai“, „Greitis“, „Paėmimas“</w:t>
+      </w:r>
+      <w:r>
+        <w:rPr>
+          <w:rFonts w:ascii="Times New Roman" w:hAnsi="Times New Roman" w:cs="Times New Roman"/>
+        </w:rPr>
+        <w:t xml:space="preserve">. Lape „Pradiniai“ sukuria lentelę ir iš jos perkelia duomenis į lapus „Greitis“ ir „Paėmimas“ užpildydama </w:t>
+      </w:r>
+      <w:r>
+        <w:rPr>
+          <w:rFonts w:ascii="Times New Roman" w:hAnsi="Times New Roman" w:cs="Times New Roman"/>
+        </w:rPr>
+        <w:t>stulpelius „</w:t>
+      </w:r>
+      <w:r>
+        <w:rPr>
+          <w:rFonts w:ascii="Times New Roman" w:hAnsi="Times New Roman" w:cs="Times New Roman"/>
+        </w:rPr>
+        <w:t>Matavimo data</w:t>
+      </w:r>
+      <w:r>
+        <w:rPr>
+          <w:rFonts w:ascii="Times New Roman" w:hAnsi="Times New Roman" w:cs="Times New Roman"/>
+        </w:rPr>
+        <w:t xml:space="preserve">“; </w:t>
+      </w:r>
+      <w:r>
+        <w:rPr>
+          <w:rFonts w:ascii="Times New Roman" w:hAnsi="Times New Roman" w:cs="Times New Roman"/>
+        </w:rPr>
+        <w:t>„</w:t>
+      </w:r>
+      <w:r>
+        <w:rPr>
+          <w:rFonts w:ascii="Times New Roman" w:hAnsi="Times New Roman" w:cs="Times New Roman"/>
+        </w:rPr>
+        <w:t>Ėminių registracijos Nr. T-107-2026-E-</w:t>
+      </w:r>
+      <w:r>
+        <w:rPr>
+          <w:rFonts w:ascii="Times New Roman" w:hAnsi="Times New Roman" w:cs="Times New Roman"/>
+        </w:rPr>
+        <w:t>“</w:t>
+      </w:r>
+      <w:r>
+        <w:rPr>
+          <w:rFonts w:ascii="Times New Roman" w:hAnsi="Times New Roman" w:cs="Times New Roman"/>
+        </w:rPr>
+        <w:t xml:space="preserve">; </w:t>
+      </w:r>
+      <w:r>
+        <w:rPr>
+          <w:rFonts w:ascii="Times New Roman" w:hAnsi="Times New Roman" w:cs="Times New Roman"/>
+        </w:rPr>
+        <w:t>Objekto pavadinimas, adresas, taršos šaltinio Nr.</w:t>
+      </w:r>
+      <w:r>
+        <w:rPr>
+          <w:rFonts w:ascii="Times New Roman" w:hAnsi="Times New Roman" w:cs="Times New Roman"/>
+        </w:rPr>
+        <w:t>“.</w:t>
       </w:r>
     </w:p>
     <w:p>
@@ -402,6 +444,27 @@
           <w:rFonts w:ascii="Times New Roman" w:hAnsi="Times New Roman" w:cs="Times New Roman"/>
         </w:rPr>
         <w:t>5</w:t>
+      </w:r>
+      <w:r>
+        <w:rPr>
+          <w:rFonts w:ascii="Times New Roman" w:hAnsi="Times New Roman" w:cs="Times New Roman"/>
+        </w:rPr>
+        <w:t>. GreitisSPFunkcija.py pagal SVP „Rezultatai.xlsx“ lape „Greitis“ nuspalvoja lentelę, surašo eilutėse esančius pavadinimus, nubraižo rėmelius.</w:t>
+      </w:r>
+    </w:p>
+    <w:p>
+      <w:pPr>
+        <w:spacing w:after="0"/>
+        <w:jc w:val="both"/>
+        <w:rPr>
+          <w:rFonts w:ascii="Times New Roman" w:hAnsi="Times New Roman" w:cs="Times New Roman"/>
+        </w:rPr>
+      </w:pPr>
+      <w:r>
+        <w:rPr>
+          <w:rFonts w:ascii="Times New Roman" w:hAnsi="Times New Roman" w:cs="Times New Roman"/>
+        </w:rPr>
+        <w:t>6</w:t>
       </w:r>
       <w:r>
         <w:rPr>
@@ -1654,6 +1717,26 @@
 </file>
 
 <file path=customXml/item1.xml><?xml version="1.0" encoding="utf-8"?>
+<p:properties xmlns:p="http://schemas.microsoft.com/office/2006/metadata/properties" xmlns:xsi="http://www.w3.org/2001/XMLSchema-instance" xmlns:pc="http://schemas.microsoft.com/office/infopath/2007/PartnerControls">
+  <documentManagement>
+    <lcf76f155ced4ddcb4097134ff3c332f xmlns="453e7e53-5eb2-45cf-b2ab-34c867e554b8">
+      <Terms xmlns="http://schemas.microsoft.com/office/infopath/2007/PartnerControls"/>
+    </lcf76f155ced4ddcb4097134ff3c332f>
+    <TaxCatchAll xmlns="aa0d983d-359a-438c-9953-3af1a8ac0831" xsi:nil="true"/>
+  </documentManagement>
+</p:properties>
+</file>
+
+<file path=customXml/item2.xml><?xml version="1.0" encoding="utf-8"?>
+<?mso-contentType ?>
+<FormTemplates xmlns="http://schemas.microsoft.com/sharepoint/v3/contenttype/forms">
+  <Display>DocumentLibraryForm</Display>
+  <Edit>DocumentLibraryForm</Edit>
+  <New>DocumentLibraryForm</New>
+</FormTemplates>
+</file>
+
+<file path=customXml/item3.xml><?xml version="1.0" encoding="utf-8"?>
 <ct:contentTypeSchema xmlns:ct="http://schemas.microsoft.com/office/2006/metadata/contentType" xmlns:ma="http://schemas.microsoft.com/office/2006/metadata/properties/metaAttributes" ct:_="" ma:_="" ma:contentTypeName="Dokumentas" ma:contentTypeID="0x010100BAB57CF81AE55C4698AAD22D302297F0" ma:contentTypeVersion="18" ma:contentTypeDescription="Kurkite naują dokumentą." ma:contentTypeScope="" ma:versionID="49ab401eb4052690d2a2629974c22fd6">
   <xsd:schema xmlns:xsd="http://www.w3.org/2001/XMLSchema" xmlns:xs="http://www.w3.org/2001/XMLSchema" xmlns:p="http://schemas.microsoft.com/office/2006/metadata/properties" xmlns:ns2="453e7e53-5eb2-45cf-b2ab-34c867e554b8" xmlns:ns3="aa0d983d-359a-438c-9953-3af1a8ac0831" targetNamespace="http://schemas.microsoft.com/office/2006/metadata/properties" ma:root="true" ma:fieldsID="ab9969d50e0b13c63bc5bd0499c928dc" ns2:_="" ns3:_="">
     <xsd:import namespace="453e7e53-5eb2-45cf-b2ab-34c867e554b8"/>
@@ -1908,27 +1991,26 @@
 </ct:contentTypeSchema>
 </file>
 
-<file path=customXml/item2.xml><?xml version="1.0" encoding="utf-8"?>
-<?mso-contentType ?>
-<FormTemplates xmlns="http://schemas.microsoft.com/sharepoint/v3/contenttype/forms">
-  <Display>DocumentLibraryForm</Display>
-  <Edit>DocumentLibraryForm</Edit>
-  <New>DocumentLibraryForm</New>
-</FormTemplates>
+<file path=customXml/itemProps1.xml><?xml version="1.0" encoding="utf-8"?>
+<ds:datastoreItem xmlns:ds="http://schemas.openxmlformats.org/officeDocument/2006/customXml" ds:itemID="{52F8D590-B38F-4B4A-8BDD-FD59D16A4DE7}">
+  <ds:schemaRefs>
+    <ds:schemaRef ds:uri="http://schemas.microsoft.com/office/2006/metadata/properties"/>
+    <ds:schemaRef ds:uri="http://schemas.microsoft.com/office/infopath/2007/PartnerControls"/>
+    <ds:schemaRef ds:uri="453e7e53-5eb2-45cf-b2ab-34c867e554b8"/>
+    <ds:schemaRef ds:uri="aa0d983d-359a-438c-9953-3af1a8ac0831"/>
+  </ds:schemaRefs>
+</ds:datastoreItem>
 </file>
 
-<file path=customXml/item3.xml><?xml version="1.0" encoding="utf-8"?>
-<p:properties xmlns:p="http://schemas.microsoft.com/office/2006/metadata/properties" xmlns:xsi="http://www.w3.org/2001/XMLSchema-instance" xmlns:pc="http://schemas.microsoft.com/office/infopath/2007/PartnerControls">
-  <documentManagement>
-    <lcf76f155ced4ddcb4097134ff3c332f xmlns="453e7e53-5eb2-45cf-b2ab-34c867e554b8">
-      <Terms xmlns="http://schemas.microsoft.com/office/infopath/2007/PartnerControls"/>
-    </lcf76f155ced4ddcb4097134ff3c332f>
-    <TaxCatchAll xmlns="aa0d983d-359a-438c-9953-3af1a8ac0831" xsi:nil="true"/>
-  </documentManagement>
-</p:properties>
+<file path=customXml/itemProps2.xml><?xml version="1.0" encoding="utf-8"?>
+<ds:datastoreItem xmlns:ds="http://schemas.openxmlformats.org/officeDocument/2006/customXml" ds:itemID="{47D7D20A-5C87-427E-8B8D-3343B9C6406D}">
+  <ds:schemaRefs>
+    <ds:schemaRef ds:uri="http://schemas.microsoft.com/sharepoint/v3/contenttype/forms"/>
+  </ds:schemaRefs>
+</ds:datastoreItem>
 </file>
 
-<file path=customXml/itemProps1.xml><?xml version="1.0" encoding="utf-8"?>
+<file path=customXml/itemProps3.xml><?xml version="1.0" encoding="utf-8"?>
 <ds:datastoreItem xmlns:ds="http://schemas.openxmlformats.org/officeDocument/2006/customXml" ds:itemID="{CC52CDA6-DE27-4DDF-B41E-8471831E0206}">
   <ds:schemaRefs>
     <ds:schemaRef ds:uri="http://schemas.microsoft.com/office/2006/metadata/contentType"/>
@@ -1945,23 +2027,4 @@
     <ds:schemaRef ds:uri="http://schemas.microsoft.com/internal/obd"/>
   </ds:schemaRefs>
 </ds:datastoreItem>
-</file>
-
-<file path=customXml/itemProps2.xml><?xml version="1.0" encoding="utf-8"?>
-<ds:datastoreItem xmlns:ds="http://schemas.openxmlformats.org/officeDocument/2006/customXml" ds:itemID="{47D7D20A-5C87-427E-8B8D-3343B9C6406D}">
-  <ds:schemaRefs>
-    <ds:schemaRef ds:uri="http://schemas.microsoft.com/sharepoint/v3/contenttype/forms"/>
-  </ds:schemaRefs>
-</ds:datastoreItem>
-</file>
-
-<file path=customXml/itemProps3.xml><?xml version="1.0" encoding="utf-8"?>
-<ds:datastoreItem xmlns:ds="http://schemas.openxmlformats.org/officeDocument/2006/customXml" ds:itemID="{52F8D590-B38F-4B4A-8BDD-FD59D16A4DE7}">
-  <ds:schemaRefs>
-    <ds:schemaRef ds:uri="http://schemas.microsoft.com/office/2006/metadata/properties"/>
-    <ds:schemaRef ds:uri="http://schemas.microsoft.com/office/infopath/2007/PartnerControls"/>
-    <ds:schemaRef ds:uri="453e7e53-5eb2-45cf-b2ab-34c867e554b8"/>
-    <ds:schemaRef ds:uri="aa0d983d-359a-438c-9953-3af1a8ac0831"/>
-  </ds:schemaRefs>
-</ds:datastoreItem>
 </file>
</xml_diff>

<commit_message>
Duomenys perkeliami į lapa Greitis su Pradiniai2Funkcija.py
</commit_message>
<xml_diff>
--- a/AtmintinėFunkcijos.docx
+++ b/AtmintinėFunkcijos.docx
@@ -242,7 +242,21 @@
         <w:rPr>
           <w:rFonts w:ascii="Times New Roman" w:hAnsi="Times New Roman" w:cs="Times New Roman"/>
         </w:rPr>
-        <w:t xml:space="preserve"> Parenka Pito vamzdelio koeficientą ir išplėstinės neapibrėžties koeficientą, užpildo </w:t>
+        <w:t xml:space="preserve"> Parenka </w:t>
+      </w:r>
+      <w:proofErr w:type="spellStart"/>
+      <w:r>
+        <w:rPr>
+          <w:rFonts w:ascii="Times New Roman" w:hAnsi="Times New Roman" w:cs="Times New Roman"/>
+        </w:rPr>
+        <w:t>Pito</w:t>
+      </w:r>
+      <w:proofErr w:type="spellEnd"/>
+      <w:r>
+        <w:rPr>
+          <w:rFonts w:ascii="Times New Roman" w:hAnsi="Times New Roman" w:cs="Times New Roman"/>
+        </w:rPr>
+        <w:t xml:space="preserve"> vamzdelio koeficientą ir išplėstinės neapibrėžties koeficientą, užpildo </w:t>
       </w:r>
       <w:r>
         <w:rPr>
@@ -250,11 +264,19 @@
         </w:rPr>
         <w:t>lapo „Greitis“ „</w:t>
       </w:r>
-      <w:r>
-        <w:rPr>
-          <w:rFonts w:ascii="Times New Roman" w:hAnsi="Times New Roman" w:cs="Times New Roman"/>
-        </w:rPr>
-        <w:t>Pito vamzdelio koeficientas, K</w:t>
+      <w:proofErr w:type="spellStart"/>
+      <w:r>
+        <w:rPr>
+          <w:rFonts w:ascii="Times New Roman" w:hAnsi="Times New Roman" w:cs="Times New Roman"/>
+        </w:rPr>
+        <w:t>Pito</w:t>
+      </w:r>
+      <w:proofErr w:type="spellEnd"/>
+      <w:r>
+        <w:rPr>
+          <w:rFonts w:ascii="Times New Roman" w:hAnsi="Times New Roman" w:cs="Times New Roman"/>
+        </w:rPr>
+        <w:t xml:space="preserve"> vamzdelio koeficientas, K</w:t>
       </w:r>
       <w:r>
         <w:rPr>
@@ -266,7 +288,21 @@
         <w:rPr>
           <w:rFonts w:ascii="Times New Roman" w:hAnsi="Times New Roman" w:cs="Times New Roman"/>
         </w:rPr>
-        <w:t>Išplėstinės neapibrėžties koef. A</w:t>
+        <w:t xml:space="preserve">Išplėstinės neapibrėžties </w:t>
+      </w:r>
+      <w:proofErr w:type="spellStart"/>
+      <w:r>
+        <w:rPr>
+          <w:rFonts w:ascii="Times New Roman" w:hAnsi="Times New Roman" w:cs="Times New Roman"/>
+        </w:rPr>
+        <w:t>koef</w:t>
+      </w:r>
+      <w:proofErr w:type="spellEnd"/>
+      <w:r>
+        <w:rPr>
+          <w:rFonts w:ascii="Times New Roman" w:hAnsi="Times New Roman" w:cs="Times New Roman"/>
+        </w:rPr>
+        <w:t>. A</w:t>
       </w:r>
       <w:r>
         <w:rPr>
@@ -374,7 +410,37 @@
         <w:rPr>
           <w:rFonts w:ascii="Times New Roman" w:hAnsi="Times New Roman" w:cs="Times New Roman"/>
         </w:rPr>
-        <w:t xml:space="preserve">. Lape „Pradiniai“ sukuria lentelę ir iš jos perkelia duomenis į lapus „Greitis“ ir „Paėmimas“ užpildydama </w:t>
+        <w:t>. Lape „Pradiniai“ sukuria lentelę ir iš jos perkelia duomenis į lapus „Greitis“</w:t>
+      </w:r>
+      <w:r>
+        <w:rPr>
+          <w:rFonts w:ascii="Times New Roman" w:hAnsi="Times New Roman" w:cs="Times New Roman"/>
+        </w:rPr>
+        <w:t>,</w:t>
+      </w:r>
+      <w:r>
+        <w:rPr>
+          <w:rFonts w:ascii="Times New Roman" w:hAnsi="Times New Roman" w:cs="Times New Roman"/>
+        </w:rPr>
+        <w:t xml:space="preserve"> „Paėmimas“</w:t>
+      </w:r>
+      <w:r>
+        <w:rPr>
+          <w:rFonts w:ascii="Times New Roman" w:hAnsi="Times New Roman" w:cs="Times New Roman"/>
+        </w:rPr>
+        <w:t>, „Aerodinamika“</w:t>
+      </w:r>
+      <w:r>
+        <w:rPr>
+          <w:rFonts w:ascii="Times New Roman" w:hAnsi="Times New Roman" w:cs="Times New Roman"/>
+        </w:rPr>
+        <w:t>, „Koncentracija“, „Svėrimas“</w:t>
+      </w:r>
+      <w:r>
+        <w:rPr>
+          <w:rFonts w:ascii="Times New Roman" w:hAnsi="Times New Roman" w:cs="Times New Roman"/>
+        </w:rPr>
+        <w:t xml:space="preserve"> užpildydama </w:t>
       </w:r>
       <w:r>
         <w:rPr>
@@ -410,13 +476,13 @@
         <w:rPr>
           <w:rFonts w:ascii="Times New Roman" w:hAnsi="Times New Roman" w:cs="Times New Roman"/>
         </w:rPr>
-        <w:t>“</w:t>
-      </w:r>
-      <w:r>
-        <w:rPr>
-          <w:rFonts w:ascii="Times New Roman" w:hAnsi="Times New Roman" w:cs="Times New Roman"/>
-        </w:rPr>
-        <w:t xml:space="preserve">; </w:t>
+        <w:t xml:space="preserve">“; </w:t>
+      </w:r>
+      <w:r>
+        <w:rPr>
+          <w:rFonts w:ascii="Times New Roman" w:hAnsi="Times New Roman" w:cs="Times New Roman"/>
+        </w:rPr>
+        <w:t>„</w:t>
       </w:r>
       <w:r>
         <w:rPr>
@@ -439,6 +505,15 @@
           <w:rFonts w:ascii="Times New Roman" w:hAnsi="Times New Roman" w:cs="Times New Roman"/>
         </w:rPr>
       </w:pPr>
+    </w:p>
+    <w:p>
+      <w:pPr>
+        <w:spacing w:after="0"/>
+        <w:jc w:val="both"/>
+        <w:rPr>
+          <w:rFonts w:ascii="Times New Roman" w:hAnsi="Times New Roman" w:cs="Times New Roman"/>
+        </w:rPr>
+      </w:pPr>
       <w:r>
         <w:rPr>
           <w:rFonts w:ascii="Times New Roman" w:hAnsi="Times New Roman" w:cs="Times New Roman"/>
@@ -451,6 +526,15 @@
         </w:rPr>
         <w:t>. GreitisSPFunkcija.py pagal SVP „Rezultatai.xlsx“ lape „Greitis“ nuspalvoja lentelę, surašo eilutėse esančius pavadinimus, nubraižo rėmelius.</w:t>
       </w:r>
+    </w:p>
+    <w:p>
+      <w:pPr>
+        <w:spacing w:after="0"/>
+        <w:jc w:val="both"/>
+        <w:rPr>
+          <w:rFonts w:ascii="Times New Roman" w:hAnsi="Times New Roman" w:cs="Times New Roman"/>
+        </w:rPr>
+      </w:pPr>
     </w:p>
     <w:p>
       <w:pPr>
@@ -1717,26 +1801,6 @@
 </file>
 
 <file path=customXml/item1.xml><?xml version="1.0" encoding="utf-8"?>
-<p:properties xmlns:p="http://schemas.microsoft.com/office/2006/metadata/properties" xmlns:xsi="http://www.w3.org/2001/XMLSchema-instance" xmlns:pc="http://schemas.microsoft.com/office/infopath/2007/PartnerControls">
-  <documentManagement>
-    <lcf76f155ced4ddcb4097134ff3c332f xmlns="453e7e53-5eb2-45cf-b2ab-34c867e554b8">
-      <Terms xmlns="http://schemas.microsoft.com/office/infopath/2007/PartnerControls"/>
-    </lcf76f155ced4ddcb4097134ff3c332f>
-    <TaxCatchAll xmlns="aa0d983d-359a-438c-9953-3af1a8ac0831" xsi:nil="true"/>
-  </documentManagement>
-</p:properties>
-</file>
-
-<file path=customXml/item2.xml><?xml version="1.0" encoding="utf-8"?>
-<?mso-contentType ?>
-<FormTemplates xmlns="http://schemas.microsoft.com/sharepoint/v3/contenttype/forms">
-  <Display>DocumentLibraryForm</Display>
-  <Edit>DocumentLibraryForm</Edit>
-  <New>DocumentLibraryForm</New>
-</FormTemplates>
-</file>
-
-<file path=customXml/item3.xml><?xml version="1.0" encoding="utf-8"?>
 <ct:contentTypeSchema xmlns:ct="http://schemas.microsoft.com/office/2006/metadata/contentType" xmlns:ma="http://schemas.microsoft.com/office/2006/metadata/properties/metaAttributes" ct:_="" ma:_="" ma:contentTypeName="Dokumentas" ma:contentTypeID="0x010100BAB57CF81AE55C4698AAD22D302297F0" ma:contentTypeVersion="18" ma:contentTypeDescription="Kurkite naują dokumentą." ma:contentTypeScope="" ma:versionID="49ab401eb4052690d2a2629974c22fd6">
   <xsd:schema xmlns:xsd="http://www.w3.org/2001/XMLSchema" xmlns:xs="http://www.w3.org/2001/XMLSchema" xmlns:p="http://schemas.microsoft.com/office/2006/metadata/properties" xmlns:ns2="453e7e53-5eb2-45cf-b2ab-34c867e554b8" xmlns:ns3="aa0d983d-359a-438c-9953-3af1a8ac0831" targetNamespace="http://schemas.microsoft.com/office/2006/metadata/properties" ma:root="true" ma:fieldsID="ab9969d50e0b13c63bc5bd0499c928dc" ns2:_="" ns3:_="">
     <xsd:import namespace="453e7e53-5eb2-45cf-b2ab-34c867e554b8"/>
@@ -1991,26 +2055,27 @@
 </ct:contentTypeSchema>
 </file>
 
-<file path=customXml/itemProps1.xml><?xml version="1.0" encoding="utf-8"?>
-<ds:datastoreItem xmlns:ds="http://schemas.openxmlformats.org/officeDocument/2006/customXml" ds:itemID="{52F8D590-B38F-4B4A-8BDD-FD59D16A4DE7}">
-  <ds:schemaRefs>
-    <ds:schemaRef ds:uri="http://schemas.microsoft.com/office/2006/metadata/properties"/>
-    <ds:schemaRef ds:uri="http://schemas.microsoft.com/office/infopath/2007/PartnerControls"/>
-    <ds:schemaRef ds:uri="453e7e53-5eb2-45cf-b2ab-34c867e554b8"/>
-    <ds:schemaRef ds:uri="aa0d983d-359a-438c-9953-3af1a8ac0831"/>
-  </ds:schemaRefs>
-</ds:datastoreItem>
+<file path=customXml/item2.xml><?xml version="1.0" encoding="utf-8"?>
+<?mso-contentType ?>
+<FormTemplates xmlns="http://schemas.microsoft.com/sharepoint/v3/contenttype/forms">
+  <Display>DocumentLibraryForm</Display>
+  <Edit>DocumentLibraryForm</Edit>
+  <New>DocumentLibraryForm</New>
+</FormTemplates>
 </file>
 
-<file path=customXml/itemProps2.xml><?xml version="1.0" encoding="utf-8"?>
-<ds:datastoreItem xmlns:ds="http://schemas.openxmlformats.org/officeDocument/2006/customXml" ds:itemID="{47D7D20A-5C87-427E-8B8D-3343B9C6406D}">
-  <ds:schemaRefs>
-    <ds:schemaRef ds:uri="http://schemas.microsoft.com/sharepoint/v3/contenttype/forms"/>
-  </ds:schemaRefs>
-</ds:datastoreItem>
+<file path=customXml/item3.xml><?xml version="1.0" encoding="utf-8"?>
+<p:properties xmlns:p="http://schemas.microsoft.com/office/2006/metadata/properties" xmlns:xsi="http://www.w3.org/2001/XMLSchema-instance" xmlns:pc="http://schemas.microsoft.com/office/infopath/2007/PartnerControls">
+  <documentManagement>
+    <lcf76f155ced4ddcb4097134ff3c332f xmlns="453e7e53-5eb2-45cf-b2ab-34c867e554b8">
+      <Terms xmlns="http://schemas.microsoft.com/office/infopath/2007/PartnerControls"/>
+    </lcf76f155ced4ddcb4097134ff3c332f>
+    <TaxCatchAll xmlns="aa0d983d-359a-438c-9953-3af1a8ac0831" xsi:nil="true"/>
+  </documentManagement>
+</p:properties>
 </file>
 
-<file path=customXml/itemProps3.xml><?xml version="1.0" encoding="utf-8"?>
+<file path=customXml/itemProps1.xml><?xml version="1.0" encoding="utf-8"?>
 <ds:datastoreItem xmlns:ds="http://schemas.openxmlformats.org/officeDocument/2006/customXml" ds:itemID="{CC52CDA6-DE27-4DDF-B41E-8471831E0206}">
   <ds:schemaRefs>
     <ds:schemaRef ds:uri="http://schemas.microsoft.com/office/2006/metadata/contentType"/>
@@ -2027,4 +2092,23 @@
     <ds:schemaRef ds:uri="http://schemas.microsoft.com/internal/obd"/>
   </ds:schemaRefs>
 </ds:datastoreItem>
+</file>
+
+<file path=customXml/itemProps2.xml><?xml version="1.0" encoding="utf-8"?>
+<ds:datastoreItem xmlns:ds="http://schemas.openxmlformats.org/officeDocument/2006/customXml" ds:itemID="{47D7D20A-5C87-427E-8B8D-3343B9C6406D}">
+  <ds:schemaRefs>
+    <ds:schemaRef ds:uri="http://schemas.microsoft.com/sharepoint/v3/contenttype/forms"/>
+  </ds:schemaRefs>
+</ds:datastoreItem>
+</file>
+
+<file path=customXml/itemProps3.xml><?xml version="1.0" encoding="utf-8"?>
+<ds:datastoreItem xmlns:ds="http://schemas.openxmlformats.org/officeDocument/2006/customXml" ds:itemID="{52F8D590-B38F-4B4A-8BDD-FD59D16A4DE7}">
+  <ds:schemaRefs>
+    <ds:schemaRef ds:uri="http://schemas.microsoft.com/office/2006/metadata/properties"/>
+    <ds:schemaRef ds:uri="http://schemas.microsoft.com/office/infopath/2007/PartnerControls"/>
+    <ds:schemaRef ds:uri="453e7e53-5eb2-45cf-b2ab-34c867e554b8"/>
+    <ds:schemaRef ds:uri="aa0d983d-359a-438c-9953-3af1a8ac0831"/>
+  </ds:schemaRefs>
+</ds:datastoreItem>
 </file>
</xml_diff>

<commit_message>
Pakeista Pradiniai2Funkcija.py dėl diferencinių slėgių įrašymo į Paėmimas
</commit_message>
<xml_diff>
--- a/AtmintinėFunkcijos.docx
+++ b/AtmintinėFunkcijos.docx
@@ -242,21 +242,7 @@
         <w:rPr>
           <w:rFonts w:ascii="Times New Roman" w:hAnsi="Times New Roman" w:cs="Times New Roman"/>
         </w:rPr>
-        <w:t xml:space="preserve"> Parenka </w:t>
-      </w:r>
-      <w:proofErr w:type="spellStart"/>
-      <w:r>
-        <w:rPr>
-          <w:rFonts w:ascii="Times New Roman" w:hAnsi="Times New Roman" w:cs="Times New Roman"/>
-        </w:rPr>
-        <w:t>Pito</w:t>
-      </w:r>
-      <w:proofErr w:type="spellEnd"/>
-      <w:r>
-        <w:rPr>
-          <w:rFonts w:ascii="Times New Roman" w:hAnsi="Times New Roman" w:cs="Times New Roman"/>
-        </w:rPr>
-        <w:t xml:space="preserve"> vamzdelio koeficientą ir išplėstinės neapibrėžties koeficientą, užpildo </w:t>
+        <w:t xml:space="preserve"> Parenka Pito vamzdelio koeficientą ir išplėstinės neapibrėžties koeficientą, užpildo </w:t>
       </w:r>
       <w:r>
         <w:rPr>
@@ -264,19 +250,11 @@
         </w:rPr>
         <w:t>lapo „Greitis“ „</w:t>
       </w:r>
-      <w:proofErr w:type="spellStart"/>
-      <w:r>
-        <w:rPr>
-          <w:rFonts w:ascii="Times New Roman" w:hAnsi="Times New Roman" w:cs="Times New Roman"/>
-        </w:rPr>
-        <w:t>Pito</w:t>
-      </w:r>
-      <w:proofErr w:type="spellEnd"/>
-      <w:r>
-        <w:rPr>
-          <w:rFonts w:ascii="Times New Roman" w:hAnsi="Times New Roman" w:cs="Times New Roman"/>
-        </w:rPr>
-        <w:t xml:space="preserve"> vamzdelio koeficientas, K</w:t>
+      <w:r>
+        <w:rPr>
+          <w:rFonts w:ascii="Times New Roman" w:hAnsi="Times New Roman" w:cs="Times New Roman"/>
+        </w:rPr>
+        <w:t>Pito vamzdelio koeficientas, K</w:t>
       </w:r>
       <w:r>
         <w:rPr>
@@ -288,21 +266,7 @@
         <w:rPr>
           <w:rFonts w:ascii="Times New Roman" w:hAnsi="Times New Roman" w:cs="Times New Roman"/>
         </w:rPr>
-        <w:t xml:space="preserve">Išplėstinės neapibrėžties </w:t>
-      </w:r>
-      <w:proofErr w:type="spellStart"/>
-      <w:r>
-        <w:rPr>
-          <w:rFonts w:ascii="Times New Roman" w:hAnsi="Times New Roman" w:cs="Times New Roman"/>
-        </w:rPr>
-        <w:t>koef</w:t>
-      </w:r>
-      <w:proofErr w:type="spellEnd"/>
-      <w:r>
-        <w:rPr>
-          <w:rFonts w:ascii="Times New Roman" w:hAnsi="Times New Roman" w:cs="Times New Roman"/>
-        </w:rPr>
-        <w:t>. A</w:t>
+        <w:t>Išplėstinės neapibrėžties koef. A</w:t>
       </w:r>
       <w:r>
         <w:rPr>
@@ -518,13 +482,79 @@
         <w:rPr>
           <w:rFonts w:ascii="Times New Roman" w:hAnsi="Times New Roman" w:cs="Times New Roman"/>
         </w:rPr>
-        <w:t>5</w:t>
-      </w:r>
-      <w:r>
-        <w:rPr>
-          <w:rFonts w:ascii="Times New Roman" w:hAnsi="Times New Roman" w:cs="Times New Roman"/>
-        </w:rPr>
-        <w:t>. GreitisSPFunkcija.py pagal SVP „Rezultatai.xlsx“ lape „Greitis“ nuspalvoja lentelę, surašo eilutėse esančius pavadinimus, nubraižo rėmelius.</w:t>
+        <w:t xml:space="preserve">5. Pradiniai2Funkcija.py </w:t>
+      </w:r>
+      <w:r>
+        <w:rPr>
+          <w:rFonts w:ascii="Times New Roman" w:hAnsi="Times New Roman" w:cs="Times New Roman"/>
+        </w:rPr>
+        <w:t xml:space="preserve">„Pradiniai.xlsx“ lape „Greitis“ </w:t>
+      </w:r>
+      <w:r>
+        <w:rPr>
+          <w:rFonts w:ascii="Times New Roman" w:hAnsi="Times New Roman" w:cs="Times New Roman"/>
+        </w:rPr>
+        <w:t xml:space="preserve">pagal linijų skaičių sukuria stulpelius </w:t>
+      </w:r>
+      <w:r>
+        <w:rPr>
+          <w:rFonts w:ascii="Times New Roman" w:hAnsi="Times New Roman" w:cs="Times New Roman"/>
+        </w:rPr>
+        <w:t>„</w:t>
+      </w:r>
+      <w:r>
+        <w:rPr>
+          <w:rFonts w:ascii="Times New Roman" w:hAnsi="Times New Roman" w:cs="Times New Roman"/>
+        </w:rPr>
+        <w:t>Išmatuotas diferencinis slėgis taškuose 1 linija, Pdi, hPa</w:t>
+      </w:r>
+      <w:r>
+        <w:rPr>
+          <w:rFonts w:ascii="Times New Roman" w:hAnsi="Times New Roman" w:cs="Times New Roman"/>
+        </w:rPr>
+        <w:t xml:space="preserve">“, </w:t>
+      </w:r>
+      <w:r>
+        <w:rPr>
+          <w:rFonts w:ascii="Times New Roman" w:hAnsi="Times New Roman" w:cs="Times New Roman"/>
+        </w:rPr>
+        <w:t>tada „</w:t>
+      </w:r>
+      <w:r>
+        <w:rPr>
+          <w:rFonts w:ascii="Times New Roman" w:hAnsi="Times New Roman" w:cs="Times New Roman"/>
+        </w:rPr>
+        <w:t>Atmosferinis slėgis P, hPa</w:t>
+      </w:r>
+      <w:r>
+        <w:rPr>
+          <w:rFonts w:ascii="Times New Roman" w:hAnsi="Times New Roman" w:cs="Times New Roman"/>
+        </w:rPr>
+        <w:t>“; „</w:t>
+      </w:r>
+      <w:r>
+        <w:rPr>
+          <w:rFonts w:ascii="Times New Roman" w:hAnsi="Times New Roman" w:cs="Times New Roman"/>
+        </w:rPr>
+        <w:t>Statinis slėgis ortakyje ± ΔP, hPa</w:t>
+      </w:r>
+      <w:r>
+        <w:rPr>
+          <w:rFonts w:ascii="Times New Roman" w:hAnsi="Times New Roman" w:cs="Times New Roman"/>
+        </w:rPr>
+        <w:t>“. Visus duomenis perkelia į atitinkamus stulpelius „Rezultatai.xlsx“ lape „Greitis“.</w:t>
+      </w:r>
+      <w:r>
+        <w:rPr>
+          <w:rFonts w:ascii="Times New Roman" w:hAnsi="Times New Roman" w:cs="Times New Roman"/>
+        </w:rPr>
+        <w:t xml:space="preserve"> </w:t>
+      </w:r>
+      <w:r>
+        <w:rPr>
+          <w:rFonts w:ascii="Times New Roman" w:hAnsi="Times New Roman" w:cs="Times New Roman"/>
+        </w:rPr>
+        <w:t>Papildomai diferencinius slėgius surašo į lapo „Paėmimas“ papildomą stulpelį.</w:t>
       </w:r>
     </w:p>
     <w:p>
@@ -548,7 +578,73 @@
         <w:rPr>
           <w:rFonts w:ascii="Times New Roman" w:hAnsi="Times New Roman" w:cs="Times New Roman"/>
         </w:rPr>
-        <w:t>6</w:t>
+        <w:t xml:space="preserve">6. Pradiniai3Funkcija.py „Pradiniai.xlsx“ lape „Paėmimas“ </w:t>
+      </w:r>
+      <w:r>
+        <w:rPr>
+          <w:rFonts w:ascii="Times New Roman" w:hAnsi="Times New Roman" w:cs="Times New Roman"/>
+        </w:rPr>
+        <w:t xml:space="preserve">sukuria lentelę O2, CO2 ir Temperatūra ortakyje reikšmių įvedimui, nuskaito įvestas reikšmes ir perkelia jas į „Rezultatai.xlsx“ lapo „Paėmimas“ </w:t>
+      </w:r>
+      <w:r>
+        <w:rPr>
+          <w:rFonts w:ascii="Times New Roman" w:hAnsi="Times New Roman" w:cs="Times New Roman"/>
+        </w:rPr>
+        <w:t>atitinkamą lentelę. Suskaičiuoja O2, CO2, temperatūros ortakyje vidurkį.</w:t>
+      </w:r>
+    </w:p>
+    <w:p>
+      <w:pPr>
+        <w:spacing w:after="0"/>
+        <w:jc w:val="both"/>
+        <w:rPr>
+          <w:rFonts w:ascii="Times New Roman" w:hAnsi="Times New Roman" w:cs="Times New Roman"/>
+        </w:rPr>
+      </w:pPr>
+    </w:p>
+    <w:p>
+      <w:pPr>
+        <w:spacing w:after="0"/>
+        <w:jc w:val="both"/>
+        <w:rPr>
+          <w:rFonts w:ascii="Times New Roman" w:hAnsi="Times New Roman" w:cs="Times New Roman"/>
+        </w:rPr>
+      </w:pPr>
+      <w:r>
+        <w:rPr>
+          <w:rFonts w:ascii="Times New Roman" w:hAnsi="Times New Roman" w:cs="Times New Roman"/>
+        </w:rPr>
+        <w:t>7</w:t>
+      </w:r>
+      <w:r>
+        <w:rPr>
+          <w:rFonts w:ascii="Times New Roman" w:hAnsi="Times New Roman" w:cs="Times New Roman"/>
+        </w:rPr>
+        <w:t>. GreitisSPFunkcija.py pagal SVP „Rezultatai.xlsx“ lape „Greitis“ nuspalvoja lentelę, surašo eilutėse esančius pavadinimus, nubraižo rėmelius.</w:t>
+      </w:r>
+    </w:p>
+    <w:p>
+      <w:pPr>
+        <w:spacing w:after="0"/>
+        <w:jc w:val="both"/>
+        <w:rPr>
+          <w:rFonts w:ascii="Times New Roman" w:hAnsi="Times New Roman" w:cs="Times New Roman"/>
+        </w:rPr>
+      </w:pPr>
+    </w:p>
+    <w:p>
+      <w:pPr>
+        <w:spacing w:after="0"/>
+        <w:jc w:val="both"/>
+        <w:rPr>
+          <w:rFonts w:ascii="Times New Roman" w:hAnsi="Times New Roman" w:cs="Times New Roman"/>
+        </w:rPr>
+      </w:pPr>
+      <w:r>
+        <w:rPr>
+          <w:rFonts w:ascii="Times New Roman" w:hAnsi="Times New Roman" w:cs="Times New Roman"/>
+        </w:rPr>
+        <w:t>8</w:t>
       </w:r>
       <w:r>
         <w:rPr>
@@ -1801,6 +1897,26 @@
 </file>
 
 <file path=customXml/item1.xml><?xml version="1.0" encoding="utf-8"?>
+<p:properties xmlns:p="http://schemas.microsoft.com/office/2006/metadata/properties" xmlns:xsi="http://www.w3.org/2001/XMLSchema-instance" xmlns:pc="http://schemas.microsoft.com/office/infopath/2007/PartnerControls">
+  <documentManagement>
+    <lcf76f155ced4ddcb4097134ff3c332f xmlns="453e7e53-5eb2-45cf-b2ab-34c867e554b8">
+      <Terms xmlns="http://schemas.microsoft.com/office/infopath/2007/PartnerControls"/>
+    </lcf76f155ced4ddcb4097134ff3c332f>
+    <TaxCatchAll xmlns="aa0d983d-359a-438c-9953-3af1a8ac0831" xsi:nil="true"/>
+  </documentManagement>
+</p:properties>
+</file>
+
+<file path=customXml/item2.xml><?xml version="1.0" encoding="utf-8"?>
+<?mso-contentType ?>
+<FormTemplates xmlns="http://schemas.microsoft.com/sharepoint/v3/contenttype/forms">
+  <Display>DocumentLibraryForm</Display>
+  <Edit>DocumentLibraryForm</Edit>
+  <New>DocumentLibraryForm</New>
+</FormTemplates>
+</file>
+
+<file path=customXml/item3.xml><?xml version="1.0" encoding="utf-8"?>
 <ct:contentTypeSchema xmlns:ct="http://schemas.microsoft.com/office/2006/metadata/contentType" xmlns:ma="http://schemas.microsoft.com/office/2006/metadata/properties/metaAttributes" ct:_="" ma:_="" ma:contentTypeName="Dokumentas" ma:contentTypeID="0x010100BAB57CF81AE55C4698AAD22D302297F0" ma:contentTypeVersion="18" ma:contentTypeDescription="Kurkite naują dokumentą." ma:contentTypeScope="" ma:versionID="49ab401eb4052690d2a2629974c22fd6">
   <xsd:schema xmlns:xsd="http://www.w3.org/2001/XMLSchema" xmlns:xs="http://www.w3.org/2001/XMLSchema" xmlns:p="http://schemas.microsoft.com/office/2006/metadata/properties" xmlns:ns2="453e7e53-5eb2-45cf-b2ab-34c867e554b8" xmlns:ns3="aa0d983d-359a-438c-9953-3af1a8ac0831" targetNamespace="http://schemas.microsoft.com/office/2006/metadata/properties" ma:root="true" ma:fieldsID="ab9969d50e0b13c63bc5bd0499c928dc" ns2:_="" ns3:_="">
     <xsd:import namespace="453e7e53-5eb2-45cf-b2ab-34c867e554b8"/>
@@ -2055,27 +2171,26 @@
 </ct:contentTypeSchema>
 </file>
 
-<file path=customXml/item2.xml><?xml version="1.0" encoding="utf-8"?>
-<?mso-contentType ?>
-<FormTemplates xmlns="http://schemas.microsoft.com/sharepoint/v3/contenttype/forms">
-  <Display>DocumentLibraryForm</Display>
-  <Edit>DocumentLibraryForm</Edit>
-  <New>DocumentLibraryForm</New>
-</FormTemplates>
+<file path=customXml/itemProps1.xml><?xml version="1.0" encoding="utf-8"?>
+<ds:datastoreItem xmlns:ds="http://schemas.openxmlformats.org/officeDocument/2006/customXml" ds:itemID="{52F8D590-B38F-4B4A-8BDD-FD59D16A4DE7}">
+  <ds:schemaRefs>
+    <ds:schemaRef ds:uri="http://schemas.microsoft.com/office/2006/metadata/properties"/>
+    <ds:schemaRef ds:uri="http://schemas.microsoft.com/office/infopath/2007/PartnerControls"/>
+    <ds:schemaRef ds:uri="453e7e53-5eb2-45cf-b2ab-34c867e554b8"/>
+    <ds:schemaRef ds:uri="aa0d983d-359a-438c-9953-3af1a8ac0831"/>
+  </ds:schemaRefs>
+</ds:datastoreItem>
 </file>
 
-<file path=customXml/item3.xml><?xml version="1.0" encoding="utf-8"?>
-<p:properties xmlns:p="http://schemas.microsoft.com/office/2006/metadata/properties" xmlns:xsi="http://www.w3.org/2001/XMLSchema-instance" xmlns:pc="http://schemas.microsoft.com/office/infopath/2007/PartnerControls">
-  <documentManagement>
-    <lcf76f155ced4ddcb4097134ff3c332f xmlns="453e7e53-5eb2-45cf-b2ab-34c867e554b8">
-      <Terms xmlns="http://schemas.microsoft.com/office/infopath/2007/PartnerControls"/>
-    </lcf76f155ced4ddcb4097134ff3c332f>
-    <TaxCatchAll xmlns="aa0d983d-359a-438c-9953-3af1a8ac0831" xsi:nil="true"/>
-  </documentManagement>
-</p:properties>
+<file path=customXml/itemProps2.xml><?xml version="1.0" encoding="utf-8"?>
+<ds:datastoreItem xmlns:ds="http://schemas.openxmlformats.org/officeDocument/2006/customXml" ds:itemID="{47D7D20A-5C87-427E-8B8D-3343B9C6406D}">
+  <ds:schemaRefs>
+    <ds:schemaRef ds:uri="http://schemas.microsoft.com/sharepoint/v3/contenttype/forms"/>
+  </ds:schemaRefs>
+</ds:datastoreItem>
 </file>
 
-<file path=customXml/itemProps1.xml><?xml version="1.0" encoding="utf-8"?>
+<file path=customXml/itemProps3.xml><?xml version="1.0" encoding="utf-8"?>
 <ds:datastoreItem xmlns:ds="http://schemas.openxmlformats.org/officeDocument/2006/customXml" ds:itemID="{CC52CDA6-DE27-4DDF-B41E-8471831E0206}">
   <ds:schemaRefs>
     <ds:schemaRef ds:uri="http://schemas.microsoft.com/office/2006/metadata/contentType"/>
@@ -2092,23 +2207,4 @@
     <ds:schemaRef ds:uri="http://schemas.microsoft.com/internal/obd"/>
   </ds:schemaRefs>
 </ds:datastoreItem>
-</file>
-
-<file path=customXml/itemProps2.xml><?xml version="1.0" encoding="utf-8"?>
-<ds:datastoreItem xmlns:ds="http://schemas.openxmlformats.org/officeDocument/2006/customXml" ds:itemID="{47D7D20A-5C87-427E-8B8D-3343B9C6406D}">
-  <ds:schemaRefs>
-    <ds:schemaRef ds:uri="http://schemas.microsoft.com/sharepoint/v3/contenttype/forms"/>
-  </ds:schemaRefs>
-</ds:datastoreItem>
-</file>
-
-<file path=customXml/itemProps3.xml><?xml version="1.0" encoding="utf-8"?>
-<ds:datastoreItem xmlns:ds="http://schemas.openxmlformats.org/officeDocument/2006/customXml" ds:itemID="{52F8D590-B38F-4B4A-8BDD-FD59D16A4DE7}">
-  <ds:schemaRefs>
-    <ds:schemaRef ds:uri="http://schemas.microsoft.com/office/2006/metadata/properties"/>
-    <ds:schemaRef ds:uri="http://schemas.microsoft.com/office/infopath/2007/PartnerControls"/>
-    <ds:schemaRef ds:uri="453e7e53-5eb2-45cf-b2ab-34c867e554b8"/>
-    <ds:schemaRef ds:uri="aa0d983d-359a-438c-9953-3af1a8ac0831"/>
-  </ds:schemaRefs>
-</ds:datastoreItem>
 </file>
</xml_diff>

<commit_message>
Perkeliami Paemimas lapo stulpeliu komplektai
</commit_message>
<xml_diff>
--- a/AtmintinėFunkcijos.docx
+++ b/AtmintinėFunkcijos.docx
@@ -614,7 +614,140 @@
         <w:rPr>
           <w:rFonts w:ascii="Times New Roman" w:hAnsi="Times New Roman" w:cs="Times New Roman"/>
         </w:rPr>
-        <w:t>7</w:t>
+        <w:t>7. Pradiniai4Funkcija.py</w:t>
+      </w:r>
+      <w:r>
+        <w:rPr>
+          <w:rFonts w:ascii="Times New Roman" w:hAnsi="Times New Roman" w:cs="Times New Roman"/>
+        </w:rPr>
+        <w:t xml:space="preserve"> </w:t>
+      </w:r>
+      <w:r>
+        <w:rPr>
+          <w:rFonts w:ascii="Times New Roman" w:hAnsi="Times New Roman" w:cs="Times New Roman"/>
+        </w:rPr>
+        <w:t xml:space="preserve">„Pradiniai.xlsx“ lape „Paėmimas“ </w:t>
+      </w:r>
+      <w:r>
+        <w:rPr>
+          <w:rFonts w:ascii="Times New Roman" w:hAnsi="Times New Roman" w:cs="Times New Roman"/>
+        </w:rPr>
+        <w:t xml:space="preserve">pagal linijų skaičių ir filtrų skaičių sukuria lenteles su </w:t>
+      </w:r>
+      <w:r>
+        <w:rPr>
+          <w:rFonts w:ascii="Times New Roman" w:hAnsi="Times New Roman" w:cs="Times New Roman"/>
+        </w:rPr>
+        <w:t>„</w:t>
+      </w:r>
+      <w:r>
+        <w:rPr>
+          <w:rFonts w:ascii="Times New Roman" w:hAnsi="Times New Roman" w:cs="Times New Roman"/>
+        </w:rPr>
+        <w:t>Slėgis prieš rotametrą ΔPr (±hPa)</w:t>
+      </w:r>
+      <w:r>
+        <w:rPr>
+          <w:rFonts w:ascii="Times New Roman" w:hAnsi="Times New Roman" w:cs="Times New Roman"/>
+        </w:rPr>
+        <w:t>“; „</w:t>
+      </w:r>
+      <w:r>
+        <w:rPr>
+          <w:rFonts w:ascii="Times New Roman" w:hAnsi="Times New Roman" w:cs="Times New Roman"/>
+        </w:rPr>
+        <w:t>Antgalio diametras da (mm)</w:t>
+      </w:r>
+      <w:r>
+        <w:rPr>
+          <w:rFonts w:ascii="Times New Roman" w:hAnsi="Times New Roman" w:cs="Times New Roman"/>
+        </w:rPr>
+        <w:t xml:space="preserve">“; </w:t>
+      </w:r>
+      <w:r>
+        <w:rPr>
+          <w:rFonts w:ascii="Times New Roman" w:hAnsi="Times New Roman" w:cs="Times New Roman"/>
+        </w:rPr>
+        <w:t>„</w:t>
+      </w:r>
+      <w:r>
+        <w:rPr>
+          <w:rFonts w:ascii="Times New Roman" w:hAnsi="Times New Roman" w:cs="Times New Roman"/>
+        </w:rPr>
+        <w:t>Siurbimo laikas t (min)</w:t>
+      </w:r>
+      <w:r>
+        <w:rPr>
+          <w:rFonts w:ascii="Times New Roman" w:hAnsi="Times New Roman" w:cs="Times New Roman"/>
+        </w:rPr>
+        <w:t>“; „</w:t>
+      </w:r>
+      <w:r>
+        <w:rPr>
+          <w:rFonts w:ascii="Times New Roman" w:hAnsi="Times New Roman" w:cs="Times New Roman"/>
+        </w:rPr>
+        <w:t>Siurbimo greitis Vo (l/min)</w:t>
+      </w:r>
+      <w:r>
+        <w:rPr>
+          <w:rFonts w:ascii="Times New Roman" w:hAnsi="Times New Roman" w:cs="Times New Roman"/>
+        </w:rPr>
+        <w:t>“</w:t>
+      </w:r>
+      <w:r>
+        <w:rPr>
+          <w:rFonts w:ascii="Times New Roman" w:hAnsi="Times New Roman" w:cs="Times New Roman"/>
+        </w:rPr>
+        <w:t>;</w:t>
+      </w:r>
+      <w:r>
+        <w:rPr>
+          <w:rFonts w:ascii="Times New Roman" w:hAnsi="Times New Roman" w:cs="Times New Roman"/>
+        </w:rPr>
+        <w:t xml:space="preserve"> </w:t>
+      </w:r>
+      <w:r>
+        <w:rPr>
+          <w:rFonts w:ascii="Times New Roman" w:hAnsi="Times New Roman" w:cs="Times New Roman"/>
+        </w:rPr>
+        <w:t>„</w:t>
+      </w:r>
+      <w:r>
+        <w:rPr>
+          <w:rFonts w:ascii="Times New Roman" w:hAnsi="Times New Roman" w:cs="Times New Roman"/>
+        </w:rPr>
+        <w:t>Siurbiamų dujų temperatūra prieš rotametrą tr (°C)</w:t>
+      </w:r>
+      <w:r>
+        <w:rPr>
+          <w:rFonts w:ascii="Times New Roman" w:hAnsi="Times New Roman" w:cs="Times New Roman"/>
+        </w:rPr>
+        <w:t>“ stulpeliais ir perkelia įvestas reikšmes į „Rezultatai.xlsx“ lapo „Paėmimas“ analogiškus stulpelius.</w:t>
+      </w:r>
+    </w:p>
+    <w:p>
+      <w:pPr>
+        <w:spacing w:after="0"/>
+        <w:jc w:val="both"/>
+        <w:rPr>
+          <w:rFonts w:ascii="Times New Roman" w:hAnsi="Times New Roman" w:cs="Times New Roman"/>
+        </w:rPr>
+      </w:pPr>
+    </w:p>
+    <w:p>
+      <w:pPr>
+        <w:spacing w:after="0"/>
+        <w:jc w:val="both"/>
+        <w:rPr>
+          <w:rFonts w:ascii="Times New Roman" w:hAnsi="Times New Roman" w:cs="Times New Roman"/>
+        </w:rPr>
+      </w:pPr>
+      <w:r>
+        <w:rPr>
+          <w:rFonts w:ascii="Times New Roman" w:hAnsi="Times New Roman" w:cs="Times New Roman"/>
+        </w:rPr>
+        <w:lastRenderedPageBreak/>
+        <w:t>8</w:t>
       </w:r>
       <w:r>
         <w:rPr>
@@ -644,7 +777,7 @@
         <w:rPr>
           <w:rFonts w:ascii="Times New Roman" w:hAnsi="Times New Roman" w:cs="Times New Roman"/>
         </w:rPr>
-        <w:t>8</w:t>
+        <w:t>9</w:t>
       </w:r>
       <w:r>
         <w:rPr>
@@ -1897,26 +2030,6 @@
 </file>
 
 <file path=customXml/item1.xml><?xml version="1.0" encoding="utf-8"?>
-<p:properties xmlns:p="http://schemas.microsoft.com/office/2006/metadata/properties" xmlns:xsi="http://www.w3.org/2001/XMLSchema-instance" xmlns:pc="http://schemas.microsoft.com/office/infopath/2007/PartnerControls">
-  <documentManagement>
-    <lcf76f155ced4ddcb4097134ff3c332f xmlns="453e7e53-5eb2-45cf-b2ab-34c867e554b8">
-      <Terms xmlns="http://schemas.microsoft.com/office/infopath/2007/PartnerControls"/>
-    </lcf76f155ced4ddcb4097134ff3c332f>
-    <TaxCatchAll xmlns="aa0d983d-359a-438c-9953-3af1a8ac0831" xsi:nil="true"/>
-  </documentManagement>
-</p:properties>
-</file>
-
-<file path=customXml/item2.xml><?xml version="1.0" encoding="utf-8"?>
-<?mso-contentType ?>
-<FormTemplates xmlns="http://schemas.microsoft.com/sharepoint/v3/contenttype/forms">
-  <Display>DocumentLibraryForm</Display>
-  <Edit>DocumentLibraryForm</Edit>
-  <New>DocumentLibraryForm</New>
-</FormTemplates>
-</file>
-
-<file path=customXml/item3.xml><?xml version="1.0" encoding="utf-8"?>
 <ct:contentTypeSchema xmlns:ct="http://schemas.microsoft.com/office/2006/metadata/contentType" xmlns:ma="http://schemas.microsoft.com/office/2006/metadata/properties/metaAttributes" ct:_="" ma:_="" ma:contentTypeName="Dokumentas" ma:contentTypeID="0x010100BAB57CF81AE55C4698AAD22D302297F0" ma:contentTypeVersion="18" ma:contentTypeDescription="Kurkite naują dokumentą." ma:contentTypeScope="" ma:versionID="49ab401eb4052690d2a2629974c22fd6">
   <xsd:schema xmlns:xsd="http://www.w3.org/2001/XMLSchema" xmlns:xs="http://www.w3.org/2001/XMLSchema" xmlns:p="http://schemas.microsoft.com/office/2006/metadata/properties" xmlns:ns2="453e7e53-5eb2-45cf-b2ab-34c867e554b8" xmlns:ns3="aa0d983d-359a-438c-9953-3af1a8ac0831" targetNamespace="http://schemas.microsoft.com/office/2006/metadata/properties" ma:root="true" ma:fieldsID="ab9969d50e0b13c63bc5bd0499c928dc" ns2:_="" ns3:_="">
     <xsd:import namespace="453e7e53-5eb2-45cf-b2ab-34c867e554b8"/>
@@ -2171,26 +2284,27 @@
 </ct:contentTypeSchema>
 </file>
 
-<file path=customXml/itemProps1.xml><?xml version="1.0" encoding="utf-8"?>
-<ds:datastoreItem xmlns:ds="http://schemas.openxmlformats.org/officeDocument/2006/customXml" ds:itemID="{52F8D590-B38F-4B4A-8BDD-FD59D16A4DE7}">
-  <ds:schemaRefs>
-    <ds:schemaRef ds:uri="http://schemas.microsoft.com/office/2006/metadata/properties"/>
-    <ds:schemaRef ds:uri="http://schemas.microsoft.com/office/infopath/2007/PartnerControls"/>
-    <ds:schemaRef ds:uri="453e7e53-5eb2-45cf-b2ab-34c867e554b8"/>
-    <ds:schemaRef ds:uri="aa0d983d-359a-438c-9953-3af1a8ac0831"/>
-  </ds:schemaRefs>
-</ds:datastoreItem>
+<file path=customXml/item2.xml><?xml version="1.0" encoding="utf-8"?>
+<?mso-contentType ?>
+<FormTemplates xmlns="http://schemas.microsoft.com/sharepoint/v3/contenttype/forms">
+  <Display>DocumentLibraryForm</Display>
+  <Edit>DocumentLibraryForm</Edit>
+  <New>DocumentLibraryForm</New>
+</FormTemplates>
 </file>
 
-<file path=customXml/itemProps2.xml><?xml version="1.0" encoding="utf-8"?>
-<ds:datastoreItem xmlns:ds="http://schemas.openxmlformats.org/officeDocument/2006/customXml" ds:itemID="{47D7D20A-5C87-427E-8B8D-3343B9C6406D}">
-  <ds:schemaRefs>
-    <ds:schemaRef ds:uri="http://schemas.microsoft.com/sharepoint/v3/contenttype/forms"/>
-  </ds:schemaRefs>
-</ds:datastoreItem>
+<file path=customXml/item3.xml><?xml version="1.0" encoding="utf-8"?>
+<p:properties xmlns:p="http://schemas.microsoft.com/office/2006/metadata/properties" xmlns:xsi="http://www.w3.org/2001/XMLSchema-instance" xmlns:pc="http://schemas.microsoft.com/office/infopath/2007/PartnerControls">
+  <documentManagement>
+    <lcf76f155ced4ddcb4097134ff3c332f xmlns="453e7e53-5eb2-45cf-b2ab-34c867e554b8">
+      <Terms xmlns="http://schemas.microsoft.com/office/infopath/2007/PartnerControls"/>
+    </lcf76f155ced4ddcb4097134ff3c332f>
+    <TaxCatchAll xmlns="aa0d983d-359a-438c-9953-3af1a8ac0831" xsi:nil="true"/>
+  </documentManagement>
+</p:properties>
 </file>
 
-<file path=customXml/itemProps3.xml><?xml version="1.0" encoding="utf-8"?>
+<file path=customXml/itemProps1.xml><?xml version="1.0" encoding="utf-8"?>
 <ds:datastoreItem xmlns:ds="http://schemas.openxmlformats.org/officeDocument/2006/customXml" ds:itemID="{CC52CDA6-DE27-4DDF-B41E-8471831E0206}">
   <ds:schemaRefs>
     <ds:schemaRef ds:uri="http://schemas.microsoft.com/office/2006/metadata/contentType"/>
@@ -2207,4 +2321,23 @@
     <ds:schemaRef ds:uri="http://schemas.microsoft.com/internal/obd"/>
   </ds:schemaRefs>
 </ds:datastoreItem>
+</file>
+
+<file path=customXml/itemProps2.xml><?xml version="1.0" encoding="utf-8"?>
+<ds:datastoreItem xmlns:ds="http://schemas.openxmlformats.org/officeDocument/2006/customXml" ds:itemID="{47D7D20A-5C87-427E-8B8D-3343B9C6406D}">
+  <ds:schemaRefs>
+    <ds:schemaRef ds:uri="http://schemas.microsoft.com/sharepoint/v3/contenttype/forms"/>
+  </ds:schemaRefs>
+</ds:datastoreItem>
+</file>
+
+<file path=customXml/itemProps3.xml><?xml version="1.0" encoding="utf-8"?>
+<ds:datastoreItem xmlns:ds="http://schemas.openxmlformats.org/officeDocument/2006/customXml" ds:itemID="{52F8D590-B38F-4B4A-8BDD-FD59D16A4DE7}">
+  <ds:schemaRefs>
+    <ds:schemaRef ds:uri="http://schemas.microsoft.com/office/2006/metadata/properties"/>
+    <ds:schemaRef ds:uri="http://schemas.microsoft.com/office/infopath/2007/PartnerControls"/>
+    <ds:schemaRef ds:uri="453e7e53-5eb2-45cf-b2ab-34c867e554b8"/>
+    <ds:schemaRef ds:uri="aa0d983d-359a-438c-9953-3af1a8ac0831"/>
+  </ds:schemaRefs>
+</ds:datastoreItem>
 </file>
</xml_diff>

<commit_message>
Pakeistas A, B, C stulpelių lygiavimas ir suliejimas
</commit_message>
<xml_diff>
--- a/AtmintinėFunkcijos.docx
+++ b/AtmintinėFunkcijos.docx
@@ -777,6 +777,48 @@
         <w:rPr>
           <w:rFonts w:ascii="Times New Roman" w:hAnsi="Times New Roman" w:cs="Times New Roman"/>
         </w:rPr>
+        <w:t>9. KoncentracijaSPFunkcija.py</w:t>
+      </w:r>
+      <w:r>
+        <w:rPr>
+          <w:rFonts w:ascii="Times New Roman" w:hAnsi="Times New Roman" w:cs="Times New Roman"/>
+        </w:rPr>
+        <w:t xml:space="preserve"> </w:t>
+      </w:r>
+      <w:r>
+        <w:rPr>
+          <w:rFonts w:ascii="Times New Roman" w:hAnsi="Times New Roman" w:cs="Times New Roman"/>
+        </w:rPr>
+        <w:t>pagal SVP „Rezultatai.xlsx“ lape „Greitis“ nuspalvoja lentelę, surašo eilutėse esančius pavadinimus, nubraižo rėmelius</w:t>
+      </w:r>
+      <w:r>
+        <w:rPr>
+          <w:rFonts w:ascii="Times New Roman" w:hAnsi="Times New Roman" w:cs="Times New Roman"/>
+        </w:rPr>
+        <w:t>, išskyrus A, B, C stulpelius.</w:t>
+      </w:r>
+    </w:p>
+    <w:p>
+      <w:pPr>
+        <w:spacing w:after="0"/>
+        <w:jc w:val="both"/>
+        <w:rPr>
+          <w:rFonts w:ascii="Times New Roman" w:hAnsi="Times New Roman" w:cs="Times New Roman"/>
+        </w:rPr>
+      </w:pPr>
+    </w:p>
+    <w:p>
+      <w:pPr>
+        <w:spacing w:after="0"/>
+        <w:jc w:val="both"/>
+        <w:rPr>
+          <w:rFonts w:ascii="Times New Roman" w:hAnsi="Times New Roman" w:cs="Times New Roman"/>
+        </w:rPr>
+      </w:pPr>
+      <w:r>
+        <w:rPr>
+          <w:rFonts w:ascii="Times New Roman" w:hAnsi="Times New Roman" w:cs="Times New Roman"/>
+        </w:rPr>
         <w:t>9</w:t>
       </w:r>
       <w:r>
@@ -801,7 +843,13 @@
         <w:rPr>
           <w:rFonts w:ascii="Times New Roman" w:hAnsi="Times New Roman" w:cs="Times New Roman"/>
         </w:rPr>
-        <w:t>lentelę, surašo eilutėse esančius pavadinimus, nubraižo rėmelius.</w:t>
+        <w:t>lentelę, surašo eilutėse esančius pavadinimus, nubraižo rėmelius</w:t>
+      </w:r>
+      <w:r>
+        <w:rPr>
+          <w:rFonts w:ascii="Times New Roman" w:hAnsi="Times New Roman" w:cs="Times New Roman"/>
+        </w:rPr>
+        <w:t>, išskyrus A ir B stulpelius.</w:t>
       </w:r>
     </w:p>
     <w:sectPr>
@@ -2030,6 +2078,26 @@
 </file>
 
 <file path=customXml/item1.xml><?xml version="1.0" encoding="utf-8"?>
+<p:properties xmlns:p="http://schemas.microsoft.com/office/2006/metadata/properties" xmlns:xsi="http://www.w3.org/2001/XMLSchema-instance" xmlns:pc="http://schemas.microsoft.com/office/infopath/2007/PartnerControls">
+  <documentManagement>
+    <lcf76f155ced4ddcb4097134ff3c332f xmlns="453e7e53-5eb2-45cf-b2ab-34c867e554b8">
+      <Terms xmlns="http://schemas.microsoft.com/office/infopath/2007/PartnerControls"/>
+    </lcf76f155ced4ddcb4097134ff3c332f>
+    <TaxCatchAll xmlns="aa0d983d-359a-438c-9953-3af1a8ac0831" xsi:nil="true"/>
+  </documentManagement>
+</p:properties>
+</file>
+
+<file path=customXml/item2.xml><?xml version="1.0" encoding="utf-8"?>
+<?mso-contentType ?>
+<FormTemplates xmlns="http://schemas.microsoft.com/sharepoint/v3/contenttype/forms">
+  <Display>DocumentLibraryForm</Display>
+  <Edit>DocumentLibraryForm</Edit>
+  <New>DocumentLibraryForm</New>
+</FormTemplates>
+</file>
+
+<file path=customXml/item3.xml><?xml version="1.0" encoding="utf-8"?>
 <ct:contentTypeSchema xmlns:ct="http://schemas.microsoft.com/office/2006/metadata/contentType" xmlns:ma="http://schemas.microsoft.com/office/2006/metadata/properties/metaAttributes" ct:_="" ma:_="" ma:contentTypeName="Dokumentas" ma:contentTypeID="0x010100BAB57CF81AE55C4698AAD22D302297F0" ma:contentTypeVersion="18" ma:contentTypeDescription="Kurkite naują dokumentą." ma:contentTypeScope="" ma:versionID="49ab401eb4052690d2a2629974c22fd6">
   <xsd:schema xmlns:xsd="http://www.w3.org/2001/XMLSchema" xmlns:xs="http://www.w3.org/2001/XMLSchema" xmlns:p="http://schemas.microsoft.com/office/2006/metadata/properties" xmlns:ns2="453e7e53-5eb2-45cf-b2ab-34c867e554b8" xmlns:ns3="aa0d983d-359a-438c-9953-3af1a8ac0831" targetNamespace="http://schemas.microsoft.com/office/2006/metadata/properties" ma:root="true" ma:fieldsID="ab9969d50e0b13c63bc5bd0499c928dc" ns2:_="" ns3:_="">
     <xsd:import namespace="453e7e53-5eb2-45cf-b2ab-34c867e554b8"/>
@@ -2284,27 +2352,26 @@
 </ct:contentTypeSchema>
 </file>
 
-<file path=customXml/item2.xml><?xml version="1.0" encoding="utf-8"?>
-<?mso-contentType ?>
-<FormTemplates xmlns="http://schemas.microsoft.com/sharepoint/v3/contenttype/forms">
-  <Display>DocumentLibraryForm</Display>
-  <Edit>DocumentLibraryForm</Edit>
-  <New>DocumentLibraryForm</New>
-</FormTemplates>
+<file path=customXml/itemProps1.xml><?xml version="1.0" encoding="utf-8"?>
+<ds:datastoreItem xmlns:ds="http://schemas.openxmlformats.org/officeDocument/2006/customXml" ds:itemID="{52F8D590-B38F-4B4A-8BDD-FD59D16A4DE7}">
+  <ds:schemaRefs>
+    <ds:schemaRef ds:uri="http://schemas.microsoft.com/office/2006/metadata/properties"/>
+    <ds:schemaRef ds:uri="http://schemas.microsoft.com/office/infopath/2007/PartnerControls"/>
+    <ds:schemaRef ds:uri="453e7e53-5eb2-45cf-b2ab-34c867e554b8"/>
+    <ds:schemaRef ds:uri="aa0d983d-359a-438c-9953-3af1a8ac0831"/>
+  </ds:schemaRefs>
+</ds:datastoreItem>
 </file>
 
-<file path=customXml/item3.xml><?xml version="1.0" encoding="utf-8"?>
-<p:properties xmlns:p="http://schemas.microsoft.com/office/2006/metadata/properties" xmlns:xsi="http://www.w3.org/2001/XMLSchema-instance" xmlns:pc="http://schemas.microsoft.com/office/infopath/2007/PartnerControls">
-  <documentManagement>
-    <lcf76f155ced4ddcb4097134ff3c332f xmlns="453e7e53-5eb2-45cf-b2ab-34c867e554b8">
-      <Terms xmlns="http://schemas.microsoft.com/office/infopath/2007/PartnerControls"/>
-    </lcf76f155ced4ddcb4097134ff3c332f>
-    <TaxCatchAll xmlns="aa0d983d-359a-438c-9953-3af1a8ac0831" xsi:nil="true"/>
-  </documentManagement>
-</p:properties>
+<file path=customXml/itemProps2.xml><?xml version="1.0" encoding="utf-8"?>
+<ds:datastoreItem xmlns:ds="http://schemas.openxmlformats.org/officeDocument/2006/customXml" ds:itemID="{47D7D20A-5C87-427E-8B8D-3343B9C6406D}">
+  <ds:schemaRefs>
+    <ds:schemaRef ds:uri="http://schemas.microsoft.com/sharepoint/v3/contenttype/forms"/>
+  </ds:schemaRefs>
+</ds:datastoreItem>
 </file>
 
-<file path=customXml/itemProps1.xml><?xml version="1.0" encoding="utf-8"?>
+<file path=customXml/itemProps3.xml><?xml version="1.0" encoding="utf-8"?>
 <ds:datastoreItem xmlns:ds="http://schemas.openxmlformats.org/officeDocument/2006/customXml" ds:itemID="{CC52CDA6-DE27-4DDF-B41E-8471831E0206}">
   <ds:schemaRefs>
     <ds:schemaRef ds:uri="http://schemas.microsoft.com/office/2006/metadata/contentType"/>
@@ -2321,23 +2388,4 @@
     <ds:schemaRef ds:uri="http://schemas.microsoft.com/internal/obd"/>
   </ds:schemaRefs>
 </ds:datastoreItem>
-</file>
-
-<file path=customXml/itemProps2.xml><?xml version="1.0" encoding="utf-8"?>
-<ds:datastoreItem xmlns:ds="http://schemas.openxmlformats.org/officeDocument/2006/customXml" ds:itemID="{47D7D20A-5C87-427E-8B8D-3343B9C6406D}">
-  <ds:schemaRefs>
-    <ds:schemaRef ds:uri="http://schemas.microsoft.com/sharepoint/v3/contenttype/forms"/>
-  </ds:schemaRefs>
-</ds:datastoreItem>
-</file>
-
-<file path=customXml/itemProps3.xml><?xml version="1.0" encoding="utf-8"?>
-<ds:datastoreItem xmlns:ds="http://schemas.openxmlformats.org/officeDocument/2006/customXml" ds:itemID="{52F8D590-B38F-4B4A-8BDD-FD59D16A4DE7}">
-  <ds:schemaRefs>
-    <ds:schemaRef ds:uri="http://schemas.microsoft.com/office/2006/metadata/properties"/>
-    <ds:schemaRef ds:uri="http://schemas.microsoft.com/office/infopath/2007/PartnerControls"/>
-    <ds:schemaRef ds:uri="453e7e53-5eb2-45cf-b2ab-34c867e554b8"/>
-    <ds:schemaRef ds:uri="aa0d983d-359a-438c-9953-3af1a8ac0831"/>
-  </ds:schemaRefs>
-</ds:datastoreItem>
 </file>
</xml_diff>

<commit_message>
Duomenų perkėlimas iš H2O į H2O ir smulkūs pataisymai
</commit_message>
<xml_diff>
--- a/AtmintinėFunkcijos.docx
+++ b/AtmintinėFunkcijos.docx
@@ -242,21 +242,7 @@
         <w:rPr>
           <w:rFonts w:ascii="Times New Roman" w:hAnsi="Times New Roman" w:cs="Times New Roman"/>
         </w:rPr>
-        <w:t xml:space="preserve"> Parenka </w:t>
-      </w:r>
-      <w:proofErr w:type="spellStart"/>
-      <w:r>
-        <w:rPr>
-          <w:rFonts w:ascii="Times New Roman" w:hAnsi="Times New Roman" w:cs="Times New Roman"/>
-        </w:rPr>
-        <w:t>Pito</w:t>
-      </w:r>
-      <w:proofErr w:type="spellEnd"/>
-      <w:r>
-        <w:rPr>
-          <w:rFonts w:ascii="Times New Roman" w:hAnsi="Times New Roman" w:cs="Times New Roman"/>
-        </w:rPr>
-        <w:t xml:space="preserve"> vamzdelio koeficientą ir išplėstinės neapibrėžties koeficientą, užpildo </w:t>
+        <w:t xml:space="preserve"> Parenka Pito vamzdelio koeficientą ir išplėstinės neapibrėžties koeficientą, užpildo </w:t>
       </w:r>
       <w:r>
         <w:rPr>
@@ -264,19 +250,11 @@
         </w:rPr>
         <w:t>lapo „Greitis“ „</w:t>
       </w:r>
-      <w:proofErr w:type="spellStart"/>
-      <w:r>
-        <w:rPr>
-          <w:rFonts w:ascii="Times New Roman" w:hAnsi="Times New Roman" w:cs="Times New Roman"/>
-        </w:rPr>
-        <w:t>Pito</w:t>
-      </w:r>
-      <w:proofErr w:type="spellEnd"/>
-      <w:r>
-        <w:rPr>
-          <w:rFonts w:ascii="Times New Roman" w:hAnsi="Times New Roman" w:cs="Times New Roman"/>
-        </w:rPr>
-        <w:t xml:space="preserve"> vamzdelio koeficientas, K</w:t>
+      <w:r>
+        <w:rPr>
+          <w:rFonts w:ascii="Times New Roman" w:hAnsi="Times New Roman" w:cs="Times New Roman"/>
+        </w:rPr>
+        <w:t>Pito vamzdelio koeficientas, K</w:t>
       </w:r>
       <w:r>
         <w:rPr>
@@ -288,21 +266,7 @@
         <w:rPr>
           <w:rFonts w:ascii="Times New Roman" w:hAnsi="Times New Roman" w:cs="Times New Roman"/>
         </w:rPr>
-        <w:t xml:space="preserve">Išplėstinės neapibrėžties </w:t>
-      </w:r>
-      <w:proofErr w:type="spellStart"/>
-      <w:r>
-        <w:rPr>
-          <w:rFonts w:ascii="Times New Roman" w:hAnsi="Times New Roman" w:cs="Times New Roman"/>
-        </w:rPr>
-        <w:t>koef</w:t>
-      </w:r>
-      <w:proofErr w:type="spellEnd"/>
-      <w:r>
-        <w:rPr>
-          <w:rFonts w:ascii="Times New Roman" w:hAnsi="Times New Roman" w:cs="Times New Roman"/>
-        </w:rPr>
-        <w:t>. A</w:t>
+        <w:t>Išplėstinės neapibrėžties koef. A</w:t>
       </w:r>
       <w:r>
         <w:rPr>
@@ -382,29 +346,59 @@
         </w:rPr>
         <w:t>“ E6 langelį.</w:t>
       </w:r>
-    </w:p>
-    <w:p>
-      <w:pPr>
-        <w:spacing w:after="0"/>
-        <w:jc w:val="both"/>
-        <w:rPr>
-          <w:rFonts w:ascii="Times New Roman" w:hAnsi="Times New Roman" w:cs="Times New Roman"/>
-        </w:rPr>
-      </w:pPr>
-    </w:p>
-    <w:p>
-      <w:pPr>
-        <w:spacing w:after="0"/>
-        <w:jc w:val="both"/>
-        <w:rPr>
-          <w:rFonts w:ascii="Times New Roman" w:hAnsi="Times New Roman" w:cs="Times New Roman"/>
-        </w:rPr>
-      </w:pPr>
-      <w:r>
-        <w:rPr>
-          <w:rFonts w:ascii="Times New Roman" w:hAnsi="Times New Roman" w:cs="Times New Roman"/>
-        </w:rPr>
-        <w:t>4. Pradiniai1Funkcija.py sukuria „Pradiniai.xlsx“ failą su lapais „Pradiniai“, „Greitis“, „Paėmimas“</w:t>
+      <w:r>
+        <w:rPr>
+          <w:rFonts w:ascii="Times New Roman" w:hAnsi="Times New Roman" w:cs="Times New Roman"/>
+        </w:rPr>
+        <w:t xml:space="preserve"> Ir šias reikšmes padaugina tiek kartų, kiek yra matavimo linijų,</w:t>
+      </w:r>
+      <w:r>
+        <w:rPr>
+          <w:rFonts w:ascii="Times New Roman" w:hAnsi="Times New Roman" w:cs="Times New Roman"/>
+        </w:rPr>
+        <w:t xml:space="preserve"> o paskui matavimo linijų komplektus padaugina iš filtrų skaičiaus ir gauna bendrą reikiamų lentelių kopijų skaičių.</w:t>
+      </w:r>
+    </w:p>
+    <w:p>
+      <w:pPr>
+        <w:spacing w:after="0"/>
+        <w:jc w:val="both"/>
+        <w:rPr>
+          <w:rFonts w:ascii="Times New Roman" w:hAnsi="Times New Roman" w:cs="Times New Roman"/>
+        </w:rPr>
+      </w:pPr>
+    </w:p>
+    <w:p>
+      <w:pPr>
+        <w:spacing w:after="0"/>
+        <w:jc w:val="both"/>
+        <w:rPr>
+          <w:rFonts w:ascii="Times New Roman" w:hAnsi="Times New Roman" w:cs="Times New Roman"/>
+        </w:rPr>
+      </w:pPr>
+      <w:r>
+        <w:rPr>
+          <w:rFonts w:ascii="Times New Roman" w:hAnsi="Times New Roman" w:cs="Times New Roman"/>
+        </w:rPr>
+        <w:t>4. Pradiniai1Funkcija.py sukuria „Pradiniai.xlsx“ failą su lapais „Pradiniai“, „Greitis“,</w:t>
+      </w:r>
+      <w:r>
+        <w:rPr>
+          <w:rFonts w:ascii="Times New Roman" w:hAnsi="Times New Roman" w:cs="Times New Roman"/>
+        </w:rPr>
+        <w:t xml:space="preserve"> „H2O“</w:t>
+      </w:r>
+      <w:r>
+        <w:rPr>
+          <w:rFonts w:ascii="Times New Roman" w:hAnsi="Times New Roman" w:cs="Times New Roman"/>
+        </w:rPr>
+        <w:t>,</w:t>
+      </w:r>
+      <w:r>
+        <w:rPr>
+          <w:rFonts w:ascii="Times New Roman" w:hAnsi="Times New Roman" w:cs="Times New Roman"/>
+        </w:rPr>
+        <w:t xml:space="preserve"> „Paėmimas“</w:t>
       </w:r>
       <w:r>
         <w:rPr>
@@ -542,21 +536,7 @@
         <w:rPr>
           <w:rFonts w:ascii="Times New Roman" w:hAnsi="Times New Roman" w:cs="Times New Roman"/>
         </w:rPr>
-        <w:t xml:space="preserve">Išmatuotas diferencinis slėgis taškuose 1 linija, </w:t>
-      </w:r>
-      <w:proofErr w:type="spellStart"/>
-      <w:r>
-        <w:rPr>
-          <w:rFonts w:ascii="Times New Roman" w:hAnsi="Times New Roman" w:cs="Times New Roman"/>
-        </w:rPr>
-        <w:t>Pdi</w:t>
-      </w:r>
-      <w:proofErr w:type="spellEnd"/>
-      <w:r>
-        <w:rPr>
-          <w:rFonts w:ascii="Times New Roman" w:hAnsi="Times New Roman" w:cs="Times New Roman"/>
-        </w:rPr>
-        <w:t>, hPa</w:t>
+        <w:t>Išmatuotas diferencinis slėgis taškuose 1 linija, Pdi, hPa</w:t>
       </w:r>
       <w:r>
         <w:rPr>
@@ -606,6 +586,18 @@
         </w:rPr>
         <w:t>Papildomai diferencinius slėgius surašo į lapo „Paėmimas“ papildomą stulpelį.</w:t>
       </w:r>
+      <w:r>
+        <w:rPr>
+          <w:rFonts w:ascii="Times New Roman" w:hAnsi="Times New Roman" w:cs="Times New Roman"/>
+        </w:rPr>
+        <w:t xml:space="preserve"> Sukuria „Pradiniai.xlsx“ lape „H2O“ </w:t>
+      </w:r>
+      <w:r>
+        <w:rPr>
+          <w:rFonts w:ascii="Times New Roman" w:hAnsi="Times New Roman" w:cs="Times New Roman"/>
+        </w:rPr>
+        <w:t>lentelę duomenų įvedimui ir perkelia iš jus įvestus duomenis į „Rezultatai.xlsx“ lape „H2O“ esančią lentelę.</w:t>
+      </w:r>
     </w:p>
     <w:p>
       <w:pPr>
@@ -694,68 +686,75 @@
         <w:rPr>
           <w:rFonts w:ascii="Times New Roman" w:hAnsi="Times New Roman" w:cs="Times New Roman"/>
         </w:rPr>
-        <w:t xml:space="preserve">Slėgis prieš </w:t>
-      </w:r>
-      <w:proofErr w:type="spellStart"/>
-      <w:r>
-        <w:rPr>
-          <w:rFonts w:ascii="Times New Roman" w:hAnsi="Times New Roman" w:cs="Times New Roman"/>
-        </w:rPr>
-        <w:t>rotametrą</w:t>
-      </w:r>
-      <w:proofErr w:type="spellEnd"/>
+        <w:t>Slėgis prieš rotametrą ΔPr (±hPa)</w:t>
+      </w:r>
+      <w:r>
+        <w:rPr>
+          <w:rFonts w:ascii="Times New Roman" w:hAnsi="Times New Roman" w:cs="Times New Roman"/>
+        </w:rPr>
+        <w:t>“; „</w:t>
+      </w:r>
+      <w:r>
+        <w:rPr>
+          <w:rFonts w:ascii="Times New Roman" w:hAnsi="Times New Roman" w:cs="Times New Roman"/>
+        </w:rPr>
+        <w:t>Antgalio diametras da (mm)</w:t>
+      </w:r>
+      <w:r>
+        <w:rPr>
+          <w:rFonts w:ascii="Times New Roman" w:hAnsi="Times New Roman" w:cs="Times New Roman"/>
+        </w:rPr>
+        <w:t xml:space="preserve">“; </w:t>
+      </w:r>
+      <w:r>
+        <w:rPr>
+          <w:rFonts w:ascii="Times New Roman" w:hAnsi="Times New Roman" w:cs="Times New Roman"/>
+        </w:rPr>
+        <w:t>„</w:t>
+      </w:r>
+      <w:r>
+        <w:rPr>
+          <w:rFonts w:ascii="Times New Roman" w:hAnsi="Times New Roman" w:cs="Times New Roman"/>
+        </w:rPr>
+        <w:t xml:space="preserve">Siurbimo </w:t>
+      </w:r>
+      <w:r>
+        <w:rPr>
+          <w:rFonts w:ascii="Times New Roman" w:hAnsi="Times New Roman" w:cs="Times New Roman"/>
+        </w:rPr>
+        <w:lastRenderedPageBreak/>
+        <w:t>laikas t (min)</w:t>
+      </w:r>
+      <w:r>
+        <w:rPr>
+          <w:rFonts w:ascii="Times New Roman" w:hAnsi="Times New Roman" w:cs="Times New Roman"/>
+        </w:rPr>
+        <w:t>“; „</w:t>
+      </w:r>
+      <w:r>
+        <w:rPr>
+          <w:rFonts w:ascii="Times New Roman" w:hAnsi="Times New Roman" w:cs="Times New Roman"/>
+        </w:rPr>
+        <w:t>Siurbimo greitis Vo (l/min)</w:t>
+      </w:r>
+      <w:r>
+        <w:rPr>
+          <w:rFonts w:ascii="Times New Roman" w:hAnsi="Times New Roman" w:cs="Times New Roman"/>
+        </w:rPr>
+        <w:t>“</w:t>
+      </w:r>
+      <w:r>
+        <w:rPr>
+          <w:rFonts w:ascii="Times New Roman" w:hAnsi="Times New Roman" w:cs="Times New Roman"/>
+        </w:rPr>
+        <w:t>;</w:t>
+      </w:r>
       <w:r>
         <w:rPr>
           <w:rFonts w:ascii="Times New Roman" w:hAnsi="Times New Roman" w:cs="Times New Roman"/>
         </w:rPr>
         <w:t xml:space="preserve"> </w:t>
       </w:r>
-      <w:proofErr w:type="spellStart"/>
-      <w:r>
-        <w:rPr>
-          <w:rFonts w:ascii="Times New Roman" w:hAnsi="Times New Roman" w:cs="Times New Roman"/>
-        </w:rPr>
-        <w:t>ΔPr</w:t>
-      </w:r>
-      <w:proofErr w:type="spellEnd"/>
-      <w:r>
-        <w:rPr>
-          <w:rFonts w:ascii="Times New Roman" w:hAnsi="Times New Roman" w:cs="Times New Roman"/>
-        </w:rPr>
-        <w:t xml:space="preserve"> (±hPa)</w:t>
-      </w:r>
-      <w:r>
-        <w:rPr>
-          <w:rFonts w:ascii="Times New Roman" w:hAnsi="Times New Roman" w:cs="Times New Roman"/>
-        </w:rPr>
-        <w:t>“; „</w:t>
-      </w:r>
-      <w:r>
-        <w:rPr>
-          <w:rFonts w:ascii="Times New Roman" w:hAnsi="Times New Roman" w:cs="Times New Roman"/>
-        </w:rPr>
-        <w:t xml:space="preserve">Antgalio diametras </w:t>
-      </w:r>
-      <w:proofErr w:type="spellStart"/>
-      <w:r>
-        <w:rPr>
-          <w:rFonts w:ascii="Times New Roman" w:hAnsi="Times New Roman" w:cs="Times New Roman"/>
-        </w:rPr>
-        <w:t>da</w:t>
-      </w:r>
-      <w:proofErr w:type="spellEnd"/>
-      <w:r>
-        <w:rPr>
-          <w:rFonts w:ascii="Times New Roman" w:hAnsi="Times New Roman" w:cs="Times New Roman"/>
-        </w:rPr>
-        <w:t xml:space="preserve"> (mm)</w:t>
-      </w:r>
-      <w:r>
-        <w:rPr>
-          <w:rFonts w:ascii="Times New Roman" w:hAnsi="Times New Roman" w:cs="Times New Roman"/>
-        </w:rPr>
-        <w:t xml:space="preserve">“; </w:t>
-      </w:r>
       <w:r>
         <w:rPr>
           <w:rFonts w:ascii="Times New Roman" w:hAnsi="Times New Roman" w:cs="Times New Roman"/>
@@ -766,45 +765,124 @@
         <w:rPr>
           <w:rFonts w:ascii="Times New Roman" w:hAnsi="Times New Roman" w:cs="Times New Roman"/>
         </w:rPr>
-        <w:t>Siurbimo laikas t (min)</w:t>
-      </w:r>
-      <w:r>
-        <w:rPr>
-          <w:rFonts w:ascii="Times New Roman" w:hAnsi="Times New Roman" w:cs="Times New Roman"/>
-        </w:rPr>
-        <w:t>“; „</w:t>
-      </w:r>
-      <w:r>
-        <w:rPr>
-          <w:rFonts w:ascii="Times New Roman" w:hAnsi="Times New Roman" w:cs="Times New Roman"/>
-        </w:rPr>
-        <w:t xml:space="preserve">Siurbimo greitis </w:t>
-      </w:r>
-      <w:proofErr w:type="spellStart"/>
-      <w:r>
-        <w:rPr>
-          <w:rFonts w:ascii="Times New Roman" w:hAnsi="Times New Roman" w:cs="Times New Roman"/>
-        </w:rPr>
-        <w:t>Vo</w:t>
-      </w:r>
-      <w:proofErr w:type="spellEnd"/>
-      <w:r>
-        <w:rPr>
-          <w:rFonts w:ascii="Times New Roman" w:hAnsi="Times New Roman" w:cs="Times New Roman"/>
-        </w:rPr>
-        <w:t xml:space="preserve"> (l/min)</w:t>
-      </w:r>
-      <w:r>
-        <w:rPr>
-          <w:rFonts w:ascii="Times New Roman" w:hAnsi="Times New Roman" w:cs="Times New Roman"/>
-        </w:rPr>
-        <w:t>“</w:t>
-      </w:r>
-      <w:r>
-        <w:rPr>
-          <w:rFonts w:ascii="Times New Roman" w:hAnsi="Times New Roman" w:cs="Times New Roman"/>
-        </w:rPr>
-        <w:t>;</w:t>
+        <w:t>Siurbiamų dujų temperatūra prieš rotametrą tr (°C)</w:t>
+      </w:r>
+      <w:r>
+        <w:rPr>
+          <w:rFonts w:ascii="Times New Roman" w:hAnsi="Times New Roman" w:cs="Times New Roman"/>
+        </w:rPr>
+        <w:t>“ stulpeliais ir perkelia įvestas reikšmes į „Rezultatai.xlsx“ lapo „Paėmimas“ analogiškus stulpelius.</w:t>
+      </w:r>
+    </w:p>
+    <w:p>
+      <w:pPr>
+        <w:spacing w:after="0"/>
+        <w:jc w:val="both"/>
+        <w:rPr>
+          <w:rFonts w:ascii="Times New Roman" w:hAnsi="Times New Roman" w:cs="Times New Roman"/>
+        </w:rPr>
+      </w:pPr>
+    </w:p>
+    <w:p>
+      <w:pPr>
+        <w:spacing w:after="0"/>
+        <w:jc w:val="both"/>
+        <w:rPr>
+          <w:rFonts w:ascii="Times New Roman" w:hAnsi="Times New Roman" w:cs="Times New Roman"/>
+        </w:rPr>
+      </w:pPr>
+    </w:p>
+    <w:p>
+      <w:pPr>
+        <w:spacing w:after="0"/>
+        <w:jc w:val="both"/>
+        <w:rPr>
+          <w:rFonts w:ascii="Times New Roman" w:hAnsi="Times New Roman" w:cs="Times New Roman"/>
+        </w:rPr>
+      </w:pPr>
+      <w:r>
+        <w:rPr>
+          <w:rFonts w:ascii="Times New Roman" w:hAnsi="Times New Roman" w:cs="Times New Roman"/>
+        </w:rPr>
+        <w:t>8. GreitisSK1Funkcija.py</w:t>
+      </w:r>
+    </w:p>
+    <w:p>
+      <w:pPr>
+        <w:spacing w:after="0"/>
+        <w:jc w:val="both"/>
+        <w:rPr>
+          <w:rFonts w:ascii="Times New Roman" w:hAnsi="Times New Roman" w:cs="Times New Roman"/>
+        </w:rPr>
+      </w:pPr>
+    </w:p>
+    <w:p>
+      <w:pPr>
+        <w:spacing w:after="0"/>
+        <w:jc w:val="both"/>
+        <w:rPr>
+          <w:rFonts w:ascii="Times New Roman" w:hAnsi="Times New Roman" w:cs="Times New Roman"/>
+        </w:rPr>
+      </w:pPr>
+      <w:r>
+        <w:rPr>
+          <w:rFonts w:ascii="Times New Roman" w:hAnsi="Times New Roman" w:cs="Times New Roman"/>
+        </w:rPr>
+        <w:t>9. PaėmimasSK1Funkcija.py</w:t>
+      </w:r>
+    </w:p>
+    <w:p>
+      <w:pPr>
+        <w:spacing w:after="0"/>
+        <w:jc w:val="both"/>
+        <w:rPr>
+          <w:rFonts w:ascii="Times New Roman" w:hAnsi="Times New Roman" w:cs="Times New Roman"/>
+        </w:rPr>
+      </w:pPr>
+    </w:p>
+    <w:p>
+      <w:pPr>
+        <w:spacing w:after="0"/>
+        <w:jc w:val="both"/>
+        <w:rPr>
+          <w:rFonts w:ascii="Times New Roman" w:hAnsi="Times New Roman" w:cs="Times New Roman"/>
+        </w:rPr>
+      </w:pPr>
+      <w:r>
+        <w:rPr>
+          <w:rFonts w:ascii="Times New Roman" w:hAnsi="Times New Roman" w:cs="Times New Roman"/>
+        </w:rPr>
+        <w:t>10.AerodinamikaSK1Funkcija.py</w:t>
+      </w:r>
+    </w:p>
+    <w:p>
+      <w:pPr>
+        <w:spacing w:after="0"/>
+        <w:jc w:val="both"/>
+        <w:rPr>
+          <w:rFonts w:ascii="Times New Roman" w:hAnsi="Times New Roman" w:cs="Times New Roman"/>
+        </w:rPr>
+      </w:pPr>
+    </w:p>
+    <w:p>
+      <w:pPr>
+        <w:spacing w:after="0"/>
+        <w:jc w:val="both"/>
+        <w:rPr>
+          <w:rFonts w:ascii="Times New Roman" w:hAnsi="Times New Roman" w:cs="Times New Roman"/>
+        </w:rPr>
+      </w:pPr>
+      <w:r>
+        <w:rPr>
+          <w:rFonts w:ascii="Times New Roman" w:hAnsi="Times New Roman" w:cs="Times New Roman"/>
+        </w:rPr>
+        <w:t>11</w:t>
+      </w:r>
+      <w:r>
+        <w:rPr>
+          <w:rFonts w:ascii="Times New Roman" w:hAnsi="Times New Roman" w:cs="Times New Roman"/>
+        </w:rPr>
+        <w:t>.</w:t>
       </w:r>
       <w:r>
         <w:rPr>
@@ -816,207 +894,163 @@
         <w:rPr>
           <w:rFonts w:ascii="Times New Roman" w:hAnsi="Times New Roman" w:cs="Times New Roman"/>
         </w:rPr>
-        <w:t>„</w:t>
-      </w:r>
-      <w:r>
-        <w:rPr>
-          <w:rFonts w:ascii="Times New Roman" w:hAnsi="Times New Roman" w:cs="Times New Roman"/>
-        </w:rPr>
-        <w:t xml:space="preserve">Siurbiamų dujų temperatūra prieš </w:t>
-      </w:r>
-      <w:proofErr w:type="spellStart"/>
-      <w:r>
-        <w:rPr>
-          <w:rFonts w:ascii="Times New Roman" w:hAnsi="Times New Roman" w:cs="Times New Roman"/>
-        </w:rPr>
-        <w:t>rotametrą</w:t>
-      </w:r>
-      <w:proofErr w:type="spellEnd"/>
+        <w:t>GreitisSPFunkcija.py pagal SVP „Rezultatai.xlsx“ lape „Greitis“ nuspalvoja lentelę, surašo eilutėse esančius pavadinimus, nubraižo rėmelius.</w:t>
+      </w:r>
+    </w:p>
+    <w:p>
+      <w:pPr>
+        <w:spacing w:after="0"/>
+        <w:jc w:val="both"/>
+        <w:rPr>
+          <w:rFonts w:ascii="Times New Roman" w:hAnsi="Times New Roman" w:cs="Times New Roman"/>
+        </w:rPr>
+      </w:pPr>
+    </w:p>
+    <w:p>
+      <w:pPr>
+        <w:spacing w:after="0"/>
+        <w:jc w:val="both"/>
+        <w:rPr>
+          <w:rFonts w:ascii="Times New Roman" w:hAnsi="Times New Roman" w:cs="Times New Roman"/>
+        </w:rPr>
+      </w:pPr>
+      <w:r>
+        <w:rPr>
+          <w:rFonts w:ascii="Times New Roman" w:hAnsi="Times New Roman" w:cs="Times New Roman"/>
+        </w:rPr>
+        <w:t>12</w:t>
+      </w:r>
+      <w:r>
+        <w:rPr>
+          <w:rFonts w:ascii="Times New Roman" w:hAnsi="Times New Roman" w:cs="Times New Roman"/>
+        </w:rPr>
+        <w:t xml:space="preserve">. </w:t>
+      </w:r>
+      <w:r>
+        <w:rPr>
+          <w:rFonts w:ascii="Times New Roman" w:hAnsi="Times New Roman" w:cs="Times New Roman"/>
+        </w:rPr>
+        <w:t>H2O</w:t>
+      </w:r>
+      <w:r>
+        <w:rPr>
+          <w:rFonts w:ascii="Times New Roman" w:hAnsi="Times New Roman" w:cs="Times New Roman"/>
+        </w:rPr>
+        <w:t>SPFunkcija.py pagal SVP „Rezultatai.xlsx“ lape „</w:t>
+      </w:r>
+      <w:r>
+        <w:rPr>
+          <w:rFonts w:ascii="Times New Roman" w:hAnsi="Times New Roman" w:cs="Times New Roman"/>
+        </w:rPr>
+        <w:t>H2O</w:t>
+      </w:r>
+      <w:r>
+        <w:rPr>
+          <w:rFonts w:ascii="Times New Roman" w:hAnsi="Times New Roman" w:cs="Times New Roman"/>
+        </w:rPr>
+        <w:t>“ nuspalvoja lentelę, surašo eilutėse esančius pavadinimus, nubraižo rėmelius.</w:t>
+      </w:r>
+    </w:p>
+    <w:p>
+      <w:pPr>
+        <w:spacing w:after="0"/>
+        <w:jc w:val="both"/>
+        <w:rPr>
+          <w:rFonts w:ascii="Times New Roman" w:hAnsi="Times New Roman" w:cs="Times New Roman"/>
+        </w:rPr>
+      </w:pPr>
+    </w:p>
+    <w:p>
+      <w:pPr>
+        <w:spacing w:after="0"/>
+        <w:jc w:val="both"/>
+        <w:rPr>
+          <w:rFonts w:ascii="Times New Roman" w:hAnsi="Times New Roman" w:cs="Times New Roman"/>
+        </w:rPr>
+      </w:pPr>
+      <w:r>
+        <w:rPr>
+          <w:rFonts w:ascii="Times New Roman" w:hAnsi="Times New Roman" w:cs="Times New Roman"/>
+        </w:rPr>
+        <w:t>1</w:t>
+      </w:r>
+      <w:r>
+        <w:rPr>
+          <w:rFonts w:ascii="Times New Roman" w:hAnsi="Times New Roman" w:cs="Times New Roman"/>
+        </w:rPr>
+        <w:t>3</w:t>
+      </w:r>
+      <w:r>
+        <w:rPr>
+          <w:rFonts w:ascii="Times New Roman" w:hAnsi="Times New Roman" w:cs="Times New Roman"/>
+        </w:rPr>
+        <w:t>. PaemimasSP1Funkcija.py savyje turi PaemimasSP2Funkcija.py.</w:t>
+      </w:r>
+      <w:r>
+        <w:rPr>
+          <w:rFonts w:ascii="Times New Roman" w:hAnsi="Times New Roman" w:cs="Times New Roman"/>
+        </w:rPr>
+        <w:t xml:space="preserve"> PaėmimasSP2Funkcija.py nubraižo lentelę</w:t>
+      </w:r>
+      <w:r>
+        <w:rPr>
+          <w:rFonts w:ascii="Times New Roman" w:hAnsi="Times New Roman" w:cs="Times New Roman"/>
+        </w:rPr>
+        <w:t>, nuspalvoja, padaro įrašus po lentele. PaemimasSP1Funkcija.py padaro reikiamą skaičių lentelių kopijų pagal MatavimoVieta.py</w:t>
+      </w:r>
+      <w:r>
+        <w:rPr>
+          <w:rFonts w:ascii="Times New Roman" w:hAnsi="Times New Roman" w:cs="Times New Roman"/>
+        </w:rPr>
+        <w:t>, sukuria ir padaro įrašus paskutiniuose lentelių prieduose.</w:t>
+      </w:r>
+    </w:p>
+    <w:p>
+      <w:pPr>
+        <w:spacing w:after="0"/>
+        <w:jc w:val="both"/>
+        <w:rPr>
+          <w:rFonts w:ascii="Times New Roman" w:hAnsi="Times New Roman" w:cs="Times New Roman"/>
+        </w:rPr>
+      </w:pPr>
+    </w:p>
+    <w:p>
+      <w:pPr>
+        <w:spacing w:after="0"/>
+        <w:jc w:val="both"/>
+        <w:rPr>
+          <w:rFonts w:ascii="Times New Roman" w:hAnsi="Times New Roman" w:cs="Times New Roman"/>
+        </w:rPr>
+      </w:pPr>
+      <w:r>
+        <w:rPr>
+          <w:rFonts w:ascii="Times New Roman" w:hAnsi="Times New Roman" w:cs="Times New Roman"/>
+        </w:rPr>
+        <w:t>1</w:t>
+      </w:r>
+      <w:r>
+        <w:rPr>
+          <w:rFonts w:ascii="Times New Roman" w:hAnsi="Times New Roman" w:cs="Times New Roman"/>
+        </w:rPr>
+        <w:t>4</w:t>
+      </w:r>
+      <w:r>
+        <w:rPr>
+          <w:rFonts w:ascii="Times New Roman" w:hAnsi="Times New Roman" w:cs="Times New Roman"/>
+        </w:rPr>
+        <w:t>.</w:t>
+      </w:r>
       <w:r>
         <w:rPr>
           <w:rFonts w:ascii="Times New Roman" w:hAnsi="Times New Roman" w:cs="Times New Roman"/>
         </w:rPr>
         <w:t xml:space="preserve"> </w:t>
       </w:r>
-      <w:proofErr w:type="spellStart"/>
-      <w:r>
-        <w:rPr>
-          <w:rFonts w:ascii="Times New Roman" w:hAnsi="Times New Roman" w:cs="Times New Roman"/>
-        </w:rPr>
-        <w:t>tr</w:t>
-      </w:r>
-      <w:proofErr w:type="spellEnd"/>
-      <w:r>
-        <w:rPr>
-          <w:rFonts w:ascii="Times New Roman" w:hAnsi="Times New Roman" w:cs="Times New Roman"/>
-        </w:rPr>
-        <w:t xml:space="preserve"> (°C)</w:t>
-      </w:r>
-      <w:r>
-        <w:rPr>
-          <w:rFonts w:ascii="Times New Roman" w:hAnsi="Times New Roman" w:cs="Times New Roman"/>
-        </w:rPr>
-        <w:t>“ stulpeliais ir perkelia įvestas reikšmes į „Rezultatai.xlsx“ lapo „Paėmimas“ analogiškus stulpelius.</w:t>
-      </w:r>
-    </w:p>
-    <w:p>
-      <w:pPr>
-        <w:spacing w:after="0"/>
-        <w:jc w:val="both"/>
-        <w:rPr>
-          <w:rFonts w:ascii="Times New Roman" w:hAnsi="Times New Roman" w:cs="Times New Roman"/>
-        </w:rPr>
-      </w:pPr>
-    </w:p>
-    <w:p>
-      <w:pPr>
-        <w:spacing w:after="0"/>
-        <w:jc w:val="both"/>
-        <w:rPr>
-          <w:rFonts w:ascii="Times New Roman" w:hAnsi="Times New Roman" w:cs="Times New Roman"/>
-        </w:rPr>
-      </w:pPr>
-    </w:p>
-    <w:p>
-      <w:pPr>
-        <w:spacing w:after="0"/>
-        <w:jc w:val="both"/>
-        <w:rPr>
-          <w:rFonts w:ascii="Times New Roman" w:hAnsi="Times New Roman" w:cs="Times New Roman"/>
-        </w:rPr>
-      </w:pPr>
-      <w:r>
-        <w:rPr>
-          <w:rFonts w:ascii="Times New Roman" w:hAnsi="Times New Roman" w:cs="Times New Roman"/>
-        </w:rPr>
-        <w:lastRenderedPageBreak/>
-        <w:t>8.</w:t>
-      </w:r>
-      <w:r>
-        <w:rPr>
-          <w:rFonts w:ascii="Times New Roman" w:hAnsi="Times New Roman" w:cs="Times New Roman"/>
-        </w:rPr>
-        <w:t xml:space="preserve"> Greitis</w:t>
-      </w:r>
-      <w:r>
-        <w:rPr>
-          <w:rFonts w:ascii="Times New Roman" w:hAnsi="Times New Roman" w:cs="Times New Roman"/>
-        </w:rPr>
-        <w:t>SPFunkcija.py pagal SVP „Rezultatai.xlsx“ lape „Greitis“ nuspalvoja lentelę, surašo eilutėse esančius pavadinimus, nubraižo rėmelius.</w:t>
-      </w:r>
-    </w:p>
-    <w:p>
-      <w:pPr>
-        <w:spacing w:after="0"/>
-        <w:jc w:val="both"/>
-        <w:rPr>
-          <w:rFonts w:ascii="Times New Roman" w:hAnsi="Times New Roman" w:cs="Times New Roman"/>
-        </w:rPr>
-      </w:pPr>
-    </w:p>
-    <w:p>
-      <w:pPr>
-        <w:spacing w:after="0"/>
-        <w:jc w:val="both"/>
-        <w:rPr>
-          <w:rFonts w:ascii="Times New Roman" w:hAnsi="Times New Roman" w:cs="Times New Roman"/>
-        </w:rPr>
-      </w:pPr>
-      <w:r>
-        <w:rPr>
-          <w:rFonts w:ascii="Times New Roman" w:hAnsi="Times New Roman" w:cs="Times New Roman"/>
-        </w:rPr>
-        <w:t>9</w:t>
-      </w:r>
-      <w:r>
-        <w:rPr>
-          <w:rFonts w:ascii="Times New Roman" w:hAnsi="Times New Roman" w:cs="Times New Roman"/>
-        </w:rPr>
-        <w:t xml:space="preserve">. </w:t>
-      </w:r>
-      <w:r>
-        <w:rPr>
-          <w:rFonts w:ascii="Times New Roman" w:hAnsi="Times New Roman" w:cs="Times New Roman"/>
-        </w:rPr>
-        <w:t>H2O</w:t>
-      </w:r>
-      <w:r>
-        <w:rPr>
-          <w:rFonts w:ascii="Times New Roman" w:hAnsi="Times New Roman" w:cs="Times New Roman"/>
-        </w:rPr>
-        <w:t>SPFunkcija.py pagal SVP „Rezultatai.xlsx“ lape „</w:t>
-      </w:r>
-      <w:r>
-        <w:rPr>
-          <w:rFonts w:ascii="Times New Roman" w:hAnsi="Times New Roman" w:cs="Times New Roman"/>
-        </w:rPr>
-        <w:t>H2O</w:t>
-      </w:r>
-      <w:r>
-        <w:rPr>
-          <w:rFonts w:ascii="Times New Roman" w:hAnsi="Times New Roman" w:cs="Times New Roman"/>
-        </w:rPr>
-        <w:t>“ nuspalvoja lentelę, surašo eilutėse esančius pavadinimus, nubraižo rėmelius.</w:t>
-      </w:r>
-    </w:p>
-    <w:p>
-      <w:pPr>
-        <w:spacing w:after="0"/>
-        <w:jc w:val="both"/>
-        <w:rPr>
-          <w:rFonts w:ascii="Times New Roman" w:hAnsi="Times New Roman" w:cs="Times New Roman"/>
-        </w:rPr>
-      </w:pPr>
-    </w:p>
-    <w:p>
-      <w:pPr>
-        <w:spacing w:after="0"/>
-        <w:jc w:val="both"/>
-        <w:rPr>
-          <w:rFonts w:ascii="Times New Roman" w:hAnsi="Times New Roman" w:cs="Times New Roman"/>
-        </w:rPr>
-      </w:pPr>
-      <w:r>
-        <w:rPr>
-          <w:rFonts w:ascii="Times New Roman" w:hAnsi="Times New Roman" w:cs="Times New Roman"/>
-        </w:rPr>
-        <w:t>10. PaemimasSP1Funkcija.py savyje turi PaemimasSP2Funkcija.py.</w:t>
-      </w:r>
-    </w:p>
-    <w:p>
-      <w:pPr>
-        <w:spacing w:after="0"/>
-        <w:jc w:val="both"/>
-        <w:rPr>
-          <w:rFonts w:ascii="Times New Roman" w:hAnsi="Times New Roman" w:cs="Times New Roman"/>
-        </w:rPr>
-      </w:pPr>
-    </w:p>
-    <w:p>
-      <w:pPr>
-        <w:spacing w:after="0"/>
-        <w:jc w:val="both"/>
-        <w:rPr>
-          <w:rFonts w:ascii="Times New Roman" w:hAnsi="Times New Roman" w:cs="Times New Roman"/>
-        </w:rPr>
-      </w:pPr>
-      <w:r>
-        <w:rPr>
-          <w:rFonts w:ascii="Times New Roman" w:hAnsi="Times New Roman" w:cs="Times New Roman"/>
-        </w:rPr>
-        <w:t>11</w:t>
-      </w:r>
-      <w:r>
-        <w:rPr>
-          <w:rFonts w:ascii="Times New Roman" w:hAnsi="Times New Roman" w:cs="Times New Roman"/>
-        </w:rPr>
-        <w:t>.</w:t>
-      </w:r>
-      <w:r>
-        <w:rPr>
-          <w:rFonts w:ascii="Times New Roman" w:hAnsi="Times New Roman" w:cs="Times New Roman"/>
-        </w:rPr>
-        <w:t xml:space="preserve"> AerodinamikaSP1</w:t>
+      <w:r>
+        <w:rPr>
+          <w:rFonts w:ascii="Times New Roman" w:hAnsi="Times New Roman" w:cs="Times New Roman"/>
+        </w:rPr>
+        <w:t>AerodinamikaSP1</w:t>
       </w:r>
       <w:r>
         <w:rPr>
@@ -1024,6 +1058,12 @@
         </w:rPr>
         <w:t>Funkcija.py savyje turi AerodinamikaSP2Funkcija.py.</w:t>
       </w:r>
+      <w:r>
+        <w:rPr>
+          <w:rFonts w:ascii="Times New Roman" w:hAnsi="Times New Roman" w:cs="Times New Roman"/>
+        </w:rPr>
+        <w:t xml:space="preserve"> AerodinamikaSP2Funkcija.py nubraižo lentelę, nuspalvoja, padaro įrašus po lentele. AerodinamikaSP1Funkcija.py padaro reikiamą skaičių lentelių kopijų pagal MatavimoVieta.py, sukuria ir padaro įrašus paskutiniuose lentelių prieduose.</w:t>
+      </w:r>
     </w:p>
     <w:p>
       <w:pPr>
@@ -1052,7 +1092,7 @@
         <w:rPr>
           <w:rFonts w:ascii="Times New Roman" w:hAnsi="Times New Roman" w:cs="Times New Roman"/>
         </w:rPr>
-        <w:t>2</w:t>
+        <w:t>5</w:t>
       </w:r>
       <w:r>
         <w:rPr>
@@ -1106,7 +1146,7 @@
         <w:rPr>
           <w:rFonts w:ascii="Times New Roman" w:hAnsi="Times New Roman" w:cs="Times New Roman"/>
         </w:rPr>
-        <w:t>3</w:t>
+        <w:t>6</w:t>
       </w:r>
       <w:r>
         <w:rPr>
@@ -1549,7 +1589,7 @@
   <w:style w:type="paragraph" w:default="1" w:styleId="prastasis">
     <w:name w:val="Normal"/>
     <w:qFormat/>
-    <w:rsid w:val="00073909"/>
+    <w:rsid w:val="009B616F"/>
   </w:style>
   <w:style w:type="paragraph" w:styleId="Antrat1">
     <w:name w:val="heading 1"/>

</xml_diff>

<commit_message>
Pridėti darbuotojo inicialai funcijoje Pradiniai1Funkcija.py
</commit_message>
<xml_diff>
--- a/AtmintinėFunkcijos.docx
+++ b/AtmintinėFunkcijos.docx
@@ -488,6 +488,30 @@
         <w:rPr>
           <w:rFonts w:ascii="Times New Roman" w:hAnsi="Times New Roman" w:cs="Times New Roman"/>
         </w:rPr>
+        <w:t>“</w:t>
+      </w:r>
+      <w:r>
+        <w:rPr>
+          <w:rFonts w:ascii="Times New Roman" w:hAnsi="Times New Roman" w:cs="Times New Roman"/>
+        </w:rPr>
+        <w:t xml:space="preserve"> ir </w:t>
+      </w:r>
+      <w:r>
+        <w:rPr>
+          <w:rFonts w:ascii="Times New Roman" w:hAnsi="Times New Roman" w:cs="Times New Roman"/>
+        </w:rPr>
+        <w:t>„</w:t>
+      </w:r>
+      <w:r>
+        <w:rPr>
+          <w:rFonts w:ascii="Times New Roman" w:hAnsi="Times New Roman" w:cs="Times New Roman"/>
+        </w:rPr>
+        <w:t>Skaičiavimus atliko (inicialai, data)</w:t>
+      </w:r>
+      <w:r>
+        <w:rPr>
+          <w:rFonts w:ascii="Times New Roman" w:hAnsi="Times New Roman" w:cs="Times New Roman"/>
+        </w:rPr>
         <w:t>“.</w:t>
       </w:r>
     </w:p>
@@ -829,6 +853,66 @@
           <w:rFonts w:ascii="Times New Roman" w:hAnsi="Times New Roman" w:cs="Times New Roman"/>
         </w:rPr>
         <w:t>9. PaėmimasSK1Funkcija.py</w:t>
+      </w:r>
+      <w:r>
+        <w:rPr>
+          <w:rFonts w:ascii="Times New Roman" w:hAnsi="Times New Roman" w:cs="Times New Roman"/>
+        </w:rPr>
+        <w:t xml:space="preserve"> </w:t>
+      </w:r>
+      <w:r>
+        <w:rPr>
+          <w:rFonts w:ascii="Times New Roman" w:hAnsi="Times New Roman" w:cs="Times New Roman"/>
+        </w:rPr>
+        <w:t>atlieka visus skaičiavimus failo „Rezultatai.xlsx“ lape „Paėmimas“ išskyrus „</w:t>
+      </w:r>
+      <w:r>
+        <w:rPr>
+          <w:rFonts w:ascii="Times New Roman" w:hAnsi="Times New Roman" w:cs="Times New Roman"/>
+        </w:rPr>
+        <w:t>Srauto greitis ortakyje wor (m/s)</w:t>
+      </w:r>
+      <w:r>
+        <w:rPr>
+          <w:rFonts w:ascii="Times New Roman" w:hAnsi="Times New Roman" w:cs="Times New Roman"/>
+        </w:rPr>
+        <w:t xml:space="preserve">“ ir </w:t>
+      </w:r>
+      <w:r>
+        <w:rPr>
+          <w:rFonts w:ascii="Times New Roman" w:hAnsi="Times New Roman" w:cs="Times New Roman"/>
+        </w:rPr>
+        <w:t>„</w:t>
+      </w:r>
+      <w:r>
+        <w:rPr>
+          <w:rFonts w:ascii="Times New Roman" w:hAnsi="Times New Roman" w:cs="Times New Roman"/>
+        </w:rPr>
+        <w:t>Izokinetiškumas (0,95-1,15)</w:t>
+      </w:r>
+      <w:r>
+        <w:rPr>
+          <w:rFonts w:ascii="Times New Roman" w:hAnsi="Times New Roman" w:cs="Times New Roman"/>
+        </w:rPr>
+        <w:t xml:space="preserve">“. Į lapą „Greitis“ perkelia </w:t>
+      </w:r>
+      <w:r>
+        <w:rPr>
+          <w:rFonts w:ascii="Times New Roman" w:hAnsi="Times New Roman" w:cs="Times New Roman"/>
+        </w:rPr>
+        <w:t>„</w:t>
+      </w:r>
+      <w:r>
+        <w:rPr>
+          <w:rFonts w:ascii="Times New Roman" w:hAnsi="Times New Roman" w:cs="Times New Roman"/>
+        </w:rPr>
+        <w:t>Temperatūra ortakyje t, oC</w:t>
+      </w:r>
+      <w:r>
+        <w:rPr>
+          <w:rFonts w:ascii="Times New Roman" w:hAnsi="Times New Roman" w:cs="Times New Roman"/>
+        </w:rPr>
+        <w:t>“ reikšmes.</w:t>
       </w:r>
     </w:p>
     <w:p>
@@ -2406,6 +2490,26 @@
 </file>
 
 <file path=customXml/item1.xml><?xml version="1.0" encoding="utf-8"?>
+<p:properties xmlns:p="http://schemas.microsoft.com/office/2006/metadata/properties" xmlns:xsi="http://www.w3.org/2001/XMLSchema-instance" xmlns:pc="http://schemas.microsoft.com/office/infopath/2007/PartnerControls">
+  <documentManagement>
+    <lcf76f155ced4ddcb4097134ff3c332f xmlns="453e7e53-5eb2-45cf-b2ab-34c867e554b8">
+      <Terms xmlns="http://schemas.microsoft.com/office/infopath/2007/PartnerControls"/>
+    </lcf76f155ced4ddcb4097134ff3c332f>
+    <TaxCatchAll xmlns="aa0d983d-359a-438c-9953-3af1a8ac0831" xsi:nil="true"/>
+  </documentManagement>
+</p:properties>
+</file>
+
+<file path=customXml/item2.xml><?xml version="1.0" encoding="utf-8"?>
+<?mso-contentType ?>
+<FormTemplates xmlns="http://schemas.microsoft.com/sharepoint/v3/contenttype/forms">
+  <Display>DocumentLibraryForm</Display>
+  <Edit>DocumentLibraryForm</Edit>
+  <New>DocumentLibraryForm</New>
+</FormTemplates>
+</file>
+
+<file path=customXml/item3.xml><?xml version="1.0" encoding="utf-8"?>
 <ct:contentTypeSchema xmlns:ct="http://schemas.microsoft.com/office/2006/metadata/contentType" xmlns:ma="http://schemas.microsoft.com/office/2006/metadata/properties/metaAttributes" ct:_="" ma:_="" ma:contentTypeName="Dokumentas" ma:contentTypeID="0x010100BAB57CF81AE55C4698AAD22D302297F0" ma:contentTypeVersion="18" ma:contentTypeDescription="Kurkite naują dokumentą." ma:contentTypeScope="" ma:versionID="49ab401eb4052690d2a2629974c22fd6">
   <xsd:schema xmlns:xsd="http://www.w3.org/2001/XMLSchema" xmlns:xs="http://www.w3.org/2001/XMLSchema" xmlns:p="http://schemas.microsoft.com/office/2006/metadata/properties" xmlns:ns2="453e7e53-5eb2-45cf-b2ab-34c867e554b8" xmlns:ns3="aa0d983d-359a-438c-9953-3af1a8ac0831" targetNamespace="http://schemas.microsoft.com/office/2006/metadata/properties" ma:root="true" ma:fieldsID="ab9969d50e0b13c63bc5bd0499c928dc" ns2:_="" ns3:_="">
     <xsd:import namespace="453e7e53-5eb2-45cf-b2ab-34c867e554b8"/>
@@ -2660,27 +2764,26 @@
 </ct:contentTypeSchema>
 </file>
 
-<file path=customXml/item2.xml><?xml version="1.0" encoding="utf-8"?>
-<?mso-contentType ?>
-<FormTemplates xmlns="http://schemas.microsoft.com/sharepoint/v3/contenttype/forms">
-  <Display>DocumentLibraryForm</Display>
-  <Edit>DocumentLibraryForm</Edit>
-  <New>DocumentLibraryForm</New>
-</FormTemplates>
+<file path=customXml/itemProps1.xml><?xml version="1.0" encoding="utf-8"?>
+<ds:datastoreItem xmlns:ds="http://schemas.openxmlformats.org/officeDocument/2006/customXml" ds:itemID="{52F8D590-B38F-4B4A-8BDD-FD59D16A4DE7}">
+  <ds:schemaRefs>
+    <ds:schemaRef ds:uri="http://schemas.microsoft.com/office/2006/metadata/properties"/>
+    <ds:schemaRef ds:uri="http://schemas.microsoft.com/office/infopath/2007/PartnerControls"/>
+    <ds:schemaRef ds:uri="453e7e53-5eb2-45cf-b2ab-34c867e554b8"/>
+    <ds:schemaRef ds:uri="aa0d983d-359a-438c-9953-3af1a8ac0831"/>
+  </ds:schemaRefs>
+</ds:datastoreItem>
 </file>
 
-<file path=customXml/item3.xml><?xml version="1.0" encoding="utf-8"?>
-<p:properties xmlns:p="http://schemas.microsoft.com/office/2006/metadata/properties" xmlns:xsi="http://www.w3.org/2001/XMLSchema-instance" xmlns:pc="http://schemas.microsoft.com/office/infopath/2007/PartnerControls">
-  <documentManagement>
-    <lcf76f155ced4ddcb4097134ff3c332f xmlns="453e7e53-5eb2-45cf-b2ab-34c867e554b8">
-      <Terms xmlns="http://schemas.microsoft.com/office/infopath/2007/PartnerControls"/>
-    </lcf76f155ced4ddcb4097134ff3c332f>
-    <TaxCatchAll xmlns="aa0d983d-359a-438c-9953-3af1a8ac0831" xsi:nil="true"/>
-  </documentManagement>
-</p:properties>
+<file path=customXml/itemProps2.xml><?xml version="1.0" encoding="utf-8"?>
+<ds:datastoreItem xmlns:ds="http://schemas.openxmlformats.org/officeDocument/2006/customXml" ds:itemID="{47D7D20A-5C87-427E-8B8D-3343B9C6406D}">
+  <ds:schemaRefs>
+    <ds:schemaRef ds:uri="http://schemas.microsoft.com/sharepoint/v3/contenttype/forms"/>
+  </ds:schemaRefs>
+</ds:datastoreItem>
 </file>
 
-<file path=customXml/itemProps1.xml><?xml version="1.0" encoding="utf-8"?>
+<file path=customXml/itemProps3.xml><?xml version="1.0" encoding="utf-8"?>
 <ds:datastoreItem xmlns:ds="http://schemas.openxmlformats.org/officeDocument/2006/customXml" ds:itemID="{CC52CDA6-DE27-4DDF-B41E-8471831E0206}">
   <ds:schemaRefs>
     <ds:schemaRef ds:uri="http://schemas.microsoft.com/office/2006/metadata/contentType"/>
@@ -2697,23 +2800,4 @@
     <ds:schemaRef ds:uri="http://schemas.microsoft.com/internal/obd"/>
   </ds:schemaRefs>
 </ds:datastoreItem>
-</file>
-
-<file path=customXml/itemProps2.xml><?xml version="1.0" encoding="utf-8"?>
-<ds:datastoreItem xmlns:ds="http://schemas.openxmlformats.org/officeDocument/2006/customXml" ds:itemID="{47D7D20A-5C87-427E-8B8D-3343B9C6406D}">
-  <ds:schemaRefs>
-    <ds:schemaRef ds:uri="http://schemas.microsoft.com/sharepoint/v3/contenttype/forms"/>
-  </ds:schemaRefs>
-</ds:datastoreItem>
-</file>
-
-<file path=customXml/itemProps3.xml><?xml version="1.0" encoding="utf-8"?>
-<ds:datastoreItem xmlns:ds="http://schemas.openxmlformats.org/officeDocument/2006/customXml" ds:itemID="{52F8D590-B38F-4B4A-8BDD-FD59D16A4DE7}">
-  <ds:schemaRefs>
-    <ds:schemaRef ds:uri="http://schemas.microsoft.com/office/2006/metadata/properties"/>
-    <ds:schemaRef ds:uri="http://schemas.microsoft.com/office/infopath/2007/PartnerControls"/>
-    <ds:schemaRef ds:uri="453e7e53-5eb2-45cf-b2ab-34c867e554b8"/>
-    <ds:schemaRef ds:uri="aa0d983d-359a-438c-9953-3af1a8ac0831"/>
-  </ds:schemaRefs>
-</ds:datastoreItem>
 </file>
</xml_diff>

<commit_message>
Suskaičiuotas lapas H2O ir pusė Aerodinamika su AerodinamikaSK1Funkcija.py
</commit_message>
<xml_diff>
--- a/AtmintinėFunkcijos.docx
+++ b/AtmintinėFunkcijos.docx
@@ -815,44 +815,209 @@
           <w:rFonts w:ascii="Times New Roman" w:hAnsi="Times New Roman" w:cs="Times New Roman"/>
         </w:rPr>
       </w:pPr>
-    </w:p>
-    <w:p>
-      <w:pPr>
-        <w:spacing w:after="0"/>
-        <w:jc w:val="both"/>
-        <w:rPr>
-          <w:rFonts w:ascii="Times New Roman" w:hAnsi="Times New Roman" w:cs="Times New Roman"/>
-        </w:rPr>
-      </w:pPr>
-      <w:r>
-        <w:rPr>
-          <w:rFonts w:ascii="Times New Roman" w:hAnsi="Times New Roman" w:cs="Times New Roman"/>
-        </w:rPr>
-        <w:t>8. GreitisSK1Funkcija.py</w:t>
-      </w:r>
-    </w:p>
-    <w:p>
-      <w:pPr>
-        <w:spacing w:after="0"/>
-        <w:jc w:val="both"/>
-        <w:rPr>
-          <w:rFonts w:ascii="Times New Roman" w:hAnsi="Times New Roman" w:cs="Times New Roman"/>
-        </w:rPr>
-      </w:pPr>
-    </w:p>
-    <w:p>
-      <w:pPr>
-        <w:spacing w:after="0"/>
-        <w:jc w:val="both"/>
-        <w:rPr>
-          <w:rFonts w:ascii="Times New Roman" w:hAnsi="Times New Roman" w:cs="Times New Roman"/>
-        </w:rPr>
-      </w:pPr>
-      <w:r>
-        <w:rPr>
-          <w:rFonts w:ascii="Times New Roman" w:hAnsi="Times New Roman" w:cs="Times New Roman"/>
-        </w:rPr>
-        <w:t>9. PaėmimasSK1Funkcija.py</w:t>
+      <w:r>
+        <w:rPr>
+          <w:rFonts w:ascii="Times New Roman" w:hAnsi="Times New Roman" w:cs="Times New Roman"/>
+        </w:rPr>
+        <w:t>8</w:t>
+      </w:r>
+      <w:r>
+        <w:rPr>
+          <w:rFonts w:ascii="Times New Roman" w:hAnsi="Times New Roman" w:cs="Times New Roman"/>
+        </w:rPr>
+        <w:t>. H2OSK1Funkcija.py suskaičiuoja</w:t>
+      </w:r>
+      <w:r>
+        <w:rPr>
+          <w:rFonts w:ascii="Times New Roman" w:hAnsi="Times New Roman" w:cs="Times New Roman"/>
+        </w:rPr>
+        <w:t xml:space="preserve"> „Rezultatai.xlsx“ lape „H2O esančius langelius:</w:t>
+      </w:r>
+    </w:p>
+    <w:p>
+      <w:pPr>
+        <w:spacing w:after="0"/>
+        <w:ind w:firstLine="284"/>
+        <w:jc w:val="both"/>
+        <w:rPr>
+          <w:rFonts w:ascii="Times New Roman" w:hAnsi="Times New Roman" w:cs="Times New Roman"/>
+        </w:rPr>
+      </w:pPr>
+      <w:r>
+        <w:rPr>
+          <w:rFonts w:ascii="Times New Roman" w:hAnsi="Times New Roman" w:cs="Times New Roman"/>
+        </w:rPr>
+        <w:t>„</w:t>
+      </w:r>
+      <w:r>
+        <w:rPr>
+          <w:rFonts w:ascii="Times New Roman" w:hAnsi="Times New Roman" w:cs="Times New Roman"/>
+        </w:rPr>
+        <w:t>Atmosferinis slėgis, hPa</w:t>
+      </w:r>
+      <w:r>
+        <w:rPr>
+          <w:rFonts w:ascii="Times New Roman" w:hAnsi="Times New Roman" w:cs="Times New Roman"/>
+        </w:rPr>
+        <w:t>“ persikopijuoja iš lapo „Greitis“;</w:t>
+      </w:r>
+    </w:p>
+    <w:p>
+      <w:pPr>
+        <w:spacing w:after="0"/>
+        <w:ind w:firstLine="284"/>
+        <w:jc w:val="both"/>
+        <w:rPr>
+          <w:rFonts w:ascii="Times New Roman" w:hAnsi="Times New Roman" w:cs="Times New Roman"/>
+        </w:rPr>
+      </w:pPr>
+      <w:r>
+        <w:rPr>
+          <w:rFonts w:ascii="Times New Roman" w:hAnsi="Times New Roman" w:cs="Times New Roman"/>
+        </w:rPr>
+        <w:t>„</w:t>
+      </w:r>
+      <w:r>
+        <w:rPr>
+          <w:rFonts w:ascii="Times New Roman" w:hAnsi="Times New Roman" w:cs="Times New Roman"/>
+        </w:rPr>
+        <w:t>Dujų tūris normaliomis sąlygomis, Vn l.</w:t>
+      </w:r>
+      <w:r>
+        <w:rPr>
+          <w:rFonts w:ascii="Times New Roman" w:hAnsi="Times New Roman" w:cs="Times New Roman"/>
+        </w:rPr>
+        <w:t>“;</w:t>
+      </w:r>
+    </w:p>
+    <w:p>
+      <w:pPr>
+        <w:spacing w:after="0"/>
+        <w:ind w:firstLine="284"/>
+        <w:jc w:val="both"/>
+        <w:rPr>
+          <w:rFonts w:ascii="Times New Roman" w:hAnsi="Times New Roman" w:cs="Times New Roman"/>
+        </w:rPr>
+      </w:pPr>
+      <w:r>
+        <w:rPr>
+          <w:rFonts w:ascii="Times New Roman" w:hAnsi="Times New Roman" w:cs="Times New Roman"/>
+        </w:rPr>
+        <w:t>„</w:t>
+      </w:r>
+      <w:r>
+        <w:rPr>
+          <w:rFonts w:ascii="Times New Roman" w:hAnsi="Times New Roman" w:cs="Times New Roman"/>
+        </w:rPr>
+        <w:t>Prasiurbtas dujų tūris normaliosiomis sąlygomis Vmn, Nm3</w:t>
+      </w:r>
+      <w:r>
+        <w:rPr>
+          <w:rFonts w:ascii="Times New Roman" w:hAnsi="Times New Roman" w:cs="Times New Roman"/>
+        </w:rPr>
+        <w:t>“.</w:t>
+      </w:r>
+    </w:p>
+    <w:p>
+      <w:pPr>
+        <w:spacing w:after="0"/>
+        <w:ind w:firstLine="284"/>
+        <w:jc w:val="both"/>
+        <w:rPr>
+          <w:rFonts w:ascii="Times New Roman" w:hAnsi="Times New Roman" w:cs="Times New Roman"/>
+        </w:rPr>
+      </w:pPr>
+      <w:r>
+        <w:rPr>
+          <w:rFonts w:ascii="Times New Roman" w:hAnsi="Times New Roman" w:cs="Times New Roman"/>
+        </w:rPr>
+        <w:t>Lieka neskaičiuoti, nes nėra duomenų:</w:t>
+      </w:r>
+    </w:p>
+    <w:p>
+      <w:pPr>
+        <w:spacing w:after="0"/>
+        <w:ind w:firstLine="284"/>
+        <w:jc w:val="both"/>
+        <w:rPr>
+          <w:rFonts w:ascii="Times New Roman" w:hAnsi="Times New Roman" w:cs="Times New Roman"/>
+        </w:rPr>
+      </w:pPr>
+      <w:r>
+        <w:rPr>
+          <w:rFonts w:ascii="Times New Roman" w:hAnsi="Times New Roman" w:cs="Times New Roman"/>
+        </w:rPr>
+        <w:t>„</w:t>
+      </w:r>
+      <w:r>
+        <w:rPr>
+          <w:rFonts w:ascii="Times New Roman" w:hAnsi="Times New Roman" w:cs="Times New Roman"/>
+        </w:rPr>
+        <w:t>Sausų dujų tankis normaliosioms sąlygomis qn (kg/m3)</w:t>
+      </w:r>
+      <w:r>
+        <w:rPr>
+          <w:rFonts w:ascii="Times New Roman" w:hAnsi="Times New Roman" w:cs="Times New Roman"/>
+        </w:rPr>
+        <w:t>“</w:t>
+      </w:r>
+    </w:p>
+    <w:p>
+      <w:pPr>
+        <w:spacing w:after="0"/>
+        <w:ind w:firstLine="284"/>
+        <w:jc w:val="both"/>
+        <w:rPr>
+          <w:rFonts w:ascii="Times New Roman" w:hAnsi="Times New Roman" w:cs="Times New Roman"/>
+        </w:rPr>
+      </w:pPr>
+      <w:r>
+        <w:rPr>
+          <w:rFonts w:ascii="Times New Roman" w:hAnsi="Times New Roman" w:cs="Times New Roman"/>
+        </w:rPr>
+        <w:t>„</w:t>
+      </w:r>
+      <w:r>
+        <w:rPr>
+          <w:rFonts w:ascii="Times New Roman" w:hAnsi="Times New Roman" w:cs="Times New Roman"/>
+        </w:rPr>
+        <w:t>Drėgmės kiekis X (%) (izokinetinei sistemai)</w:t>
+      </w:r>
+      <w:r>
+        <w:rPr>
+          <w:rFonts w:ascii="Times New Roman" w:hAnsi="Times New Roman" w:cs="Times New Roman"/>
+        </w:rPr>
+        <w:t>“.</w:t>
+      </w:r>
+    </w:p>
+    <w:p>
+      <w:pPr>
+        <w:spacing w:after="0"/>
+        <w:jc w:val="both"/>
+        <w:rPr>
+          <w:rFonts w:ascii="Times New Roman" w:hAnsi="Times New Roman" w:cs="Times New Roman"/>
+        </w:rPr>
+      </w:pPr>
+    </w:p>
+    <w:p>
+      <w:pPr>
+        <w:spacing w:after="0"/>
+        <w:jc w:val="both"/>
+        <w:rPr>
+          <w:rFonts w:ascii="Times New Roman" w:hAnsi="Times New Roman" w:cs="Times New Roman"/>
+        </w:rPr>
+      </w:pPr>
+      <w:r>
+        <w:rPr>
+          <w:rFonts w:ascii="Times New Roman" w:hAnsi="Times New Roman" w:cs="Times New Roman"/>
+        </w:rPr>
+        <w:t>9</w:t>
+      </w:r>
+      <w:r>
+        <w:rPr>
+          <w:rFonts w:ascii="Times New Roman" w:hAnsi="Times New Roman" w:cs="Times New Roman"/>
+        </w:rPr>
+        <w:t>. PaėmimasSK1Funkcija.py</w:t>
       </w:r>
       <w:r>
         <w:rPr>
@@ -936,31 +1101,13 @@
         <w:rPr>
           <w:rFonts w:ascii="Times New Roman" w:hAnsi="Times New Roman" w:cs="Times New Roman"/>
         </w:rPr>
-        <w:t>10.AerodinamikaSK1Funkcija.py</w:t>
-      </w:r>
-    </w:p>
-    <w:p>
-      <w:pPr>
-        <w:spacing w:after="0"/>
-        <w:jc w:val="both"/>
-        <w:rPr>
-          <w:rFonts w:ascii="Times New Roman" w:hAnsi="Times New Roman" w:cs="Times New Roman"/>
-        </w:rPr>
-      </w:pPr>
-    </w:p>
-    <w:p>
-      <w:pPr>
-        <w:spacing w:after="0"/>
-        <w:jc w:val="both"/>
-        <w:rPr>
-          <w:rFonts w:ascii="Times New Roman" w:hAnsi="Times New Roman" w:cs="Times New Roman"/>
-        </w:rPr>
-      </w:pPr>
-      <w:r>
-        <w:rPr>
-          <w:rFonts w:ascii="Times New Roman" w:hAnsi="Times New Roman" w:cs="Times New Roman"/>
-        </w:rPr>
-        <w:t>11</w:t>
+        <w:t>1</w:t>
+      </w:r>
+      <w:r>
+        <w:rPr>
+          <w:rFonts w:ascii="Times New Roman" w:hAnsi="Times New Roman" w:cs="Times New Roman"/>
+        </w:rPr>
+        <w:t>0</w:t>
       </w:r>
       <w:r>
         <w:rPr>
@@ -978,6 +1125,300 @@
         <w:rPr>
           <w:rFonts w:ascii="Times New Roman" w:hAnsi="Times New Roman" w:cs="Times New Roman"/>
         </w:rPr>
+        <w:t>AerodinamikaSK1Funkcija.py</w:t>
+      </w:r>
+      <w:r>
+        <w:rPr>
+          <w:rFonts w:ascii="Times New Roman" w:hAnsi="Times New Roman" w:cs="Times New Roman"/>
+        </w:rPr>
+        <w:t xml:space="preserve"> suskaičiuoja šiuos stulpelius:</w:t>
+      </w:r>
+    </w:p>
+    <w:p>
+      <w:pPr>
+        <w:spacing w:after="0"/>
+        <w:jc w:val="both"/>
+        <w:rPr>
+          <w:rFonts w:ascii="Times New Roman" w:hAnsi="Times New Roman" w:cs="Times New Roman"/>
+        </w:rPr>
+      </w:pPr>
+      <w:r>
+        <w:rPr>
+          <w:rFonts w:ascii="Times New Roman" w:hAnsi="Times New Roman" w:cs="Times New Roman"/>
+        </w:rPr>
+        <w:t>„</w:t>
+      </w:r>
+      <w:r>
+        <w:rPr>
+          <w:rFonts w:ascii="Times New Roman" w:hAnsi="Times New Roman" w:cs="Times New Roman"/>
+        </w:rPr>
+        <w:t>Prasiurbtas dujų tūris Vm (m3)</w:t>
+      </w:r>
+      <w:r>
+        <w:rPr>
+          <w:rFonts w:ascii="Times New Roman" w:hAnsi="Times New Roman" w:cs="Times New Roman"/>
+        </w:rPr>
+        <w:t>“;</w:t>
+      </w:r>
+    </w:p>
+    <w:p>
+      <w:pPr>
+        <w:spacing w:after="0"/>
+        <w:jc w:val="both"/>
+        <w:rPr>
+          <w:rFonts w:ascii="Times New Roman" w:hAnsi="Times New Roman" w:cs="Times New Roman"/>
+        </w:rPr>
+      </w:pPr>
+      <w:r>
+        <w:rPr>
+          <w:rFonts w:ascii="Times New Roman" w:hAnsi="Times New Roman" w:cs="Times New Roman"/>
+        </w:rPr>
+        <w:t>„</w:t>
+      </w:r>
+      <w:r>
+        <w:rPr>
+          <w:rFonts w:ascii="Times New Roman" w:hAnsi="Times New Roman" w:cs="Times New Roman"/>
+        </w:rPr>
+        <w:t>Prasiurbtas dujų tūris normaliosiomis sąlygomis Vmn (Nm3)</w:t>
+      </w:r>
+      <w:r>
+        <w:rPr>
+          <w:rFonts w:ascii="Times New Roman" w:hAnsi="Times New Roman" w:cs="Times New Roman"/>
+        </w:rPr>
+        <w:t>“;</w:t>
+      </w:r>
+    </w:p>
+    <w:p>
+      <w:pPr>
+        <w:spacing w:after="0"/>
+        <w:jc w:val="both"/>
+        <w:rPr>
+          <w:rFonts w:ascii="Times New Roman" w:hAnsi="Times New Roman" w:cs="Times New Roman"/>
+        </w:rPr>
+      </w:pPr>
+      <w:r>
+        <w:rPr>
+          <w:rFonts w:ascii="Times New Roman" w:hAnsi="Times New Roman" w:cs="Times New Roman"/>
+        </w:rPr>
+        <w:t>„</w:t>
+      </w:r>
+      <w:r>
+        <w:rPr>
+          <w:rFonts w:ascii="Times New Roman" w:hAnsi="Times New Roman" w:cs="Times New Roman"/>
+        </w:rPr>
+        <w:t>Prasiurbto dujų tūrio normaliosiomis sąlygomis suma Vmn(sum) (Nm3)</w:t>
+      </w:r>
+      <w:r>
+        <w:rPr>
+          <w:rFonts w:ascii="Times New Roman" w:hAnsi="Times New Roman" w:cs="Times New Roman"/>
+        </w:rPr>
+        <w:t>“</w:t>
+      </w:r>
+      <w:r>
+        <w:rPr>
+          <w:rFonts w:ascii="Times New Roman" w:hAnsi="Times New Roman" w:cs="Times New Roman"/>
+        </w:rPr>
+        <w:t>, čia dar suskaičiuoja sumų sumas pabaigoje.</w:t>
+      </w:r>
+    </w:p>
+    <w:p>
+      <w:pPr>
+        <w:spacing w:after="0"/>
+        <w:jc w:val="both"/>
+        <w:rPr>
+          <w:rFonts w:ascii="Times New Roman" w:hAnsi="Times New Roman" w:cs="Times New Roman"/>
+        </w:rPr>
+      </w:pPr>
+      <w:r>
+        <w:rPr>
+          <w:rFonts w:ascii="Times New Roman" w:hAnsi="Times New Roman" w:cs="Times New Roman"/>
+        </w:rPr>
+        <w:t>„</w:t>
+      </w:r>
+      <w:r>
+        <w:rPr>
+          <w:rFonts w:ascii="Times New Roman" w:hAnsi="Times New Roman" w:cs="Times New Roman"/>
+        </w:rPr>
+        <w:t>Sausų dujų tankis normaliosioms sąlygomis qn (kg/m3)</w:t>
+      </w:r>
+      <w:r>
+        <w:rPr>
+          <w:rFonts w:ascii="Times New Roman" w:hAnsi="Times New Roman" w:cs="Times New Roman"/>
+        </w:rPr>
+        <w:t>“</w:t>
+      </w:r>
+      <w:r>
+        <w:rPr>
+          <w:rFonts w:ascii="Times New Roman" w:hAnsi="Times New Roman" w:cs="Times New Roman"/>
+        </w:rPr>
+        <w:t>, čia dar suskaičiuoja vidurkius ir vidurkių vidurkius</w:t>
+      </w:r>
+      <w:r>
+        <w:rPr>
+          <w:rFonts w:ascii="Times New Roman" w:hAnsi="Times New Roman" w:cs="Times New Roman"/>
+        </w:rPr>
+        <w:t xml:space="preserve"> pabaigoje. Vidurkių vidurkį perkelia į „H2O“ lapo </w:t>
+      </w:r>
+      <w:r>
+        <w:rPr>
+          <w:rFonts w:ascii="Times New Roman" w:hAnsi="Times New Roman" w:cs="Times New Roman"/>
+        </w:rPr>
+        <w:t>Sausų dujų tankis normaliosioms sąlygomis qn (kg/m3)</w:t>
+      </w:r>
+      <w:r>
+        <w:rPr>
+          <w:rFonts w:ascii="Times New Roman" w:hAnsi="Times New Roman" w:cs="Times New Roman"/>
+        </w:rPr>
+        <w:t>“ langelį.</w:t>
+      </w:r>
+    </w:p>
+    <w:p>
+      <w:pPr>
+        <w:spacing w:after="0"/>
+        <w:jc w:val="both"/>
+        <w:rPr>
+          <w:rFonts w:ascii="Times New Roman" w:hAnsi="Times New Roman" w:cs="Times New Roman"/>
+        </w:rPr>
+      </w:pPr>
+    </w:p>
+    <w:p>
+      <w:pPr>
+        <w:spacing w:after="0"/>
+        <w:jc w:val="both"/>
+        <w:rPr>
+          <w:rFonts w:ascii="Times New Roman" w:hAnsi="Times New Roman" w:cs="Times New Roman"/>
+        </w:rPr>
+      </w:pPr>
+      <w:r>
+        <w:rPr>
+          <w:rFonts w:ascii="Times New Roman" w:hAnsi="Times New Roman" w:cs="Times New Roman"/>
+        </w:rPr>
+        <w:t>1</w:t>
+      </w:r>
+      <w:r>
+        <w:rPr>
+          <w:rFonts w:ascii="Times New Roman" w:hAnsi="Times New Roman" w:cs="Times New Roman"/>
+        </w:rPr>
+        <w:t>1</w:t>
+      </w:r>
+      <w:r>
+        <w:rPr>
+          <w:rFonts w:ascii="Times New Roman" w:hAnsi="Times New Roman" w:cs="Times New Roman"/>
+        </w:rPr>
+        <w:t xml:space="preserve">. </w:t>
+      </w:r>
+      <w:r>
+        <w:rPr>
+          <w:rFonts w:ascii="Times New Roman" w:hAnsi="Times New Roman" w:cs="Times New Roman"/>
+        </w:rPr>
+        <w:t>H2OSK</w:t>
+      </w:r>
+      <w:r>
+        <w:rPr>
+          <w:rFonts w:ascii="Times New Roman" w:hAnsi="Times New Roman" w:cs="Times New Roman"/>
+        </w:rPr>
+        <w:t>2</w:t>
+      </w:r>
+      <w:r>
+        <w:rPr>
+          <w:rFonts w:ascii="Times New Roman" w:hAnsi="Times New Roman" w:cs="Times New Roman"/>
+        </w:rPr>
+        <w:t>Funkcija.py</w:t>
+      </w:r>
+      <w:r>
+        <w:rPr>
+          <w:rFonts w:ascii="Times New Roman" w:hAnsi="Times New Roman" w:cs="Times New Roman"/>
+        </w:rPr>
+        <w:t xml:space="preserve"> suskaičiuoja vie</w:t>
+      </w:r>
+      <w:r>
+        <w:rPr>
+          <w:rFonts w:ascii="Times New Roman" w:hAnsi="Times New Roman" w:cs="Times New Roman"/>
+        </w:rPr>
+        <w:t>nintelę likusią reikšmę lape „H2O“ „</w:t>
+      </w:r>
+      <w:r>
+        <w:rPr>
+          <w:rFonts w:ascii="Times New Roman" w:hAnsi="Times New Roman" w:cs="Times New Roman"/>
+        </w:rPr>
+        <w:t>Drėgmės kiekis X (%) (izokinetinei sistemai)</w:t>
+      </w:r>
+      <w:r>
+        <w:rPr>
+          <w:rFonts w:ascii="Times New Roman" w:hAnsi="Times New Roman" w:cs="Times New Roman"/>
+        </w:rPr>
+        <w:t>“.</w:t>
+      </w:r>
+    </w:p>
+    <w:p>
+      <w:pPr>
+        <w:spacing w:after="0"/>
+        <w:jc w:val="both"/>
+        <w:rPr>
+          <w:rFonts w:ascii="Times New Roman" w:hAnsi="Times New Roman" w:cs="Times New Roman"/>
+        </w:rPr>
+      </w:pPr>
+    </w:p>
+    <w:p>
+      <w:pPr>
+        <w:spacing w:after="0"/>
+        <w:jc w:val="both"/>
+        <w:rPr>
+          <w:rFonts w:ascii="Times New Roman" w:hAnsi="Times New Roman" w:cs="Times New Roman"/>
+        </w:rPr>
+      </w:pPr>
+      <w:r>
+        <w:rPr>
+          <w:rFonts w:ascii="Times New Roman" w:hAnsi="Times New Roman" w:cs="Times New Roman"/>
+        </w:rPr>
+        <w:t>12. GreitisSK1Funkcija.py</w:t>
+      </w:r>
+    </w:p>
+    <w:p>
+      <w:pPr>
+        <w:spacing w:after="0"/>
+        <w:jc w:val="both"/>
+        <w:rPr>
+          <w:rFonts w:ascii="Times New Roman" w:hAnsi="Times New Roman" w:cs="Times New Roman"/>
+        </w:rPr>
+      </w:pPr>
+    </w:p>
+    <w:p>
+      <w:pPr>
+        <w:spacing w:after="0"/>
+        <w:jc w:val="both"/>
+        <w:rPr>
+          <w:rFonts w:ascii="Times New Roman" w:hAnsi="Times New Roman" w:cs="Times New Roman"/>
+        </w:rPr>
+      </w:pPr>
+      <w:r>
+        <w:rPr>
+          <w:rFonts w:ascii="Times New Roman" w:hAnsi="Times New Roman" w:cs="Times New Roman"/>
+        </w:rPr>
+        <w:t>1</w:t>
+      </w:r>
+      <w:r>
+        <w:rPr>
+          <w:rFonts w:ascii="Times New Roman" w:hAnsi="Times New Roman" w:cs="Times New Roman"/>
+        </w:rPr>
+        <w:t>3</w:t>
+      </w:r>
+      <w:r>
+        <w:rPr>
+          <w:rFonts w:ascii="Times New Roman" w:hAnsi="Times New Roman" w:cs="Times New Roman"/>
+        </w:rPr>
+        <w:t>.</w:t>
+      </w:r>
+      <w:r>
+        <w:rPr>
+          <w:rFonts w:ascii="Times New Roman" w:hAnsi="Times New Roman" w:cs="Times New Roman"/>
+        </w:rPr>
+        <w:t xml:space="preserve"> </w:t>
+      </w:r>
+      <w:r>
+        <w:rPr>
+          <w:rFonts w:ascii="Times New Roman" w:hAnsi="Times New Roman" w:cs="Times New Roman"/>
+        </w:rPr>
         <w:t>GreitisSPFunkcija.py pagal SVP „Rezultatai.xlsx“ lape „Greitis“ nuspalvoja lentelę, surašo eilutėse esančius pavadinimus, nubraižo rėmelius.</w:t>
       </w:r>
     </w:p>
@@ -1002,7 +1443,13 @@
         <w:rPr>
           <w:rFonts w:ascii="Times New Roman" w:hAnsi="Times New Roman" w:cs="Times New Roman"/>
         </w:rPr>
-        <w:t>12</w:t>
+        <w:t>1</w:t>
+      </w:r>
+      <w:r>
+        <w:rPr>
+          <w:rFonts w:ascii="Times New Roman" w:hAnsi="Times New Roman" w:cs="Times New Roman"/>
+        </w:rPr>
+        <w:t>4</w:t>
       </w:r>
       <w:r>
         <w:rPr>
@@ -1062,7 +1509,7 @@
         <w:rPr>
           <w:rFonts w:ascii="Times New Roman" w:hAnsi="Times New Roman" w:cs="Times New Roman"/>
         </w:rPr>
-        <w:t>3</w:t>
+        <w:t>5</w:t>
       </w:r>
       <w:r>
         <w:rPr>
@@ -1116,7 +1563,7 @@
         <w:rPr>
           <w:rFonts w:ascii="Times New Roman" w:hAnsi="Times New Roman" w:cs="Times New Roman"/>
         </w:rPr>
-        <w:t>4</w:t>
+        <w:t>6</w:t>
       </w:r>
       <w:r>
         <w:rPr>
@@ -1146,7 +1593,14 @@
         <w:rPr>
           <w:rFonts w:ascii="Times New Roman" w:hAnsi="Times New Roman" w:cs="Times New Roman"/>
         </w:rPr>
-        <w:t xml:space="preserve"> AerodinamikaSP2Funkcija.py nubraižo lentelę, nuspalvoja, padaro įrašus po lentele. AerodinamikaSP1Funkcija.py padaro reikiamą skaičių lentelių kopijų pagal MatavimoVieta.py, sukuria ir padaro įrašus paskutiniuose lentelių prieduose.</w:t>
+        <w:t xml:space="preserve"> AerodinamikaSP2Funkcija.py nubraižo lentelę, nuspalvoja, padaro įrašus po lentele. </w:t>
+      </w:r>
+      <w:r>
+        <w:rPr>
+          <w:rFonts w:ascii="Times New Roman" w:hAnsi="Times New Roman" w:cs="Times New Roman"/>
+        </w:rPr>
+        <w:lastRenderedPageBreak/>
+        <w:t>AerodinamikaSP1Funkcija.py padaro reikiamą skaičių lentelių kopijų pagal MatavimoVieta.py, sukuria ir padaro įrašus paskutiniuose lentelių prieduose.</w:t>
       </w:r>
     </w:p>
     <w:p>
@@ -1176,7 +1630,7 @@
         <w:rPr>
           <w:rFonts w:ascii="Times New Roman" w:hAnsi="Times New Roman" w:cs="Times New Roman"/>
         </w:rPr>
-        <w:t>5</w:t>
+        <w:t>7</w:t>
       </w:r>
       <w:r>
         <w:rPr>
@@ -1230,7 +1684,7 @@
         <w:rPr>
           <w:rFonts w:ascii="Times New Roman" w:hAnsi="Times New Roman" w:cs="Times New Roman"/>
         </w:rPr>
-        <w:t>6</w:t>
+        <w:t>8</w:t>
       </w:r>
       <w:r>
         <w:rPr>
@@ -2490,26 +2944,6 @@
 </file>
 
 <file path=customXml/item1.xml><?xml version="1.0" encoding="utf-8"?>
-<p:properties xmlns:p="http://schemas.microsoft.com/office/2006/metadata/properties" xmlns:xsi="http://www.w3.org/2001/XMLSchema-instance" xmlns:pc="http://schemas.microsoft.com/office/infopath/2007/PartnerControls">
-  <documentManagement>
-    <lcf76f155ced4ddcb4097134ff3c332f xmlns="453e7e53-5eb2-45cf-b2ab-34c867e554b8">
-      <Terms xmlns="http://schemas.microsoft.com/office/infopath/2007/PartnerControls"/>
-    </lcf76f155ced4ddcb4097134ff3c332f>
-    <TaxCatchAll xmlns="aa0d983d-359a-438c-9953-3af1a8ac0831" xsi:nil="true"/>
-  </documentManagement>
-</p:properties>
-</file>
-
-<file path=customXml/item2.xml><?xml version="1.0" encoding="utf-8"?>
-<?mso-contentType ?>
-<FormTemplates xmlns="http://schemas.microsoft.com/sharepoint/v3/contenttype/forms">
-  <Display>DocumentLibraryForm</Display>
-  <Edit>DocumentLibraryForm</Edit>
-  <New>DocumentLibraryForm</New>
-</FormTemplates>
-</file>
-
-<file path=customXml/item3.xml><?xml version="1.0" encoding="utf-8"?>
 <ct:contentTypeSchema xmlns:ct="http://schemas.microsoft.com/office/2006/metadata/contentType" xmlns:ma="http://schemas.microsoft.com/office/2006/metadata/properties/metaAttributes" ct:_="" ma:_="" ma:contentTypeName="Dokumentas" ma:contentTypeID="0x010100BAB57CF81AE55C4698AAD22D302297F0" ma:contentTypeVersion="18" ma:contentTypeDescription="Kurkite naują dokumentą." ma:contentTypeScope="" ma:versionID="49ab401eb4052690d2a2629974c22fd6">
   <xsd:schema xmlns:xsd="http://www.w3.org/2001/XMLSchema" xmlns:xs="http://www.w3.org/2001/XMLSchema" xmlns:p="http://schemas.microsoft.com/office/2006/metadata/properties" xmlns:ns2="453e7e53-5eb2-45cf-b2ab-34c867e554b8" xmlns:ns3="aa0d983d-359a-438c-9953-3af1a8ac0831" targetNamespace="http://schemas.microsoft.com/office/2006/metadata/properties" ma:root="true" ma:fieldsID="ab9969d50e0b13c63bc5bd0499c928dc" ns2:_="" ns3:_="">
     <xsd:import namespace="453e7e53-5eb2-45cf-b2ab-34c867e554b8"/>
@@ -2764,26 +3198,27 @@
 </ct:contentTypeSchema>
 </file>
 
-<file path=customXml/itemProps1.xml><?xml version="1.0" encoding="utf-8"?>
-<ds:datastoreItem xmlns:ds="http://schemas.openxmlformats.org/officeDocument/2006/customXml" ds:itemID="{52F8D590-B38F-4B4A-8BDD-FD59D16A4DE7}">
-  <ds:schemaRefs>
-    <ds:schemaRef ds:uri="http://schemas.microsoft.com/office/2006/metadata/properties"/>
-    <ds:schemaRef ds:uri="http://schemas.microsoft.com/office/infopath/2007/PartnerControls"/>
-    <ds:schemaRef ds:uri="453e7e53-5eb2-45cf-b2ab-34c867e554b8"/>
-    <ds:schemaRef ds:uri="aa0d983d-359a-438c-9953-3af1a8ac0831"/>
-  </ds:schemaRefs>
-</ds:datastoreItem>
+<file path=customXml/item2.xml><?xml version="1.0" encoding="utf-8"?>
+<?mso-contentType ?>
+<FormTemplates xmlns="http://schemas.microsoft.com/sharepoint/v3/contenttype/forms">
+  <Display>DocumentLibraryForm</Display>
+  <Edit>DocumentLibraryForm</Edit>
+  <New>DocumentLibraryForm</New>
+</FormTemplates>
 </file>
 
-<file path=customXml/itemProps2.xml><?xml version="1.0" encoding="utf-8"?>
-<ds:datastoreItem xmlns:ds="http://schemas.openxmlformats.org/officeDocument/2006/customXml" ds:itemID="{47D7D20A-5C87-427E-8B8D-3343B9C6406D}">
-  <ds:schemaRefs>
-    <ds:schemaRef ds:uri="http://schemas.microsoft.com/sharepoint/v3/contenttype/forms"/>
-  </ds:schemaRefs>
-</ds:datastoreItem>
+<file path=customXml/item3.xml><?xml version="1.0" encoding="utf-8"?>
+<p:properties xmlns:p="http://schemas.microsoft.com/office/2006/metadata/properties" xmlns:xsi="http://www.w3.org/2001/XMLSchema-instance" xmlns:pc="http://schemas.microsoft.com/office/infopath/2007/PartnerControls">
+  <documentManagement>
+    <lcf76f155ced4ddcb4097134ff3c332f xmlns="453e7e53-5eb2-45cf-b2ab-34c867e554b8">
+      <Terms xmlns="http://schemas.microsoft.com/office/infopath/2007/PartnerControls"/>
+    </lcf76f155ced4ddcb4097134ff3c332f>
+    <TaxCatchAll xmlns="aa0d983d-359a-438c-9953-3af1a8ac0831" xsi:nil="true"/>
+  </documentManagement>
+</p:properties>
 </file>
 
-<file path=customXml/itemProps3.xml><?xml version="1.0" encoding="utf-8"?>
+<file path=customXml/itemProps1.xml><?xml version="1.0" encoding="utf-8"?>
 <ds:datastoreItem xmlns:ds="http://schemas.openxmlformats.org/officeDocument/2006/customXml" ds:itemID="{CC52CDA6-DE27-4DDF-B41E-8471831E0206}">
   <ds:schemaRefs>
     <ds:schemaRef ds:uri="http://schemas.microsoft.com/office/2006/metadata/contentType"/>
@@ -2800,4 +3235,23 @@
     <ds:schemaRef ds:uri="http://schemas.microsoft.com/internal/obd"/>
   </ds:schemaRefs>
 </ds:datastoreItem>
+</file>
+
+<file path=customXml/itemProps2.xml><?xml version="1.0" encoding="utf-8"?>
+<ds:datastoreItem xmlns:ds="http://schemas.openxmlformats.org/officeDocument/2006/customXml" ds:itemID="{47D7D20A-5C87-427E-8B8D-3343B9C6406D}">
+  <ds:schemaRefs>
+    <ds:schemaRef ds:uri="http://schemas.microsoft.com/sharepoint/v3/contenttype/forms"/>
+  </ds:schemaRefs>
+</ds:datastoreItem>
+</file>
+
+<file path=customXml/itemProps3.xml><?xml version="1.0" encoding="utf-8"?>
+<ds:datastoreItem xmlns:ds="http://schemas.openxmlformats.org/officeDocument/2006/customXml" ds:itemID="{52F8D590-B38F-4B4A-8BDD-FD59D16A4DE7}">
+  <ds:schemaRefs>
+    <ds:schemaRef ds:uri="http://schemas.microsoft.com/office/2006/metadata/properties"/>
+    <ds:schemaRef ds:uri="http://schemas.microsoft.com/office/infopath/2007/PartnerControls"/>
+    <ds:schemaRef ds:uri="453e7e53-5eb2-45cf-b2ab-34c867e554b8"/>
+    <ds:schemaRef ds:uri="aa0d983d-359a-438c-9953-3af1a8ac0831"/>
+  </ds:schemaRefs>
+</ds:datastoreItem>
 </file>
</xml_diff>

<commit_message>
Suskaičiuota Aerodinamika iki izokinetiškumo
</commit_message>
<xml_diff>
--- a/AtmintinėFunkcijos.docx
+++ b/AtmintinėFunkcijos.docx
@@ -1305,103 +1305,380 @@
         <w:rPr>
           <w:rFonts w:ascii="Times New Roman" w:hAnsi="Times New Roman" w:cs="Times New Roman"/>
         </w:rPr>
+        <w:t>. H2OSK2Funkcija.py</w:t>
+      </w:r>
+      <w:r>
+        <w:rPr>
+          <w:rFonts w:ascii="Times New Roman" w:hAnsi="Times New Roman" w:cs="Times New Roman"/>
+        </w:rPr>
+        <w:t xml:space="preserve"> suskaičiuoja vie</w:t>
+      </w:r>
+      <w:r>
+        <w:rPr>
+          <w:rFonts w:ascii="Times New Roman" w:hAnsi="Times New Roman" w:cs="Times New Roman"/>
+        </w:rPr>
+        <w:t>nintelę likusią reikšmę lape „H2O“ „</w:t>
+      </w:r>
+      <w:r>
+        <w:rPr>
+          <w:rFonts w:ascii="Times New Roman" w:hAnsi="Times New Roman" w:cs="Times New Roman"/>
+        </w:rPr>
+        <w:t>Drėgmės kiekis X (%) (izokinetinei sistemai)</w:t>
+      </w:r>
+      <w:r>
+        <w:rPr>
+          <w:rFonts w:ascii="Times New Roman" w:hAnsi="Times New Roman" w:cs="Times New Roman"/>
+        </w:rPr>
+        <w:t>“.</w:t>
+      </w:r>
+    </w:p>
+    <w:p>
+      <w:pPr>
+        <w:spacing w:after="0"/>
+        <w:jc w:val="both"/>
+        <w:rPr>
+          <w:rFonts w:ascii="Times New Roman" w:hAnsi="Times New Roman" w:cs="Times New Roman"/>
+        </w:rPr>
+      </w:pPr>
+    </w:p>
+    <w:p>
+      <w:pPr>
+        <w:spacing w:after="0"/>
+        <w:jc w:val="both"/>
+        <w:rPr>
+          <w:rFonts w:ascii="Times New Roman" w:hAnsi="Times New Roman" w:cs="Times New Roman"/>
+        </w:rPr>
+      </w:pPr>
+      <w:r>
+        <w:rPr>
+          <w:rFonts w:ascii="Times New Roman" w:hAnsi="Times New Roman" w:cs="Times New Roman"/>
+        </w:rPr>
+        <w:t>12. H2OSK3Funkcija.py</w:t>
+      </w:r>
+      <w:r>
+        <w:rPr>
+          <w:rFonts w:ascii="Times New Roman" w:hAnsi="Times New Roman" w:cs="Times New Roman"/>
+        </w:rPr>
+        <w:t xml:space="preserve"> </w:t>
+      </w:r>
+      <w:r>
+        <w:rPr>
+          <w:rFonts w:ascii="Times New Roman" w:hAnsi="Times New Roman" w:cs="Times New Roman"/>
+        </w:rPr>
+        <w:t xml:space="preserve">iš lapo „H2O“ į lapą „Aerodinamika“ perkelia </w:t>
+      </w:r>
+      <w:r>
+        <w:rPr>
+          <w:rFonts w:ascii="Times New Roman" w:hAnsi="Times New Roman" w:cs="Times New Roman"/>
+        </w:rPr>
+        <w:t>„</w:t>
+      </w:r>
+      <w:r>
+        <w:rPr>
+          <w:rFonts w:ascii="Times New Roman" w:hAnsi="Times New Roman" w:cs="Times New Roman"/>
+        </w:rPr>
+        <w:t>Drėgmės kiekis X (%)</w:t>
+      </w:r>
+      <w:r>
+        <w:rPr>
+          <w:rFonts w:ascii="Times New Roman" w:hAnsi="Times New Roman" w:cs="Times New Roman"/>
+        </w:rPr>
+        <w:t xml:space="preserve">“ reikšmes. Iš lapo „H2O“ į lapą „Greitis“ perkelia </w:t>
+      </w:r>
+      <w:r>
+        <w:rPr>
+          <w:rFonts w:ascii="Times New Roman" w:hAnsi="Times New Roman" w:cs="Times New Roman"/>
+        </w:rPr>
+        <w:t>„</w:t>
+      </w:r>
+      <w:r>
+        <w:rPr>
+          <w:rFonts w:ascii="Times New Roman" w:hAnsi="Times New Roman" w:cs="Times New Roman"/>
+        </w:rPr>
+        <w:t>Vandens kondensato masė m H2O, kg</w:t>
+      </w:r>
+      <w:r>
+        <w:rPr>
+          <w:rFonts w:ascii="Times New Roman" w:hAnsi="Times New Roman" w:cs="Times New Roman"/>
+        </w:rPr>
+        <w:t xml:space="preserve">“ ir </w:t>
+      </w:r>
+      <w:r>
+        <w:rPr>
+          <w:rFonts w:ascii="Times New Roman" w:hAnsi="Times New Roman" w:cs="Times New Roman"/>
+        </w:rPr>
+        <w:t>„</w:t>
+      </w:r>
+      <w:r>
+        <w:rPr>
+          <w:rFonts w:ascii="Times New Roman" w:hAnsi="Times New Roman" w:cs="Times New Roman"/>
+        </w:rPr>
+        <w:t>Prasiurbtas dujų tūris normaliosiomis sąlygomis Vmn, Nm3</w:t>
+      </w:r>
+      <w:r>
+        <w:rPr>
+          <w:rFonts w:ascii="Times New Roman" w:hAnsi="Times New Roman" w:cs="Times New Roman"/>
+        </w:rPr>
+        <w:t xml:space="preserve">“ reikšmes. Iš lapo „Aerodinamika“ į lapą „Greitis“ perkelia </w:t>
+      </w:r>
+      <w:r>
+        <w:rPr>
+          <w:rFonts w:ascii="Times New Roman" w:hAnsi="Times New Roman" w:cs="Times New Roman"/>
+        </w:rPr>
+        <w:t>„</w:t>
+      </w:r>
+      <w:r>
+        <w:rPr>
+          <w:rFonts w:ascii="Times New Roman" w:hAnsi="Times New Roman" w:cs="Times New Roman"/>
+        </w:rPr>
+        <w:t>Sausų dujų tankis normaliosioms sąlygomis qn, (kg/m3)</w:t>
+      </w:r>
+      <w:r>
+        <w:rPr>
+          <w:rFonts w:ascii="Times New Roman" w:hAnsi="Times New Roman" w:cs="Times New Roman"/>
+        </w:rPr>
+        <w:t>“ reikšmę.</w:t>
+      </w:r>
+    </w:p>
+    <w:p>
+      <w:pPr>
+        <w:spacing w:after="0"/>
+        <w:jc w:val="both"/>
+        <w:rPr>
+          <w:rFonts w:ascii="Times New Roman" w:hAnsi="Times New Roman" w:cs="Times New Roman"/>
+        </w:rPr>
+      </w:pPr>
+    </w:p>
+    <w:p>
+      <w:pPr>
+        <w:spacing w:after="0"/>
+        <w:jc w:val="both"/>
+        <w:rPr>
+          <w:rFonts w:ascii="Times New Roman" w:hAnsi="Times New Roman" w:cs="Times New Roman"/>
+        </w:rPr>
+      </w:pPr>
+      <w:r>
+        <w:rPr>
+          <w:rFonts w:ascii="Times New Roman" w:hAnsi="Times New Roman" w:cs="Times New Roman"/>
+        </w:rPr>
+        <w:t>13. AerodinamikaSK2Funkcija.py</w:t>
+      </w:r>
+    </w:p>
+    <w:p>
+      <w:pPr>
+        <w:spacing w:after="0"/>
+        <w:jc w:val="both"/>
+        <w:rPr>
+          <w:rFonts w:ascii="Times New Roman" w:hAnsi="Times New Roman" w:cs="Times New Roman"/>
+        </w:rPr>
+      </w:pPr>
+    </w:p>
+    <w:p>
+      <w:pPr>
+        <w:spacing w:after="0"/>
+        <w:jc w:val="both"/>
+        <w:rPr>
+          <w:rFonts w:ascii="Times New Roman" w:hAnsi="Times New Roman" w:cs="Times New Roman"/>
+        </w:rPr>
+      </w:pPr>
+      <w:r>
+        <w:rPr>
+          <w:rFonts w:ascii="Times New Roman" w:hAnsi="Times New Roman" w:cs="Times New Roman"/>
+        </w:rPr>
+        <w:t>12. GreitisSK1Funkcija.py</w:t>
+      </w:r>
+    </w:p>
+    <w:p>
+      <w:pPr>
+        <w:spacing w:after="0"/>
+        <w:jc w:val="both"/>
+        <w:rPr>
+          <w:rFonts w:ascii="Times New Roman" w:hAnsi="Times New Roman" w:cs="Times New Roman"/>
+        </w:rPr>
+      </w:pPr>
+    </w:p>
+    <w:p>
+      <w:pPr>
+        <w:spacing w:after="0"/>
+        <w:jc w:val="both"/>
+        <w:rPr>
+          <w:rFonts w:ascii="Times New Roman" w:hAnsi="Times New Roman" w:cs="Times New Roman"/>
+        </w:rPr>
+      </w:pPr>
+      <w:r>
+        <w:rPr>
+          <w:rFonts w:ascii="Times New Roman" w:hAnsi="Times New Roman" w:cs="Times New Roman"/>
+        </w:rPr>
+        <w:t>1</w:t>
+      </w:r>
+      <w:r>
+        <w:rPr>
+          <w:rFonts w:ascii="Times New Roman" w:hAnsi="Times New Roman" w:cs="Times New Roman"/>
+        </w:rPr>
+        <w:t>3</w:t>
+      </w:r>
+      <w:r>
+        <w:rPr>
+          <w:rFonts w:ascii="Times New Roman" w:hAnsi="Times New Roman" w:cs="Times New Roman"/>
+        </w:rPr>
+        <w:t>.</w:t>
+      </w:r>
+      <w:r>
+        <w:rPr>
+          <w:rFonts w:ascii="Times New Roman" w:hAnsi="Times New Roman" w:cs="Times New Roman"/>
+        </w:rPr>
+        <w:t xml:space="preserve"> </w:t>
+      </w:r>
+      <w:r>
+        <w:rPr>
+          <w:rFonts w:ascii="Times New Roman" w:hAnsi="Times New Roman" w:cs="Times New Roman"/>
+        </w:rPr>
+        <w:t>GreitisSPFunkcija.py pagal SVP „Rezultatai.xlsx“ lape „Greitis“ nuspalvoja lentelę, surašo eilutėse esančius pavadinimus, nubraižo rėmelius.</w:t>
+      </w:r>
+    </w:p>
+    <w:p>
+      <w:pPr>
+        <w:spacing w:after="0"/>
+        <w:jc w:val="both"/>
+        <w:rPr>
+          <w:rFonts w:ascii="Times New Roman" w:hAnsi="Times New Roman" w:cs="Times New Roman"/>
+        </w:rPr>
+      </w:pPr>
+    </w:p>
+    <w:p>
+      <w:pPr>
+        <w:spacing w:after="0"/>
+        <w:jc w:val="both"/>
+        <w:rPr>
+          <w:rFonts w:ascii="Times New Roman" w:hAnsi="Times New Roman" w:cs="Times New Roman"/>
+        </w:rPr>
+      </w:pPr>
+      <w:r>
+        <w:rPr>
+          <w:rFonts w:ascii="Times New Roman" w:hAnsi="Times New Roman" w:cs="Times New Roman"/>
+        </w:rPr>
+        <w:t>1</w:t>
+      </w:r>
+      <w:r>
+        <w:rPr>
+          <w:rFonts w:ascii="Times New Roman" w:hAnsi="Times New Roman" w:cs="Times New Roman"/>
+        </w:rPr>
+        <w:t>4</w:t>
+      </w:r>
+      <w:r>
+        <w:rPr>
+          <w:rFonts w:ascii="Times New Roman" w:hAnsi="Times New Roman" w:cs="Times New Roman"/>
+        </w:rPr>
         <w:t xml:space="preserve">. </w:t>
       </w:r>
       <w:r>
         <w:rPr>
           <w:rFonts w:ascii="Times New Roman" w:hAnsi="Times New Roman" w:cs="Times New Roman"/>
         </w:rPr>
-        <w:t>H2OSK</w:t>
-      </w:r>
-      <w:r>
-        <w:rPr>
-          <w:rFonts w:ascii="Times New Roman" w:hAnsi="Times New Roman" w:cs="Times New Roman"/>
-        </w:rPr>
-        <w:t>2</w:t>
-      </w:r>
-      <w:r>
-        <w:rPr>
-          <w:rFonts w:ascii="Times New Roman" w:hAnsi="Times New Roman" w:cs="Times New Roman"/>
-        </w:rPr>
-        <w:t>Funkcija.py</w:t>
-      </w:r>
-      <w:r>
-        <w:rPr>
-          <w:rFonts w:ascii="Times New Roman" w:hAnsi="Times New Roman" w:cs="Times New Roman"/>
-        </w:rPr>
-        <w:t xml:space="preserve"> suskaičiuoja vie</w:t>
-      </w:r>
-      <w:r>
-        <w:rPr>
-          <w:rFonts w:ascii="Times New Roman" w:hAnsi="Times New Roman" w:cs="Times New Roman"/>
-        </w:rPr>
-        <w:t>nintelę likusią reikšmę lape „H2O“ „</w:t>
-      </w:r>
-      <w:r>
-        <w:rPr>
-          <w:rFonts w:ascii="Times New Roman" w:hAnsi="Times New Roman" w:cs="Times New Roman"/>
-        </w:rPr>
-        <w:t>Drėgmės kiekis X (%) (izokinetinei sistemai)</w:t>
-      </w:r>
-      <w:r>
-        <w:rPr>
-          <w:rFonts w:ascii="Times New Roman" w:hAnsi="Times New Roman" w:cs="Times New Roman"/>
-        </w:rPr>
-        <w:t>“.</w:t>
-      </w:r>
-    </w:p>
-    <w:p>
-      <w:pPr>
-        <w:spacing w:after="0"/>
-        <w:jc w:val="both"/>
-        <w:rPr>
-          <w:rFonts w:ascii="Times New Roman" w:hAnsi="Times New Roman" w:cs="Times New Roman"/>
-        </w:rPr>
-      </w:pPr>
-    </w:p>
-    <w:p>
-      <w:pPr>
-        <w:spacing w:after="0"/>
-        <w:jc w:val="both"/>
-        <w:rPr>
-          <w:rFonts w:ascii="Times New Roman" w:hAnsi="Times New Roman" w:cs="Times New Roman"/>
-        </w:rPr>
-      </w:pPr>
-      <w:r>
-        <w:rPr>
-          <w:rFonts w:ascii="Times New Roman" w:hAnsi="Times New Roman" w:cs="Times New Roman"/>
-        </w:rPr>
-        <w:t>12. GreitisSK1Funkcija.py</w:t>
-      </w:r>
-    </w:p>
-    <w:p>
-      <w:pPr>
-        <w:spacing w:after="0"/>
-        <w:jc w:val="both"/>
-        <w:rPr>
-          <w:rFonts w:ascii="Times New Roman" w:hAnsi="Times New Roman" w:cs="Times New Roman"/>
-        </w:rPr>
-      </w:pPr>
-    </w:p>
-    <w:p>
-      <w:pPr>
-        <w:spacing w:after="0"/>
-        <w:jc w:val="both"/>
-        <w:rPr>
-          <w:rFonts w:ascii="Times New Roman" w:hAnsi="Times New Roman" w:cs="Times New Roman"/>
-        </w:rPr>
-      </w:pPr>
-      <w:r>
-        <w:rPr>
-          <w:rFonts w:ascii="Times New Roman" w:hAnsi="Times New Roman" w:cs="Times New Roman"/>
-        </w:rPr>
+        <w:t>H2O</w:t>
+      </w:r>
+      <w:r>
+        <w:rPr>
+          <w:rFonts w:ascii="Times New Roman" w:hAnsi="Times New Roman" w:cs="Times New Roman"/>
+        </w:rPr>
+        <w:t>SPFunkcija.py pagal SVP „Rezultatai.xlsx“ lape „</w:t>
+      </w:r>
+      <w:r>
+        <w:rPr>
+          <w:rFonts w:ascii="Times New Roman" w:hAnsi="Times New Roman" w:cs="Times New Roman"/>
+        </w:rPr>
+        <w:t>H2O</w:t>
+      </w:r>
+      <w:r>
+        <w:rPr>
+          <w:rFonts w:ascii="Times New Roman" w:hAnsi="Times New Roman" w:cs="Times New Roman"/>
+        </w:rPr>
+        <w:t>“ nuspalvoja lentelę, surašo eilutėse esančius pavadinimus, nubraižo rėmelius.</w:t>
+      </w:r>
+    </w:p>
+    <w:p>
+      <w:pPr>
+        <w:spacing w:after="0"/>
+        <w:jc w:val="both"/>
+        <w:rPr>
+          <w:rFonts w:ascii="Times New Roman" w:hAnsi="Times New Roman" w:cs="Times New Roman"/>
+        </w:rPr>
+      </w:pPr>
+    </w:p>
+    <w:p>
+      <w:pPr>
+        <w:spacing w:after="0"/>
+        <w:jc w:val="both"/>
+        <w:rPr>
+          <w:rFonts w:ascii="Times New Roman" w:hAnsi="Times New Roman" w:cs="Times New Roman"/>
+        </w:rPr>
+      </w:pPr>
+      <w:r>
+        <w:rPr>
+          <w:rFonts w:ascii="Times New Roman" w:hAnsi="Times New Roman" w:cs="Times New Roman"/>
+        </w:rPr>
+        <w:lastRenderedPageBreak/>
         <w:t>1</w:t>
       </w:r>
       <w:r>
         <w:rPr>
           <w:rFonts w:ascii="Times New Roman" w:hAnsi="Times New Roman" w:cs="Times New Roman"/>
         </w:rPr>
-        <w:t>3</w:t>
+        <w:t>5</w:t>
+      </w:r>
+      <w:r>
+        <w:rPr>
+          <w:rFonts w:ascii="Times New Roman" w:hAnsi="Times New Roman" w:cs="Times New Roman"/>
+        </w:rPr>
+        <w:t>. PaemimasSP1Funkcija.py savyje turi PaemimasSP2Funkcija.py.</w:t>
+      </w:r>
+      <w:r>
+        <w:rPr>
+          <w:rFonts w:ascii="Times New Roman" w:hAnsi="Times New Roman" w:cs="Times New Roman"/>
+        </w:rPr>
+        <w:t xml:space="preserve"> PaėmimasSP2Funkcija.py nubraižo lentelę</w:t>
+      </w:r>
+      <w:r>
+        <w:rPr>
+          <w:rFonts w:ascii="Times New Roman" w:hAnsi="Times New Roman" w:cs="Times New Roman"/>
+        </w:rPr>
+        <w:t>, nuspalvoja, padaro įrašus po lentele. PaemimasSP1Funkcija.py padaro reikiamą skaičių lentelių kopijų pagal MatavimoVieta.py</w:t>
+      </w:r>
+      <w:r>
+        <w:rPr>
+          <w:rFonts w:ascii="Times New Roman" w:hAnsi="Times New Roman" w:cs="Times New Roman"/>
+        </w:rPr>
+        <w:t>, sukuria ir padaro įrašus paskutiniuose lentelių prieduose.</w:t>
+      </w:r>
+    </w:p>
+    <w:p>
+      <w:pPr>
+        <w:spacing w:after="0"/>
+        <w:jc w:val="both"/>
+        <w:rPr>
+          <w:rFonts w:ascii="Times New Roman" w:hAnsi="Times New Roman" w:cs="Times New Roman"/>
+        </w:rPr>
+      </w:pPr>
+    </w:p>
+    <w:p>
+      <w:pPr>
+        <w:spacing w:after="0"/>
+        <w:jc w:val="both"/>
+        <w:rPr>
+          <w:rFonts w:ascii="Times New Roman" w:hAnsi="Times New Roman" w:cs="Times New Roman"/>
+        </w:rPr>
+      </w:pPr>
+      <w:r>
+        <w:rPr>
+          <w:rFonts w:ascii="Times New Roman" w:hAnsi="Times New Roman" w:cs="Times New Roman"/>
+        </w:rPr>
+        <w:t>1</w:t>
+      </w:r>
+      <w:r>
+        <w:rPr>
+          <w:rFonts w:ascii="Times New Roman" w:hAnsi="Times New Roman" w:cs="Times New Roman"/>
+        </w:rPr>
+        <w:t>6</w:t>
       </w:r>
       <w:r>
         <w:rPr>
@@ -1419,168 +1696,6 @@
         <w:rPr>
           <w:rFonts w:ascii="Times New Roman" w:hAnsi="Times New Roman" w:cs="Times New Roman"/>
         </w:rPr>
-        <w:t>GreitisSPFunkcija.py pagal SVP „Rezultatai.xlsx“ lape „Greitis“ nuspalvoja lentelę, surašo eilutėse esančius pavadinimus, nubraižo rėmelius.</w:t>
-      </w:r>
-    </w:p>
-    <w:p>
-      <w:pPr>
-        <w:spacing w:after="0"/>
-        <w:jc w:val="both"/>
-        <w:rPr>
-          <w:rFonts w:ascii="Times New Roman" w:hAnsi="Times New Roman" w:cs="Times New Roman"/>
-        </w:rPr>
-      </w:pPr>
-    </w:p>
-    <w:p>
-      <w:pPr>
-        <w:spacing w:after="0"/>
-        <w:jc w:val="both"/>
-        <w:rPr>
-          <w:rFonts w:ascii="Times New Roman" w:hAnsi="Times New Roman" w:cs="Times New Roman"/>
-        </w:rPr>
-      </w:pPr>
-      <w:r>
-        <w:rPr>
-          <w:rFonts w:ascii="Times New Roman" w:hAnsi="Times New Roman" w:cs="Times New Roman"/>
-        </w:rPr>
-        <w:t>1</w:t>
-      </w:r>
-      <w:r>
-        <w:rPr>
-          <w:rFonts w:ascii="Times New Roman" w:hAnsi="Times New Roman" w:cs="Times New Roman"/>
-        </w:rPr>
-        <w:t>4</w:t>
-      </w:r>
-      <w:r>
-        <w:rPr>
-          <w:rFonts w:ascii="Times New Roman" w:hAnsi="Times New Roman" w:cs="Times New Roman"/>
-        </w:rPr>
-        <w:t xml:space="preserve">. </w:t>
-      </w:r>
-      <w:r>
-        <w:rPr>
-          <w:rFonts w:ascii="Times New Roman" w:hAnsi="Times New Roman" w:cs="Times New Roman"/>
-        </w:rPr>
-        <w:t>H2O</w:t>
-      </w:r>
-      <w:r>
-        <w:rPr>
-          <w:rFonts w:ascii="Times New Roman" w:hAnsi="Times New Roman" w:cs="Times New Roman"/>
-        </w:rPr>
-        <w:t>SPFunkcija.py pagal SVP „Rezultatai.xlsx“ lape „</w:t>
-      </w:r>
-      <w:r>
-        <w:rPr>
-          <w:rFonts w:ascii="Times New Roman" w:hAnsi="Times New Roman" w:cs="Times New Roman"/>
-        </w:rPr>
-        <w:t>H2O</w:t>
-      </w:r>
-      <w:r>
-        <w:rPr>
-          <w:rFonts w:ascii="Times New Roman" w:hAnsi="Times New Roman" w:cs="Times New Roman"/>
-        </w:rPr>
-        <w:t>“ nuspalvoja lentelę, surašo eilutėse esančius pavadinimus, nubraižo rėmelius.</w:t>
-      </w:r>
-    </w:p>
-    <w:p>
-      <w:pPr>
-        <w:spacing w:after="0"/>
-        <w:jc w:val="both"/>
-        <w:rPr>
-          <w:rFonts w:ascii="Times New Roman" w:hAnsi="Times New Roman" w:cs="Times New Roman"/>
-        </w:rPr>
-      </w:pPr>
-    </w:p>
-    <w:p>
-      <w:pPr>
-        <w:spacing w:after="0"/>
-        <w:jc w:val="both"/>
-        <w:rPr>
-          <w:rFonts w:ascii="Times New Roman" w:hAnsi="Times New Roman" w:cs="Times New Roman"/>
-        </w:rPr>
-      </w:pPr>
-      <w:r>
-        <w:rPr>
-          <w:rFonts w:ascii="Times New Roman" w:hAnsi="Times New Roman" w:cs="Times New Roman"/>
-        </w:rPr>
-        <w:t>1</w:t>
-      </w:r>
-      <w:r>
-        <w:rPr>
-          <w:rFonts w:ascii="Times New Roman" w:hAnsi="Times New Roman" w:cs="Times New Roman"/>
-        </w:rPr>
-        <w:t>5</w:t>
-      </w:r>
-      <w:r>
-        <w:rPr>
-          <w:rFonts w:ascii="Times New Roman" w:hAnsi="Times New Roman" w:cs="Times New Roman"/>
-        </w:rPr>
-        <w:t>. PaemimasSP1Funkcija.py savyje turi PaemimasSP2Funkcija.py.</w:t>
-      </w:r>
-      <w:r>
-        <w:rPr>
-          <w:rFonts w:ascii="Times New Roman" w:hAnsi="Times New Roman" w:cs="Times New Roman"/>
-        </w:rPr>
-        <w:t xml:space="preserve"> PaėmimasSP2Funkcija.py nubraižo lentelę</w:t>
-      </w:r>
-      <w:r>
-        <w:rPr>
-          <w:rFonts w:ascii="Times New Roman" w:hAnsi="Times New Roman" w:cs="Times New Roman"/>
-        </w:rPr>
-        <w:t>, nuspalvoja, padaro įrašus po lentele. PaemimasSP1Funkcija.py padaro reikiamą skaičių lentelių kopijų pagal MatavimoVieta.py</w:t>
-      </w:r>
-      <w:r>
-        <w:rPr>
-          <w:rFonts w:ascii="Times New Roman" w:hAnsi="Times New Roman" w:cs="Times New Roman"/>
-        </w:rPr>
-        <w:t>, sukuria ir padaro įrašus paskutiniuose lentelių prieduose.</w:t>
-      </w:r>
-    </w:p>
-    <w:p>
-      <w:pPr>
-        <w:spacing w:after="0"/>
-        <w:jc w:val="both"/>
-        <w:rPr>
-          <w:rFonts w:ascii="Times New Roman" w:hAnsi="Times New Roman" w:cs="Times New Roman"/>
-        </w:rPr>
-      </w:pPr>
-    </w:p>
-    <w:p>
-      <w:pPr>
-        <w:spacing w:after="0"/>
-        <w:jc w:val="both"/>
-        <w:rPr>
-          <w:rFonts w:ascii="Times New Roman" w:hAnsi="Times New Roman" w:cs="Times New Roman"/>
-        </w:rPr>
-      </w:pPr>
-      <w:r>
-        <w:rPr>
-          <w:rFonts w:ascii="Times New Roman" w:hAnsi="Times New Roman" w:cs="Times New Roman"/>
-        </w:rPr>
-        <w:t>1</w:t>
-      </w:r>
-      <w:r>
-        <w:rPr>
-          <w:rFonts w:ascii="Times New Roman" w:hAnsi="Times New Roman" w:cs="Times New Roman"/>
-        </w:rPr>
-        <w:t>6</w:t>
-      </w:r>
-      <w:r>
-        <w:rPr>
-          <w:rFonts w:ascii="Times New Roman" w:hAnsi="Times New Roman" w:cs="Times New Roman"/>
-        </w:rPr>
-        <w:t>.</w:t>
-      </w:r>
-      <w:r>
-        <w:rPr>
-          <w:rFonts w:ascii="Times New Roman" w:hAnsi="Times New Roman" w:cs="Times New Roman"/>
-        </w:rPr>
-        <w:t xml:space="preserve"> </w:t>
-      </w:r>
-      <w:r>
-        <w:rPr>
-          <w:rFonts w:ascii="Times New Roman" w:hAnsi="Times New Roman" w:cs="Times New Roman"/>
-        </w:rPr>
         <w:t>AerodinamikaSP1</w:t>
       </w:r>
       <w:r>
@@ -1593,14 +1708,7 @@
         <w:rPr>
           <w:rFonts w:ascii="Times New Roman" w:hAnsi="Times New Roman" w:cs="Times New Roman"/>
         </w:rPr>
-        <w:t xml:space="preserve"> AerodinamikaSP2Funkcija.py nubraižo lentelę, nuspalvoja, padaro įrašus po lentele. </w:t>
-      </w:r>
-      <w:r>
-        <w:rPr>
-          <w:rFonts w:ascii="Times New Roman" w:hAnsi="Times New Roman" w:cs="Times New Roman"/>
-        </w:rPr>
-        <w:lastRenderedPageBreak/>
-        <w:t>AerodinamikaSP1Funkcija.py padaro reikiamą skaičių lentelių kopijų pagal MatavimoVieta.py, sukuria ir padaro įrašus paskutiniuose lentelių prieduose.</w:t>
+        <w:t xml:space="preserve"> AerodinamikaSP2Funkcija.py nubraižo lentelę, nuspalvoja, padaro įrašus po lentele. AerodinamikaSP1Funkcija.py padaro reikiamą skaičių lentelių kopijų pagal MatavimoVieta.py, sukuria ir padaro įrašus paskutiniuose lentelių prieduose.</w:t>
       </w:r>
     </w:p>
     <w:p>
@@ -2944,6 +3052,26 @@
 </file>
 
 <file path=customXml/item1.xml><?xml version="1.0" encoding="utf-8"?>
+<p:properties xmlns:p="http://schemas.microsoft.com/office/2006/metadata/properties" xmlns:xsi="http://www.w3.org/2001/XMLSchema-instance" xmlns:pc="http://schemas.microsoft.com/office/infopath/2007/PartnerControls">
+  <documentManagement>
+    <lcf76f155ced4ddcb4097134ff3c332f xmlns="453e7e53-5eb2-45cf-b2ab-34c867e554b8">
+      <Terms xmlns="http://schemas.microsoft.com/office/infopath/2007/PartnerControls"/>
+    </lcf76f155ced4ddcb4097134ff3c332f>
+    <TaxCatchAll xmlns="aa0d983d-359a-438c-9953-3af1a8ac0831" xsi:nil="true"/>
+  </documentManagement>
+</p:properties>
+</file>
+
+<file path=customXml/item2.xml><?xml version="1.0" encoding="utf-8"?>
+<?mso-contentType ?>
+<FormTemplates xmlns="http://schemas.microsoft.com/sharepoint/v3/contenttype/forms">
+  <Display>DocumentLibraryForm</Display>
+  <Edit>DocumentLibraryForm</Edit>
+  <New>DocumentLibraryForm</New>
+</FormTemplates>
+</file>
+
+<file path=customXml/item3.xml><?xml version="1.0" encoding="utf-8"?>
 <ct:contentTypeSchema xmlns:ct="http://schemas.microsoft.com/office/2006/metadata/contentType" xmlns:ma="http://schemas.microsoft.com/office/2006/metadata/properties/metaAttributes" ct:_="" ma:_="" ma:contentTypeName="Dokumentas" ma:contentTypeID="0x010100BAB57CF81AE55C4698AAD22D302297F0" ma:contentTypeVersion="18" ma:contentTypeDescription="Kurkite naują dokumentą." ma:contentTypeScope="" ma:versionID="49ab401eb4052690d2a2629974c22fd6">
   <xsd:schema xmlns:xsd="http://www.w3.org/2001/XMLSchema" xmlns:xs="http://www.w3.org/2001/XMLSchema" xmlns:p="http://schemas.microsoft.com/office/2006/metadata/properties" xmlns:ns2="453e7e53-5eb2-45cf-b2ab-34c867e554b8" xmlns:ns3="aa0d983d-359a-438c-9953-3af1a8ac0831" targetNamespace="http://schemas.microsoft.com/office/2006/metadata/properties" ma:root="true" ma:fieldsID="ab9969d50e0b13c63bc5bd0499c928dc" ns2:_="" ns3:_="">
     <xsd:import namespace="453e7e53-5eb2-45cf-b2ab-34c867e554b8"/>
@@ -3198,27 +3326,26 @@
 </ct:contentTypeSchema>
 </file>
 
-<file path=customXml/item2.xml><?xml version="1.0" encoding="utf-8"?>
-<?mso-contentType ?>
-<FormTemplates xmlns="http://schemas.microsoft.com/sharepoint/v3/contenttype/forms">
-  <Display>DocumentLibraryForm</Display>
-  <Edit>DocumentLibraryForm</Edit>
-  <New>DocumentLibraryForm</New>
-</FormTemplates>
+<file path=customXml/itemProps1.xml><?xml version="1.0" encoding="utf-8"?>
+<ds:datastoreItem xmlns:ds="http://schemas.openxmlformats.org/officeDocument/2006/customXml" ds:itemID="{52F8D590-B38F-4B4A-8BDD-FD59D16A4DE7}">
+  <ds:schemaRefs>
+    <ds:schemaRef ds:uri="http://schemas.microsoft.com/office/2006/metadata/properties"/>
+    <ds:schemaRef ds:uri="http://schemas.microsoft.com/office/infopath/2007/PartnerControls"/>
+    <ds:schemaRef ds:uri="453e7e53-5eb2-45cf-b2ab-34c867e554b8"/>
+    <ds:schemaRef ds:uri="aa0d983d-359a-438c-9953-3af1a8ac0831"/>
+  </ds:schemaRefs>
+</ds:datastoreItem>
 </file>
 
-<file path=customXml/item3.xml><?xml version="1.0" encoding="utf-8"?>
-<p:properties xmlns:p="http://schemas.microsoft.com/office/2006/metadata/properties" xmlns:xsi="http://www.w3.org/2001/XMLSchema-instance" xmlns:pc="http://schemas.microsoft.com/office/infopath/2007/PartnerControls">
-  <documentManagement>
-    <lcf76f155ced4ddcb4097134ff3c332f xmlns="453e7e53-5eb2-45cf-b2ab-34c867e554b8">
-      <Terms xmlns="http://schemas.microsoft.com/office/infopath/2007/PartnerControls"/>
-    </lcf76f155ced4ddcb4097134ff3c332f>
-    <TaxCatchAll xmlns="aa0d983d-359a-438c-9953-3af1a8ac0831" xsi:nil="true"/>
-  </documentManagement>
-</p:properties>
+<file path=customXml/itemProps2.xml><?xml version="1.0" encoding="utf-8"?>
+<ds:datastoreItem xmlns:ds="http://schemas.openxmlformats.org/officeDocument/2006/customXml" ds:itemID="{47D7D20A-5C87-427E-8B8D-3343B9C6406D}">
+  <ds:schemaRefs>
+    <ds:schemaRef ds:uri="http://schemas.microsoft.com/sharepoint/v3/contenttype/forms"/>
+  </ds:schemaRefs>
+</ds:datastoreItem>
 </file>
 
-<file path=customXml/itemProps1.xml><?xml version="1.0" encoding="utf-8"?>
+<file path=customXml/itemProps3.xml><?xml version="1.0" encoding="utf-8"?>
 <ds:datastoreItem xmlns:ds="http://schemas.openxmlformats.org/officeDocument/2006/customXml" ds:itemID="{CC52CDA6-DE27-4DDF-B41E-8471831E0206}">
   <ds:schemaRefs>
     <ds:schemaRef ds:uri="http://schemas.microsoft.com/office/2006/metadata/contentType"/>
@@ -3235,23 +3362,4 @@
     <ds:schemaRef ds:uri="http://schemas.microsoft.com/internal/obd"/>
   </ds:schemaRefs>
 </ds:datastoreItem>
-</file>
-
-<file path=customXml/itemProps2.xml><?xml version="1.0" encoding="utf-8"?>
-<ds:datastoreItem xmlns:ds="http://schemas.openxmlformats.org/officeDocument/2006/customXml" ds:itemID="{47D7D20A-5C87-427E-8B8D-3343B9C6406D}">
-  <ds:schemaRefs>
-    <ds:schemaRef ds:uri="http://schemas.microsoft.com/sharepoint/v3/contenttype/forms"/>
-  </ds:schemaRefs>
-</ds:datastoreItem>
-</file>
-
-<file path=customXml/itemProps3.xml><?xml version="1.0" encoding="utf-8"?>
-<ds:datastoreItem xmlns:ds="http://schemas.openxmlformats.org/officeDocument/2006/customXml" ds:itemID="{52F8D590-B38F-4B4A-8BDD-FD59D16A4DE7}">
-  <ds:schemaRefs>
-    <ds:schemaRef ds:uri="http://schemas.microsoft.com/office/2006/metadata/properties"/>
-    <ds:schemaRef ds:uri="http://schemas.microsoft.com/office/infopath/2007/PartnerControls"/>
-    <ds:schemaRef ds:uri="453e7e53-5eb2-45cf-b2ab-34c867e554b8"/>
-    <ds:schemaRef ds:uri="aa0d983d-359a-438c-9953-3af1a8ac0831"/>
-  </ds:schemaRefs>
-</ds:datastoreItem>
 </file>
</xml_diff>

<commit_message>
Suskaičiuota viskas iki izokinetiškumo parinkimo
</commit_message>
<xml_diff>
--- a/AtmintinėFunkcijos.docx
+++ b/AtmintinėFunkcijos.docx
@@ -242,7 +242,21 @@
         <w:rPr>
           <w:rFonts w:ascii="Times New Roman" w:hAnsi="Times New Roman" w:cs="Times New Roman"/>
         </w:rPr>
-        <w:t xml:space="preserve"> Parenka Pito vamzdelio koeficientą ir išplėstinės neapibrėžties koeficientą, užpildo </w:t>
+        <w:t xml:space="preserve"> Parenka </w:t>
+      </w:r>
+      <w:proofErr w:type="spellStart"/>
+      <w:r>
+        <w:rPr>
+          <w:rFonts w:ascii="Times New Roman" w:hAnsi="Times New Roman" w:cs="Times New Roman"/>
+        </w:rPr>
+        <w:t>Pito</w:t>
+      </w:r>
+      <w:proofErr w:type="spellEnd"/>
+      <w:r>
+        <w:rPr>
+          <w:rFonts w:ascii="Times New Roman" w:hAnsi="Times New Roman" w:cs="Times New Roman"/>
+        </w:rPr>
+        <w:t xml:space="preserve"> vamzdelio koeficientą ir išplėstinės neapibrėžties koeficientą, užpildo </w:t>
       </w:r>
       <w:r>
         <w:rPr>
@@ -250,11 +264,19 @@
         </w:rPr>
         <w:t>lapo „Greitis“ „</w:t>
       </w:r>
-      <w:r>
-        <w:rPr>
-          <w:rFonts w:ascii="Times New Roman" w:hAnsi="Times New Roman" w:cs="Times New Roman"/>
-        </w:rPr>
-        <w:t>Pito vamzdelio koeficientas, K</w:t>
+      <w:proofErr w:type="spellStart"/>
+      <w:r>
+        <w:rPr>
+          <w:rFonts w:ascii="Times New Roman" w:hAnsi="Times New Roman" w:cs="Times New Roman"/>
+        </w:rPr>
+        <w:t>Pito</w:t>
+      </w:r>
+      <w:proofErr w:type="spellEnd"/>
+      <w:r>
+        <w:rPr>
+          <w:rFonts w:ascii="Times New Roman" w:hAnsi="Times New Roman" w:cs="Times New Roman"/>
+        </w:rPr>
+        <w:t xml:space="preserve"> vamzdelio koeficientas, K</w:t>
       </w:r>
       <w:r>
         <w:rPr>
@@ -266,7 +288,21 @@
         <w:rPr>
           <w:rFonts w:ascii="Times New Roman" w:hAnsi="Times New Roman" w:cs="Times New Roman"/>
         </w:rPr>
-        <w:t>Išplėstinės neapibrėžties koef. A</w:t>
+        <w:t xml:space="preserve">Išplėstinės neapibrėžties </w:t>
+      </w:r>
+      <w:proofErr w:type="spellStart"/>
+      <w:r>
+        <w:rPr>
+          <w:rFonts w:ascii="Times New Roman" w:hAnsi="Times New Roman" w:cs="Times New Roman"/>
+        </w:rPr>
+        <w:t>koef</w:t>
+      </w:r>
+      <w:proofErr w:type="spellEnd"/>
+      <w:r>
+        <w:rPr>
+          <w:rFonts w:ascii="Times New Roman" w:hAnsi="Times New Roman" w:cs="Times New Roman"/>
+        </w:rPr>
+        <w:t>. A</w:t>
       </w:r>
       <w:r>
         <w:rPr>
@@ -560,7 +596,21 @@
         <w:rPr>
           <w:rFonts w:ascii="Times New Roman" w:hAnsi="Times New Roman" w:cs="Times New Roman"/>
         </w:rPr>
-        <w:t>Išmatuotas diferencinis slėgis taškuose 1 linija, Pdi, hPa</w:t>
+        <w:t xml:space="preserve">Išmatuotas diferencinis slėgis taškuose 1 linija, </w:t>
+      </w:r>
+      <w:proofErr w:type="spellStart"/>
+      <w:r>
+        <w:rPr>
+          <w:rFonts w:ascii="Times New Roman" w:hAnsi="Times New Roman" w:cs="Times New Roman"/>
+        </w:rPr>
+        <w:t>Pdi</w:t>
+      </w:r>
+      <w:proofErr w:type="spellEnd"/>
+      <w:r>
+        <w:rPr>
+          <w:rFonts w:ascii="Times New Roman" w:hAnsi="Times New Roman" w:cs="Times New Roman"/>
+        </w:rPr>
+        <w:t>, hPa</w:t>
       </w:r>
       <w:r>
         <w:rPr>
@@ -710,7 +760,35 @@
         <w:rPr>
           <w:rFonts w:ascii="Times New Roman" w:hAnsi="Times New Roman" w:cs="Times New Roman"/>
         </w:rPr>
-        <w:t>Slėgis prieš rotametrą ΔPr (±hPa)</w:t>
+        <w:t xml:space="preserve">Slėgis prieš </w:t>
+      </w:r>
+      <w:proofErr w:type="spellStart"/>
+      <w:r>
+        <w:rPr>
+          <w:rFonts w:ascii="Times New Roman" w:hAnsi="Times New Roman" w:cs="Times New Roman"/>
+        </w:rPr>
+        <w:t>rotametrą</w:t>
+      </w:r>
+      <w:proofErr w:type="spellEnd"/>
+      <w:r>
+        <w:rPr>
+          <w:rFonts w:ascii="Times New Roman" w:hAnsi="Times New Roman" w:cs="Times New Roman"/>
+        </w:rPr>
+        <w:t xml:space="preserve"> </w:t>
+      </w:r>
+      <w:proofErr w:type="spellStart"/>
+      <w:r>
+        <w:rPr>
+          <w:rFonts w:ascii="Times New Roman" w:hAnsi="Times New Roman" w:cs="Times New Roman"/>
+        </w:rPr>
+        <w:t>ΔPr</w:t>
+      </w:r>
+      <w:proofErr w:type="spellEnd"/>
+      <w:r>
+        <w:rPr>
+          <w:rFonts w:ascii="Times New Roman" w:hAnsi="Times New Roman" w:cs="Times New Roman"/>
+        </w:rPr>
+        <w:t xml:space="preserve"> (±hPa)</w:t>
       </w:r>
       <w:r>
         <w:rPr>
@@ -722,7 +800,21 @@
         <w:rPr>
           <w:rFonts w:ascii="Times New Roman" w:hAnsi="Times New Roman" w:cs="Times New Roman"/>
         </w:rPr>
-        <w:t>Antgalio diametras da (mm)</w:t>
+        <w:t xml:space="preserve">Antgalio diametras </w:t>
+      </w:r>
+      <w:proofErr w:type="spellStart"/>
+      <w:r>
+        <w:rPr>
+          <w:rFonts w:ascii="Times New Roman" w:hAnsi="Times New Roman" w:cs="Times New Roman"/>
+        </w:rPr>
+        <w:t>da</w:t>
+      </w:r>
+      <w:proofErr w:type="spellEnd"/>
+      <w:r>
+        <w:rPr>
+          <w:rFonts w:ascii="Times New Roman" w:hAnsi="Times New Roman" w:cs="Times New Roman"/>
+        </w:rPr>
+        <w:t xml:space="preserve"> (mm)</w:t>
       </w:r>
       <w:r>
         <w:rPr>
@@ -759,7 +851,21 @@
         <w:rPr>
           <w:rFonts w:ascii="Times New Roman" w:hAnsi="Times New Roman" w:cs="Times New Roman"/>
         </w:rPr>
-        <w:t>Siurbimo greitis Vo (l/min)</w:t>
+        <w:t xml:space="preserve">Siurbimo greitis </w:t>
+      </w:r>
+      <w:proofErr w:type="spellStart"/>
+      <w:r>
+        <w:rPr>
+          <w:rFonts w:ascii="Times New Roman" w:hAnsi="Times New Roman" w:cs="Times New Roman"/>
+        </w:rPr>
+        <w:t>Vo</w:t>
+      </w:r>
+      <w:proofErr w:type="spellEnd"/>
+      <w:r>
+        <w:rPr>
+          <w:rFonts w:ascii="Times New Roman" w:hAnsi="Times New Roman" w:cs="Times New Roman"/>
+        </w:rPr>
+        <w:t xml:space="preserve"> (l/min)</w:t>
       </w:r>
       <w:r>
         <w:rPr>
@@ -789,7 +895,35 @@
         <w:rPr>
           <w:rFonts w:ascii="Times New Roman" w:hAnsi="Times New Roman" w:cs="Times New Roman"/>
         </w:rPr>
-        <w:t>Siurbiamų dujų temperatūra prieš rotametrą tr (°C)</w:t>
+        <w:t xml:space="preserve">Siurbiamų dujų temperatūra prieš </w:t>
+      </w:r>
+      <w:proofErr w:type="spellStart"/>
+      <w:r>
+        <w:rPr>
+          <w:rFonts w:ascii="Times New Roman" w:hAnsi="Times New Roman" w:cs="Times New Roman"/>
+        </w:rPr>
+        <w:t>rotametrą</w:t>
+      </w:r>
+      <w:proofErr w:type="spellEnd"/>
+      <w:r>
+        <w:rPr>
+          <w:rFonts w:ascii="Times New Roman" w:hAnsi="Times New Roman" w:cs="Times New Roman"/>
+        </w:rPr>
+        <w:t xml:space="preserve"> </w:t>
+      </w:r>
+      <w:proofErr w:type="spellStart"/>
+      <w:r>
+        <w:rPr>
+          <w:rFonts w:ascii="Times New Roman" w:hAnsi="Times New Roman" w:cs="Times New Roman"/>
+        </w:rPr>
+        <w:t>tr</w:t>
+      </w:r>
+      <w:proofErr w:type="spellEnd"/>
+      <w:r>
+        <w:rPr>
+          <w:rFonts w:ascii="Times New Roman" w:hAnsi="Times New Roman" w:cs="Times New Roman"/>
+        </w:rPr>
+        <w:t xml:space="preserve"> (°C)</w:t>
       </w:r>
       <w:r>
         <w:rPr>
@@ -881,7 +1015,21 @@
         <w:rPr>
           <w:rFonts w:ascii="Times New Roman" w:hAnsi="Times New Roman" w:cs="Times New Roman"/>
         </w:rPr>
-        <w:t>Dujų tūris normaliomis sąlygomis, Vn l.</w:t>
+        <w:t xml:space="preserve">Dujų tūris normaliomis sąlygomis, </w:t>
+      </w:r>
+      <w:proofErr w:type="spellStart"/>
+      <w:r>
+        <w:rPr>
+          <w:rFonts w:ascii="Times New Roman" w:hAnsi="Times New Roman" w:cs="Times New Roman"/>
+        </w:rPr>
+        <w:t>Vn</w:t>
+      </w:r>
+      <w:proofErr w:type="spellEnd"/>
+      <w:r>
+        <w:rPr>
+          <w:rFonts w:ascii="Times New Roman" w:hAnsi="Times New Roman" w:cs="Times New Roman"/>
+        </w:rPr>
+        <w:t xml:space="preserve"> l.</w:t>
       </w:r>
       <w:r>
         <w:rPr>
@@ -909,7 +1057,21 @@
         <w:rPr>
           <w:rFonts w:ascii="Times New Roman" w:hAnsi="Times New Roman" w:cs="Times New Roman"/>
         </w:rPr>
-        <w:t>Prasiurbtas dujų tūris normaliosiomis sąlygomis Vmn, Nm3</w:t>
+        <w:t xml:space="preserve">Prasiurbtas dujų tūris normaliosiomis sąlygomis </w:t>
+      </w:r>
+      <w:proofErr w:type="spellStart"/>
+      <w:r>
+        <w:rPr>
+          <w:rFonts w:ascii="Times New Roman" w:hAnsi="Times New Roman" w:cs="Times New Roman"/>
+        </w:rPr>
+        <w:t>Vmn</w:t>
+      </w:r>
+      <w:proofErr w:type="spellEnd"/>
+      <w:r>
+        <w:rPr>
+          <w:rFonts w:ascii="Times New Roman" w:hAnsi="Times New Roman" w:cs="Times New Roman"/>
+        </w:rPr>
+        <w:t>, Nm3</w:t>
       </w:r>
       <w:r>
         <w:rPr>
@@ -953,7 +1115,21 @@
         <w:rPr>
           <w:rFonts w:ascii="Times New Roman" w:hAnsi="Times New Roman" w:cs="Times New Roman"/>
         </w:rPr>
-        <w:t>Sausų dujų tankis normaliosioms sąlygomis qn (kg/m3)</w:t>
+        <w:t xml:space="preserve">Sausų dujų tankis normaliosioms sąlygomis </w:t>
+      </w:r>
+      <w:proofErr w:type="spellStart"/>
+      <w:r>
+        <w:rPr>
+          <w:rFonts w:ascii="Times New Roman" w:hAnsi="Times New Roman" w:cs="Times New Roman"/>
+        </w:rPr>
+        <w:t>qn</w:t>
+      </w:r>
+      <w:proofErr w:type="spellEnd"/>
+      <w:r>
+        <w:rPr>
+          <w:rFonts w:ascii="Times New Roman" w:hAnsi="Times New Roman" w:cs="Times New Roman"/>
+        </w:rPr>
+        <w:t xml:space="preserve"> (kg/m3)</w:t>
       </w:r>
       <w:r>
         <w:rPr>
@@ -981,7 +1157,21 @@
         <w:rPr>
           <w:rFonts w:ascii="Times New Roman" w:hAnsi="Times New Roman" w:cs="Times New Roman"/>
         </w:rPr>
-        <w:t>Drėgmės kiekis X (%) (izokinetinei sistemai)</w:t>
+        <w:t>Drėgmės kiekis X (%) (</w:t>
+      </w:r>
+      <w:proofErr w:type="spellStart"/>
+      <w:r>
+        <w:rPr>
+          <w:rFonts w:ascii="Times New Roman" w:hAnsi="Times New Roman" w:cs="Times New Roman"/>
+        </w:rPr>
+        <w:t>izokinetinei</w:t>
+      </w:r>
+      <w:proofErr w:type="spellEnd"/>
+      <w:r>
+        <w:rPr>
+          <w:rFonts w:ascii="Times New Roman" w:hAnsi="Times New Roman" w:cs="Times New Roman"/>
+        </w:rPr>
+        <w:t xml:space="preserve"> sistemai)</w:t>
       </w:r>
       <w:r>
         <w:rPr>
@@ -1035,7 +1225,21 @@
         <w:rPr>
           <w:rFonts w:ascii="Times New Roman" w:hAnsi="Times New Roman" w:cs="Times New Roman"/>
         </w:rPr>
-        <w:t>Srauto greitis ortakyje wor (m/s)</w:t>
+        <w:t xml:space="preserve">Srauto greitis ortakyje </w:t>
+      </w:r>
+      <w:proofErr w:type="spellStart"/>
+      <w:r>
+        <w:rPr>
+          <w:rFonts w:ascii="Times New Roman" w:hAnsi="Times New Roman" w:cs="Times New Roman"/>
+        </w:rPr>
+        <w:t>wor</w:t>
+      </w:r>
+      <w:proofErr w:type="spellEnd"/>
+      <w:r>
+        <w:rPr>
+          <w:rFonts w:ascii="Times New Roman" w:hAnsi="Times New Roman" w:cs="Times New Roman"/>
+        </w:rPr>
+        <w:t xml:space="preserve"> (m/s)</w:t>
       </w:r>
       <w:r>
         <w:rPr>
@@ -1049,11 +1253,19 @@
         </w:rPr>
         <w:t>„</w:t>
       </w:r>
-      <w:r>
-        <w:rPr>
-          <w:rFonts w:ascii="Times New Roman" w:hAnsi="Times New Roman" w:cs="Times New Roman"/>
-        </w:rPr>
-        <w:t>Izokinetiškumas (0,95-1,15)</w:t>
+      <w:proofErr w:type="spellStart"/>
+      <w:r>
+        <w:rPr>
+          <w:rFonts w:ascii="Times New Roman" w:hAnsi="Times New Roman" w:cs="Times New Roman"/>
+        </w:rPr>
+        <w:t>Izokinetiškumas</w:t>
+      </w:r>
+      <w:proofErr w:type="spellEnd"/>
+      <w:r>
+        <w:rPr>
+          <w:rFonts w:ascii="Times New Roman" w:hAnsi="Times New Roman" w:cs="Times New Roman"/>
+        </w:rPr>
+        <w:t xml:space="preserve"> (0,95-1,15)</w:t>
       </w:r>
       <w:r>
         <w:rPr>
@@ -1071,8 +1283,16 @@
         <w:rPr>
           <w:rFonts w:ascii="Times New Roman" w:hAnsi="Times New Roman" w:cs="Times New Roman"/>
         </w:rPr>
-        <w:t>Temperatūra ortakyje t, oC</w:t>
-      </w:r>
+        <w:t xml:space="preserve">Temperatūra ortakyje t, </w:t>
+      </w:r>
+      <w:proofErr w:type="spellStart"/>
+      <w:r>
+        <w:rPr>
+          <w:rFonts w:ascii="Times New Roman" w:hAnsi="Times New Roman" w:cs="Times New Roman"/>
+        </w:rPr>
+        <w:t>oC</w:t>
+      </w:r>
+      <w:proofErr w:type="spellEnd"/>
       <w:r>
         <w:rPr>
           <w:rFonts w:ascii="Times New Roman" w:hAnsi="Times New Roman" w:cs="Times New Roman"/>
@@ -1152,7 +1372,21 @@
         <w:rPr>
           <w:rFonts w:ascii="Times New Roman" w:hAnsi="Times New Roman" w:cs="Times New Roman"/>
         </w:rPr>
-        <w:t>Prasiurbtas dujų tūris Vm (m3)</w:t>
+        <w:t xml:space="preserve">Prasiurbtas dujų tūris </w:t>
+      </w:r>
+      <w:proofErr w:type="spellStart"/>
+      <w:r>
+        <w:rPr>
+          <w:rFonts w:ascii="Times New Roman" w:hAnsi="Times New Roman" w:cs="Times New Roman"/>
+        </w:rPr>
+        <w:t>Vm</w:t>
+      </w:r>
+      <w:proofErr w:type="spellEnd"/>
+      <w:r>
+        <w:rPr>
+          <w:rFonts w:ascii="Times New Roman" w:hAnsi="Times New Roman" w:cs="Times New Roman"/>
+        </w:rPr>
+        <w:t xml:space="preserve"> (m3)</w:t>
       </w:r>
       <w:r>
         <w:rPr>
@@ -1179,7 +1413,21 @@
         <w:rPr>
           <w:rFonts w:ascii="Times New Roman" w:hAnsi="Times New Roman" w:cs="Times New Roman"/>
         </w:rPr>
-        <w:t>Prasiurbtas dujų tūris normaliosiomis sąlygomis Vmn (Nm3)</w:t>
+        <w:t xml:space="preserve">Prasiurbtas dujų tūris normaliosiomis sąlygomis </w:t>
+      </w:r>
+      <w:proofErr w:type="spellStart"/>
+      <w:r>
+        <w:rPr>
+          <w:rFonts w:ascii="Times New Roman" w:hAnsi="Times New Roman" w:cs="Times New Roman"/>
+        </w:rPr>
+        <w:t>Vmn</w:t>
+      </w:r>
+      <w:proofErr w:type="spellEnd"/>
+      <w:r>
+        <w:rPr>
+          <w:rFonts w:ascii="Times New Roman" w:hAnsi="Times New Roman" w:cs="Times New Roman"/>
+        </w:rPr>
+        <w:t xml:space="preserve"> (Nm3)</w:t>
       </w:r>
       <w:r>
         <w:rPr>
@@ -1206,7 +1454,35 @@
         <w:rPr>
           <w:rFonts w:ascii="Times New Roman" w:hAnsi="Times New Roman" w:cs="Times New Roman"/>
         </w:rPr>
-        <w:t>Prasiurbto dujų tūrio normaliosiomis sąlygomis suma Vmn(sum) (Nm3)</w:t>
+        <w:t xml:space="preserve">Prasiurbto dujų tūrio normaliosiomis sąlygomis suma </w:t>
+      </w:r>
+      <w:proofErr w:type="spellStart"/>
+      <w:r>
+        <w:rPr>
+          <w:rFonts w:ascii="Times New Roman" w:hAnsi="Times New Roman" w:cs="Times New Roman"/>
+        </w:rPr>
+        <w:t>Vmn</w:t>
+      </w:r>
+      <w:proofErr w:type="spellEnd"/>
+      <w:r>
+        <w:rPr>
+          <w:rFonts w:ascii="Times New Roman" w:hAnsi="Times New Roman" w:cs="Times New Roman"/>
+        </w:rPr>
+        <w:t>(</w:t>
+      </w:r>
+      <w:proofErr w:type="spellStart"/>
+      <w:r>
+        <w:rPr>
+          <w:rFonts w:ascii="Times New Roman" w:hAnsi="Times New Roman" w:cs="Times New Roman"/>
+        </w:rPr>
+        <w:t>sum</w:t>
+      </w:r>
+      <w:proofErr w:type="spellEnd"/>
+      <w:r>
+        <w:rPr>
+          <w:rFonts w:ascii="Times New Roman" w:hAnsi="Times New Roman" w:cs="Times New Roman"/>
+        </w:rPr>
+        <w:t>) (Nm3)</w:t>
       </w:r>
       <w:r>
         <w:rPr>
@@ -1239,7 +1515,21 @@
         <w:rPr>
           <w:rFonts w:ascii="Times New Roman" w:hAnsi="Times New Roman" w:cs="Times New Roman"/>
         </w:rPr>
-        <w:t>Sausų dujų tankis normaliosioms sąlygomis qn (kg/m3)</w:t>
+        <w:t xml:space="preserve">Sausų dujų tankis normaliosioms sąlygomis </w:t>
+      </w:r>
+      <w:proofErr w:type="spellStart"/>
+      <w:r>
+        <w:rPr>
+          <w:rFonts w:ascii="Times New Roman" w:hAnsi="Times New Roman" w:cs="Times New Roman"/>
+        </w:rPr>
+        <w:t>qn</w:t>
+      </w:r>
+      <w:proofErr w:type="spellEnd"/>
+      <w:r>
+        <w:rPr>
+          <w:rFonts w:ascii="Times New Roman" w:hAnsi="Times New Roman" w:cs="Times New Roman"/>
+        </w:rPr>
+        <w:t xml:space="preserve"> (kg/m3)</w:t>
       </w:r>
       <w:r>
         <w:rPr>
@@ -1263,7 +1553,21 @@
         <w:rPr>
           <w:rFonts w:ascii="Times New Roman" w:hAnsi="Times New Roman" w:cs="Times New Roman"/>
         </w:rPr>
-        <w:t>Sausų dujų tankis normaliosioms sąlygomis qn (kg/m3)</w:t>
+        <w:t xml:space="preserve">Sausų dujų tankis normaliosioms sąlygomis </w:t>
+      </w:r>
+      <w:proofErr w:type="spellStart"/>
+      <w:r>
+        <w:rPr>
+          <w:rFonts w:ascii="Times New Roman" w:hAnsi="Times New Roman" w:cs="Times New Roman"/>
+        </w:rPr>
+        <w:t>qn</w:t>
+      </w:r>
+      <w:proofErr w:type="spellEnd"/>
+      <w:r>
+        <w:rPr>
+          <w:rFonts w:ascii="Times New Roman" w:hAnsi="Times New Roman" w:cs="Times New Roman"/>
+        </w:rPr>
+        <w:t xml:space="preserve"> (kg/m3)</w:t>
       </w:r>
       <w:r>
         <w:rPr>
@@ -1323,7 +1627,21 @@
         <w:rPr>
           <w:rFonts w:ascii="Times New Roman" w:hAnsi="Times New Roman" w:cs="Times New Roman"/>
         </w:rPr>
-        <w:t>Drėgmės kiekis X (%) (izokinetinei sistemai)</w:t>
+        <w:t>Drėgmės kiekis X (%) (</w:t>
+      </w:r>
+      <w:proofErr w:type="spellStart"/>
+      <w:r>
+        <w:rPr>
+          <w:rFonts w:ascii="Times New Roman" w:hAnsi="Times New Roman" w:cs="Times New Roman"/>
+        </w:rPr>
+        <w:t>izokinetinei</w:t>
+      </w:r>
+      <w:proofErr w:type="spellEnd"/>
+      <w:r>
+        <w:rPr>
+          <w:rFonts w:ascii="Times New Roman" w:hAnsi="Times New Roman" w:cs="Times New Roman"/>
+        </w:rPr>
+        <w:t xml:space="preserve"> sistemai)</w:t>
       </w:r>
       <w:r>
         <w:rPr>
@@ -1413,7 +1731,21 @@
         <w:rPr>
           <w:rFonts w:ascii="Times New Roman" w:hAnsi="Times New Roman" w:cs="Times New Roman"/>
         </w:rPr>
-        <w:t>Prasiurbtas dujų tūris normaliosiomis sąlygomis Vmn, Nm3</w:t>
+        <w:t xml:space="preserve">Prasiurbtas dujų tūris normaliosiomis sąlygomis </w:t>
+      </w:r>
+      <w:proofErr w:type="spellStart"/>
+      <w:r>
+        <w:rPr>
+          <w:rFonts w:ascii="Times New Roman" w:hAnsi="Times New Roman" w:cs="Times New Roman"/>
+        </w:rPr>
+        <w:t>Vmn</w:t>
+      </w:r>
+      <w:proofErr w:type="spellEnd"/>
+      <w:r>
+        <w:rPr>
+          <w:rFonts w:ascii="Times New Roman" w:hAnsi="Times New Roman" w:cs="Times New Roman"/>
+        </w:rPr>
+        <w:t>, Nm3</w:t>
       </w:r>
       <w:r>
         <w:rPr>
@@ -1431,7 +1763,21 @@
         <w:rPr>
           <w:rFonts w:ascii="Times New Roman" w:hAnsi="Times New Roman" w:cs="Times New Roman"/>
         </w:rPr>
-        <w:t>Sausų dujų tankis normaliosioms sąlygomis qn, (kg/m3)</w:t>
+        <w:t xml:space="preserve">Sausų dujų tankis normaliosioms sąlygomis </w:t>
+      </w:r>
+      <w:proofErr w:type="spellStart"/>
+      <w:r>
+        <w:rPr>
+          <w:rFonts w:ascii="Times New Roman" w:hAnsi="Times New Roman" w:cs="Times New Roman"/>
+        </w:rPr>
+        <w:t>qn</w:t>
+      </w:r>
+      <w:proofErr w:type="spellEnd"/>
+      <w:r>
+        <w:rPr>
+          <w:rFonts w:ascii="Times New Roman" w:hAnsi="Times New Roman" w:cs="Times New Roman"/>
+        </w:rPr>
+        <w:t>, (kg/m3)</w:t>
       </w:r>
       <w:r>
         <w:rPr>
@@ -1463,6 +1809,76 @@
         </w:rPr>
         <w:t>13. AerodinamikaSK2Funkcija.py</w:t>
       </w:r>
+      <w:r>
+        <w:rPr>
+          <w:rFonts w:ascii="Times New Roman" w:hAnsi="Times New Roman" w:cs="Times New Roman"/>
+        </w:rPr>
+        <w:t xml:space="preserve"> suskaičiuoja </w:t>
+      </w:r>
+      <w:r>
+        <w:rPr>
+          <w:rFonts w:ascii="Times New Roman" w:hAnsi="Times New Roman" w:cs="Times New Roman"/>
+        </w:rPr>
+        <w:t>„</w:t>
+      </w:r>
+      <w:r>
+        <w:rPr>
+          <w:rFonts w:ascii="Times New Roman" w:hAnsi="Times New Roman" w:cs="Times New Roman"/>
+        </w:rPr>
+        <w:t xml:space="preserve">Pratrauktas drėgnų dujų tūris realiomis sąlygomis </w:t>
+      </w:r>
+      <w:proofErr w:type="spellStart"/>
+      <w:r>
+        <w:rPr>
+          <w:rFonts w:ascii="Times New Roman" w:hAnsi="Times New Roman" w:cs="Times New Roman"/>
+        </w:rPr>
+        <w:t>Vmk</w:t>
+      </w:r>
+      <w:proofErr w:type="spellEnd"/>
+      <w:r>
+        <w:rPr>
+          <w:rFonts w:ascii="Times New Roman" w:hAnsi="Times New Roman" w:cs="Times New Roman"/>
+        </w:rPr>
+        <w:t xml:space="preserve"> (m3)</w:t>
+      </w:r>
+      <w:r>
+        <w:rPr>
+          <w:rFonts w:ascii="Times New Roman" w:hAnsi="Times New Roman" w:cs="Times New Roman"/>
+        </w:rPr>
+        <w:t>“ ir „</w:t>
+      </w:r>
+      <w:r>
+        <w:rPr>
+          <w:rFonts w:ascii="Times New Roman" w:hAnsi="Times New Roman" w:cs="Times New Roman"/>
+        </w:rPr>
+        <w:t xml:space="preserve">Dujų srauto greitis antgalyje v </w:t>
+      </w:r>
+      <w:proofErr w:type="spellStart"/>
+      <w:r>
+        <w:rPr>
+          <w:rFonts w:ascii="Times New Roman" w:hAnsi="Times New Roman" w:cs="Times New Roman"/>
+        </w:rPr>
+        <w:t>antg</w:t>
+      </w:r>
+      <w:proofErr w:type="spellEnd"/>
+      <w:r>
+        <w:rPr>
+          <w:rFonts w:ascii="Times New Roman" w:hAnsi="Times New Roman" w:cs="Times New Roman"/>
+        </w:rPr>
+        <w:t>. (m/s)</w:t>
+      </w:r>
+      <w:r>
+        <w:rPr>
+          <w:rFonts w:ascii="Times New Roman" w:hAnsi="Times New Roman" w:cs="Times New Roman"/>
+        </w:rPr>
+        <w:t>“</w:t>
+      </w:r>
+      <w:r>
+        <w:rPr>
+          <w:rFonts w:ascii="Times New Roman" w:hAnsi="Times New Roman" w:cs="Times New Roman"/>
+        </w:rPr>
+        <w:t>.</w:t>
+      </w:r>
     </w:p>
     <w:p>
       <w:pPr>
@@ -1487,28 +1903,179 @@
         </w:rPr>
         <w:t>12. GreitisSK1Funkcija.py</w:t>
       </w:r>
-    </w:p>
-    <w:p>
-      <w:pPr>
-        <w:spacing w:after="0"/>
-        <w:jc w:val="both"/>
-        <w:rPr>
-          <w:rFonts w:ascii="Times New Roman" w:hAnsi="Times New Roman" w:cs="Times New Roman"/>
-        </w:rPr>
-      </w:pPr>
-    </w:p>
-    <w:p>
-      <w:pPr>
-        <w:spacing w:after="0"/>
-        <w:jc w:val="both"/>
-        <w:rPr>
-          <w:rFonts w:ascii="Times New Roman" w:hAnsi="Times New Roman" w:cs="Times New Roman"/>
-        </w:rPr>
-      </w:pPr>
-      <w:r>
-        <w:rPr>
-          <w:rFonts w:ascii="Times New Roman" w:hAnsi="Times New Roman" w:cs="Times New Roman"/>
-        </w:rPr>
+      <w:r>
+        <w:rPr>
+          <w:rFonts w:ascii="Times New Roman" w:hAnsi="Times New Roman" w:cs="Times New Roman"/>
+        </w:rPr>
+        <w:t xml:space="preserve"> suskaičiuoja </w:t>
+      </w:r>
+      <w:r>
+        <w:rPr>
+          <w:rFonts w:ascii="Times New Roman" w:hAnsi="Times New Roman" w:cs="Times New Roman"/>
+        </w:rPr>
+        <w:t>viską, kas skaičiuojama lape „Greitis“.</w:t>
+      </w:r>
+    </w:p>
+    <w:p>
+      <w:pPr>
+        <w:spacing w:after="0"/>
+        <w:jc w:val="both"/>
+        <w:rPr>
+          <w:rFonts w:ascii="Times New Roman" w:hAnsi="Times New Roman" w:cs="Times New Roman"/>
+        </w:rPr>
+      </w:pPr>
+    </w:p>
+    <w:p>
+      <w:pPr>
+        <w:spacing w:after="0"/>
+        <w:jc w:val="both"/>
+        <w:rPr>
+          <w:rFonts w:ascii="Times New Roman" w:hAnsi="Times New Roman" w:cs="Times New Roman"/>
+        </w:rPr>
+      </w:pPr>
+      <w:r>
+        <w:rPr>
+          <w:rFonts w:ascii="Times New Roman" w:hAnsi="Times New Roman" w:cs="Times New Roman"/>
+        </w:rPr>
+        <w:t>13. PaemimasSK2Funkcija.py</w:t>
+      </w:r>
+      <w:r>
+        <w:rPr>
+          <w:rFonts w:ascii="Times New Roman" w:hAnsi="Times New Roman" w:cs="Times New Roman"/>
+        </w:rPr>
+        <w:t xml:space="preserve"> perkelia greičių reikšmes iš lapo „Greitis“ į lapo „Paėmimas“ </w:t>
+      </w:r>
+      <w:r>
+        <w:rPr>
+          <w:rFonts w:ascii="Times New Roman" w:hAnsi="Times New Roman" w:cs="Times New Roman"/>
+        </w:rPr>
+        <w:t>„</w:t>
+      </w:r>
+      <w:r>
+        <w:rPr>
+          <w:rFonts w:ascii="Times New Roman" w:hAnsi="Times New Roman" w:cs="Times New Roman"/>
+        </w:rPr>
+        <w:t xml:space="preserve">Vidutinis srauto greitis ortakyje </w:t>
+      </w:r>
+      <w:proofErr w:type="spellStart"/>
+      <w:r>
+        <w:rPr>
+          <w:rFonts w:ascii="Times New Roman" w:hAnsi="Times New Roman" w:cs="Times New Roman"/>
+        </w:rPr>
+        <w:t>wor</w:t>
+      </w:r>
+      <w:proofErr w:type="spellEnd"/>
+      <w:r>
+        <w:rPr>
+          <w:rFonts w:ascii="Times New Roman" w:hAnsi="Times New Roman" w:cs="Times New Roman"/>
+        </w:rPr>
+        <w:t xml:space="preserve"> (m/s)</w:t>
+      </w:r>
+      <w:r>
+        <w:rPr>
+          <w:rFonts w:ascii="Times New Roman" w:hAnsi="Times New Roman" w:cs="Times New Roman"/>
+        </w:rPr>
+        <w:t>“ stulpelį.</w:t>
+      </w:r>
+    </w:p>
+    <w:p>
+      <w:pPr>
+        <w:spacing w:after="0"/>
+        <w:jc w:val="both"/>
+        <w:rPr>
+          <w:rFonts w:ascii="Times New Roman" w:hAnsi="Times New Roman" w:cs="Times New Roman"/>
+        </w:rPr>
+      </w:pPr>
+    </w:p>
+    <w:p>
+      <w:pPr>
+        <w:spacing w:after="0"/>
+        <w:jc w:val="both"/>
+        <w:rPr>
+          <w:rFonts w:ascii="Times New Roman" w:hAnsi="Times New Roman" w:cs="Times New Roman"/>
+        </w:rPr>
+      </w:pPr>
+      <w:r>
+        <w:rPr>
+          <w:rFonts w:ascii="Times New Roman" w:hAnsi="Times New Roman" w:cs="Times New Roman"/>
+        </w:rPr>
+        <w:t>14. AerodinamikaSK3Funkcija.py</w:t>
+      </w:r>
+      <w:r>
+        <w:rPr>
+          <w:rFonts w:ascii="Times New Roman" w:hAnsi="Times New Roman" w:cs="Times New Roman"/>
+        </w:rPr>
+        <w:t xml:space="preserve"> suskaičiuoja „</w:t>
+      </w:r>
+      <w:proofErr w:type="spellStart"/>
+      <w:r>
+        <w:rPr>
+          <w:rFonts w:ascii="Times New Roman" w:hAnsi="Times New Roman" w:cs="Times New Roman"/>
+        </w:rPr>
+        <w:t>Izokinetiškumas</w:t>
+      </w:r>
+      <w:proofErr w:type="spellEnd"/>
+      <w:r>
+        <w:rPr>
+          <w:rFonts w:ascii="Times New Roman" w:hAnsi="Times New Roman" w:cs="Times New Roman"/>
+        </w:rPr>
+        <w:t xml:space="preserve"> (0,95-1,15)</w:t>
+      </w:r>
+      <w:r>
+        <w:rPr>
+          <w:rFonts w:ascii="Times New Roman" w:hAnsi="Times New Roman" w:cs="Times New Roman"/>
+        </w:rPr>
+        <w:t xml:space="preserve">“; </w:t>
+      </w:r>
+      <w:r>
+        <w:rPr>
+          <w:rFonts w:ascii="Times New Roman" w:hAnsi="Times New Roman" w:cs="Times New Roman"/>
+        </w:rPr>
+        <w:t>„</w:t>
+      </w:r>
+      <w:proofErr w:type="spellStart"/>
+      <w:r>
+        <w:rPr>
+          <w:rFonts w:ascii="Times New Roman" w:hAnsi="Times New Roman" w:cs="Times New Roman"/>
+        </w:rPr>
+        <w:t>Izokinetiškumo</w:t>
+      </w:r>
+      <w:proofErr w:type="spellEnd"/>
+      <w:r>
+        <w:rPr>
+          <w:rFonts w:ascii="Times New Roman" w:hAnsi="Times New Roman" w:cs="Times New Roman"/>
+        </w:rPr>
+        <w:t xml:space="preserve"> vidurkis (0,95-1,15)</w:t>
+      </w:r>
+      <w:r>
+        <w:rPr>
+          <w:rFonts w:ascii="Times New Roman" w:hAnsi="Times New Roman" w:cs="Times New Roman"/>
+        </w:rPr>
+        <w:t>“ ir vidurkių vidurkius.</w:t>
+      </w:r>
+    </w:p>
+    <w:p>
+      <w:pPr>
+        <w:spacing w:after="0"/>
+        <w:jc w:val="both"/>
+        <w:rPr>
+          <w:rFonts w:ascii="Times New Roman" w:hAnsi="Times New Roman" w:cs="Times New Roman"/>
+        </w:rPr>
+      </w:pPr>
+    </w:p>
+    <w:p>
+      <w:pPr>
+        <w:spacing w:after="0"/>
+        <w:jc w:val="both"/>
+        <w:rPr>
+          <w:rFonts w:ascii="Times New Roman" w:hAnsi="Times New Roman" w:cs="Times New Roman"/>
+        </w:rPr>
+      </w:pPr>
+      <w:r>
+        <w:rPr>
+          <w:rFonts w:ascii="Times New Roman" w:hAnsi="Times New Roman" w:cs="Times New Roman"/>
+        </w:rPr>
+        <w:lastRenderedPageBreak/>
         <w:t>1</w:t>
       </w:r>
       <w:r>
@@ -1617,7 +2184,6 @@
         <w:rPr>
           <w:rFonts w:ascii="Times New Roman" w:hAnsi="Times New Roman" w:cs="Times New Roman"/>
         </w:rPr>
-        <w:lastRenderedPageBreak/>
         <w:t>1</w:t>
       </w:r>
       <w:r>

</xml_diff>

<commit_message>
Parenkamas geriausias variantas izokinetiškumui pasiekti
</commit_message>
<xml_diff>
--- a/AtmintinėFunkcijos.docx
+++ b/AtmintinėFunkcijos.docx
@@ -242,21 +242,7 @@
         <w:rPr>
           <w:rFonts w:ascii="Times New Roman" w:hAnsi="Times New Roman" w:cs="Times New Roman"/>
         </w:rPr>
-        <w:t xml:space="preserve"> Parenka </w:t>
-      </w:r>
-      <w:proofErr w:type="spellStart"/>
-      <w:r>
-        <w:rPr>
-          <w:rFonts w:ascii="Times New Roman" w:hAnsi="Times New Roman" w:cs="Times New Roman"/>
-        </w:rPr>
-        <w:t>Pito</w:t>
-      </w:r>
-      <w:proofErr w:type="spellEnd"/>
-      <w:r>
-        <w:rPr>
-          <w:rFonts w:ascii="Times New Roman" w:hAnsi="Times New Roman" w:cs="Times New Roman"/>
-        </w:rPr>
-        <w:t xml:space="preserve"> vamzdelio koeficientą ir išplėstinės neapibrėžties koeficientą, užpildo </w:t>
+        <w:t xml:space="preserve"> Parenka Pito vamzdelio koeficientą ir išplėstinės neapibrėžties koeficientą, užpildo </w:t>
       </w:r>
       <w:r>
         <w:rPr>
@@ -264,19 +250,11 @@
         </w:rPr>
         <w:t>lapo „Greitis“ „</w:t>
       </w:r>
-      <w:proofErr w:type="spellStart"/>
-      <w:r>
-        <w:rPr>
-          <w:rFonts w:ascii="Times New Roman" w:hAnsi="Times New Roman" w:cs="Times New Roman"/>
-        </w:rPr>
-        <w:t>Pito</w:t>
-      </w:r>
-      <w:proofErr w:type="spellEnd"/>
-      <w:r>
-        <w:rPr>
-          <w:rFonts w:ascii="Times New Roman" w:hAnsi="Times New Roman" w:cs="Times New Roman"/>
-        </w:rPr>
-        <w:t xml:space="preserve"> vamzdelio koeficientas, K</w:t>
+      <w:r>
+        <w:rPr>
+          <w:rFonts w:ascii="Times New Roman" w:hAnsi="Times New Roman" w:cs="Times New Roman"/>
+        </w:rPr>
+        <w:t>Pito vamzdelio koeficientas, K</w:t>
       </w:r>
       <w:r>
         <w:rPr>
@@ -288,21 +266,7 @@
         <w:rPr>
           <w:rFonts w:ascii="Times New Roman" w:hAnsi="Times New Roman" w:cs="Times New Roman"/>
         </w:rPr>
-        <w:t xml:space="preserve">Išplėstinės neapibrėžties </w:t>
-      </w:r>
-      <w:proofErr w:type="spellStart"/>
-      <w:r>
-        <w:rPr>
-          <w:rFonts w:ascii="Times New Roman" w:hAnsi="Times New Roman" w:cs="Times New Roman"/>
-        </w:rPr>
-        <w:t>koef</w:t>
-      </w:r>
-      <w:proofErr w:type="spellEnd"/>
-      <w:r>
-        <w:rPr>
-          <w:rFonts w:ascii="Times New Roman" w:hAnsi="Times New Roman" w:cs="Times New Roman"/>
-        </w:rPr>
-        <w:t>. A</w:t>
+        <w:t>Išplėstinės neapibrėžties koef. A</w:t>
       </w:r>
       <w:r>
         <w:rPr>
@@ -596,21 +560,7 @@
         <w:rPr>
           <w:rFonts w:ascii="Times New Roman" w:hAnsi="Times New Roman" w:cs="Times New Roman"/>
         </w:rPr>
-        <w:t xml:space="preserve">Išmatuotas diferencinis slėgis taškuose 1 linija, </w:t>
-      </w:r>
-      <w:proofErr w:type="spellStart"/>
-      <w:r>
-        <w:rPr>
-          <w:rFonts w:ascii="Times New Roman" w:hAnsi="Times New Roman" w:cs="Times New Roman"/>
-        </w:rPr>
-        <w:t>Pdi</w:t>
-      </w:r>
-      <w:proofErr w:type="spellEnd"/>
-      <w:r>
-        <w:rPr>
-          <w:rFonts w:ascii="Times New Roman" w:hAnsi="Times New Roman" w:cs="Times New Roman"/>
-        </w:rPr>
-        <w:t>, hPa</w:t>
+        <w:t>Išmatuotas diferencinis slėgis taškuose 1 linija, Pdi, hPa</w:t>
       </w:r>
       <w:r>
         <w:rPr>
@@ -760,35 +710,7 @@
         <w:rPr>
           <w:rFonts w:ascii="Times New Roman" w:hAnsi="Times New Roman" w:cs="Times New Roman"/>
         </w:rPr>
-        <w:t xml:space="preserve">Slėgis prieš </w:t>
-      </w:r>
-      <w:proofErr w:type="spellStart"/>
-      <w:r>
-        <w:rPr>
-          <w:rFonts w:ascii="Times New Roman" w:hAnsi="Times New Roman" w:cs="Times New Roman"/>
-        </w:rPr>
-        <w:t>rotametrą</w:t>
-      </w:r>
-      <w:proofErr w:type="spellEnd"/>
-      <w:r>
-        <w:rPr>
-          <w:rFonts w:ascii="Times New Roman" w:hAnsi="Times New Roman" w:cs="Times New Roman"/>
-        </w:rPr>
-        <w:t xml:space="preserve"> </w:t>
-      </w:r>
-      <w:proofErr w:type="spellStart"/>
-      <w:r>
-        <w:rPr>
-          <w:rFonts w:ascii="Times New Roman" w:hAnsi="Times New Roman" w:cs="Times New Roman"/>
-        </w:rPr>
-        <w:t>ΔPr</w:t>
-      </w:r>
-      <w:proofErr w:type="spellEnd"/>
-      <w:r>
-        <w:rPr>
-          <w:rFonts w:ascii="Times New Roman" w:hAnsi="Times New Roman" w:cs="Times New Roman"/>
-        </w:rPr>
-        <w:t xml:space="preserve"> (±hPa)</w:t>
+        <w:t>Slėgis prieš rotametrą ΔPr (±hPa)</w:t>
       </w:r>
       <w:r>
         <w:rPr>
@@ -800,21 +722,7 @@
         <w:rPr>
           <w:rFonts w:ascii="Times New Roman" w:hAnsi="Times New Roman" w:cs="Times New Roman"/>
         </w:rPr>
-        <w:t xml:space="preserve">Antgalio diametras </w:t>
-      </w:r>
-      <w:proofErr w:type="spellStart"/>
-      <w:r>
-        <w:rPr>
-          <w:rFonts w:ascii="Times New Roman" w:hAnsi="Times New Roman" w:cs="Times New Roman"/>
-        </w:rPr>
-        <w:t>da</w:t>
-      </w:r>
-      <w:proofErr w:type="spellEnd"/>
-      <w:r>
-        <w:rPr>
-          <w:rFonts w:ascii="Times New Roman" w:hAnsi="Times New Roman" w:cs="Times New Roman"/>
-        </w:rPr>
-        <w:t xml:space="preserve"> (mm)</w:t>
+        <w:t>Antgalio diametras da (mm)</w:t>
       </w:r>
       <w:r>
         <w:rPr>
@@ -851,21 +759,7 @@
         <w:rPr>
           <w:rFonts w:ascii="Times New Roman" w:hAnsi="Times New Roman" w:cs="Times New Roman"/>
         </w:rPr>
-        <w:t xml:space="preserve">Siurbimo greitis </w:t>
-      </w:r>
-      <w:proofErr w:type="spellStart"/>
-      <w:r>
-        <w:rPr>
-          <w:rFonts w:ascii="Times New Roman" w:hAnsi="Times New Roman" w:cs="Times New Roman"/>
-        </w:rPr>
-        <w:t>Vo</w:t>
-      </w:r>
-      <w:proofErr w:type="spellEnd"/>
-      <w:r>
-        <w:rPr>
-          <w:rFonts w:ascii="Times New Roman" w:hAnsi="Times New Roman" w:cs="Times New Roman"/>
-        </w:rPr>
-        <w:t xml:space="preserve"> (l/min)</w:t>
+        <w:t>Siurbimo greitis Vo (l/min)</w:t>
       </w:r>
       <w:r>
         <w:rPr>
@@ -895,88 +789,260 @@
         <w:rPr>
           <w:rFonts w:ascii="Times New Roman" w:hAnsi="Times New Roman" w:cs="Times New Roman"/>
         </w:rPr>
-        <w:t xml:space="preserve">Siurbiamų dujų temperatūra prieš </w:t>
-      </w:r>
-      <w:proofErr w:type="spellStart"/>
-      <w:r>
-        <w:rPr>
-          <w:rFonts w:ascii="Times New Roman" w:hAnsi="Times New Roman" w:cs="Times New Roman"/>
-        </w:rPr>
-        <w:t>rotametrą</w:t>
-      </w:r>
-      <w:proofErr w:type="spellEnd"/>
+        <w:t>Siurbiamų dujų temperatūra prieš rotametrą tr (°C)</w:t>
+      </w:r>
+      <w:r>
+        <w:rPr>
+          <w:rFonts w:ascii="Times New Roman" w:hAnsi="Times New Roman" w:cs="Times New Roman"/>
+        </w:rPr>
+        <w:t>“ stulpeliais ir perkelia įvestas reikšmes į „Rezultatai.xlsx“ lapo „Paėmimas“ analogiškus stulpelius.</w:t>
+      </w:r>
+    </w:p>
+    <w:p>
+      <w:pPr>
+        <w:spacing w:after="0"/>
+        <w:jc w:val="both"/>
+        <w:rPr>
+          <w:rFonts w:ascii="Times New Roman" w:hAnsi="Times New Roman" w:cs="Times New Roman"/>
+        </w:rPr>
+      </w:pPr>
+    </w:p>
+    <w:p>
+      <w:pPr>
+        <w:spacing w:after="0"/>
+        <w:jc w:val="both"/>
+        <w:rPr>
+          <w:rFonts w:ascii="Times New Roman" w:hAnsi="Times New Roman" w:cs="Times New Roman"/>
+        </w:rPr>
+      </w:pPr>
+      <w:r>
+        <w:rPr>
+          <w:rFonts w:ascii="Times New Roman" w:hAnsi="Times New Roman" w:cs="Times New Roman"/>
+        </w:rPr>
+        <w:t>8</w:t>
+      </w:r>
+      <w:r>
+        <w:rPr>
+          <w:rFonts w:ascii="Times New Roman" w:hAnsi="Times New Roman" w:cs="Times New Roman"/>
+        </w:rPr>
+        <w:t>. H2OSK1Funkcija.py suskaičiuoja</w:t>
+      </w:r>
+      <w:r>
+        <w:rPr>
+          <w:rFonts w:ascii="Times New Roman" w:hAnsi="Times New Roman" w:cs="Times New Roman"/>
+        </w:rPr>
+        <w:t xml:space="preserve"> „Rezultatai.xlsx“ lape „H2O esančius langelius:</w:t>
+      </w:r>
+    </w:p>
+    <w:p>
+      <w:pPr>
+        <w:spacing w:after="0"/>
+        <w:ind w:firstLine="284"/>
+        <w:jc w:val="both"/>
+        <w:rPr>
+          <w:rFonts w:ascii="Times New Roman" w:hAnsi="Times New Roman" w:cs="Times New Roman"/>
+        </w:rPr>
+      </w:pPr>
+      <w:r>
+        <w:rPr>
+          <w:rFonts w:ascii="Times New Roman" w:hAnsi="Times New Roman" w:cs="Times New Roman"/>
+        </w:rPr>
+        <w:t>„</w:t>
+      </w:r>
+      <w:r>
+        <w:rPr>
+          <w:rFonts w:ascii="Times New Roman" w:hAnsi="Times New Roman" w:cs="Times New Roman"/>
+        </w:rPr>
+        <w:t>Atmosferinis slėgis, hPa</w:t>
+      </w:r>
+      <w:r>
+        <w:rPr>
+          <w:rFonts w:ascii="Times New Roman" w:hAnsi="Times New Roman" w:cs="Times New Roman"/>
+        </w:rPr>
+        <w:t>“ persikopijuoja iš lapo „Greitis“;</w:t>
+      </w:r>
+    </w:p>
+    <w:p>
+      <w:pPr>
+        <w:spacing w:after="0"/>
+        <w:ind w:firstLine="284"/>
+        <w:jc w:val="both"/>
+        <w:rPr>
+          <w:rFonts w:ascii="Times New Roman" w:hAnsi="Times New Roman" w:cs="Times New Roman"/>
+        </w:rPr>
+      </w:pPr>
+      <w:r>
+        <w:rPr>
+          <w:rFonts w:ascii="Times New Roman" w:hAnsi="Times New Roman" w:cs="Times New Roman"/>
+        </w:rPr>
+        <w:t>„</w:t>
+      </w:r>
+      <w:r>
+        <w:rPr>
+          <w:rFonts w:ascii="Times New Roman" w:hAnsi="Times New Roman" w:cs="Times New Roman"/>
+        </w:rPr>
+        <w:t>Dujų tūris normaliomis sąlygomis, Vn l.</w:t>
+      </w:r>
+      <w:r>
+        <w:rPr>
+          <w:rFonts w:ascii="Times New Roman" w:hAnsi="Times New Roman" w:cs="Times New Roman"/>
+        </w:rPr>
+        <w:t>“;</w:t>
+      </w:r>
+    </w:p>
+    <w:p>
+      <w:pPr>
+        <w:spacing w:after="0"/>
+        <w:ind w:firstLine="284"/>
+        <w:jc w:val="both"/>
+        <w:rPr>
+          <w:rFonts w:ascii="Times New Roman" w:hAnsi="Times New Roman" w:cs="Times New Roman"/>
+        </w:rPr>
+      </w:pPr>
+      <w:r>
+        <w:rPr>
+          <w:rFonts w:ascii="Times New Roman" w:hAnsi="Times New Roman" w:cs="Times New Roman"/>
+        </w:rPr>
+        <w:t>„</w:t>
+      </w:r>
+      <w:r>
+        <w:rPr>
+          <w:rFonts w:ascii="Times New Roman" w:hAnsi="Times New Roman" w:cs="Times New Roman"/>
+        </w:rPr>
+        <w:t>Prasiurbtas dujų tūris normaliosiomis sąlygomis Vmn, Nm3</w:t>
+      </w:r>
+      <w:r>
+        <w:rPr>
+          <w:rFonts w:ascii="Times New Roman" w:hAnsi="Times New Roman" w:cs="Times New Roman"/>
+        </w:rPr>
+        <w:t>“.</w:t>
+      </w:r>
+    </w:p>
+    <w:p>
+      <w:pPr>
+        <w:spacing w:after="0"/>
+        <w:ind w:firstLine="284"/>
+        <w:jc w:val="both"/>
+        <w:rPr>
+          <w:rFonts w:ascii="Times New Roman" w:hAnsi="Times New Roman" w:cs="Times New Roman"/>
+        </w:rPr>
+      </w:pPr>
+      <w:r>
+        <w:rPr>
+          <w:rFonts w:ascii="Times New Roman" w:hAnsi="Times New Roman" w:cs="Times New Roman"/>
+        </w:rPr>
+        <w:t>Lieka neskaičiuoti, nes nėra duomenų:</w:t>
+      </w:r>
+    </w:p>
+    <w:p>
+      <w:pPr>
+        <w:spacing w:after="0"/>
+        <w:ind w:firstLine="284"/>
+        <w:jc w:val="both"/>
+        <w:rPr>
+          <w:rFonts w:ascii="Times New Roman" w:hAnsi="Times New Roman" w:cs="Times New Roman"/>
+        </w:rPr>
+      </w:pPr>
+      <w:r>
+        <w:rPr>
+          <w:rFonts w:ascii="Times New Roman" w:hAnsi="Times New Roman" w:cs="Times New Roman"/>
+        </w:rPr>
+        <w:t>„</w:t>
+      </w:r>
+      <w:r>
+        <w:rPr>
+          <w:rFonts w:ascii="Times New Roman" w:hAnsi="Times New Roman" w:cs="Times New Roman"/>
+        </w:rPr>
+        <w:t>Sausų dujų tankis normaliosioms sąlygomis qn (kg/m3)</w:t>
+      </w:r>
+      <w:r>
+        <w:rPr>
+          <w:rFonts w:ascii="Times New Roman" w:hAnsi="Times New Roman" w:cs="Times New Roman"/>
+        </w:rPr>
+        <w:t>“</w:t>
+      </w:r>
+    </w:p>
+    <w:p>
+      <w:pPr>
+        <w:spacing w:after="0"/>
+        <w:ind w:firstLine="284"/>
+        <w:jc w:val="both"/>
+        <w:rPr>
+          <w:rFonts w:ascii="Times New Roman" w:hAnsi="Times New Roman" w:cs="Times New Roman"/>
+        </w:rPr>
+      </w:pPr>
+      <w:r>
+        <w:rPr>
+          <w:rFonts w:ascii="Times New Roman" w:hAnsi="Times New Roman" w:cs="Times New Roman"/>
+        </w:rPr>
+        <w:t>„</w:t>
+      </w:r>
+      <w:r>
+        <w:rPr>
+          <w:rFonts w:ascii="Times New Roman" w:hAnsi="Times New Roman" w:cs="Times New Roman"/>
+        </w:rPr>
+        <w:t>Drėgmės kiekis X (%) (izokinetinei sistemai)</w:t>
+      </w:r>
+      <w:r>
+        <w:rPr>
+          <w:rFonts w:ascii="Times New Roman" w:hAnsi="Times New Roman" w:cs="Times New Roman"/>
+        </w:rPr>
+        <w:t>“.</w:t>
+      </w:r>
+    </w:p>
+    <w:p>
+      <w:pPr>
+        <w:spacing w:after="0"/>
+        <w:jc w:val="both"/>
+        <w:rPr>
+          <w:rFonts w:ascii="Times New Roman" w:hAnsi="Times New Roman" w:cs="Times New Roman"/>
+        </w:rPr>
+      </w:pPr>
+    </w:p>
+    <w:p>
+      <w:pPr>
+        <w:spacing w:after="0"/>
+        <w:jc w:val="both"/>
+        <w:rPr>
+          <w:rFonts w:ascii="Times New Roman" w:hAnsi="Times New Roman" w:cs="Times New Roman"/>
+        </w:rPr>
+      </w:pPr>
+      <w:r>
+        <w:rPr>
+          <w:rFonts w:ascii="Times New Roman" w:hAnsi="Times New Roman" w:cs="Times New Roman"/>
+        </w:rPr>
+        <w:t>9</w:t>
+      </w:r>
+      <w:r>
+        <w:rPr>
+          <w:rFonts w:ascii="Times New Roman" w:hAnsi="Times New Roman" w:cs="Times New Roman"/>
+        </w:rPr>
+        <w:t>. PaėmimasSK1Funkcija.py</w:t>
+      </w:r>
       <w:r>
         <w:rPr>
           <w:rFonts w:ascii="Times New Roman" w:hAnsi="Times New Roman" w:cs="Times New Roman"/>
         </w:rPr>
         <w:t xml:space="preserve"> </w:t>
       </w:r>
-      <w:proofErr w:type="spellStart"/>
-      <w:r>
-        <w:rPr>
-          <w:rFonts w:ascii="Times New Roman" w:hAnsi="Times New Roman" w:cs="Times New Roman"/>
-        </w:rPr>
-        <w:t>tr</w:t>
-      </w:r>
-      <w:proofErr w:type="spellEnd"/>
-      <w:r>
-        <w:rPr>
-          <w:rFonts w:ascii="Times New Roman" w:hAnsi="Times New Roman" w:cs="Times New Roman"/>
-        </w:rPr>
-        <w:t xml:space="preserve"> (°C)</w:t>
-      </w:r>
-      <w:r>
-        <w:rPr>
-          <w:rFonts w:ascii="Times New Roman" w:hAnsi="Times New Roman" w:cs="Times New Roman"/>
-        </w:rPr>
-        <w:t>“ stulpeliais ir perkelia įvestas reikšmes į „Rezultatai.xlsx“ lapo „Paėmimas“ analogiškus stulpelius.</w:t>
-      </w:r>
-    </w:p>
-    <w:p>
-      <w:pPr>
-        <w:spacing w:after="0"/>
-        <w:jc w:val="both"/>
-        <w:rPr>
-          <w:rFonts w:ascii="Times New Roman" w:hAnsi="Times New Roman" w:cs="Times New Roman"/>
-        </w:rPr>
-      </w:pPr>
-    </w:p>
-    <w:p>
-      <w:pPr>
-        <w:spacing w:after="0"/>
-        <w:jc w:val="both"/>
-        <w:rPr>
-          <w:rFonts w:ascii="Times New Roman" w:hAnsi="Times New Roman" w:cs="Times New Roman"/>
-        </w:rPr>
-      </w:pPr>
-      <w:r>
-        <w:rPr>
-          <w:rFonts w:ascii="Times New Roman" w:hAnsi="Times New Roman" w:cs="Times New Roman"/>
-        </w:rPr>
-        <w:t>8</w:t>
-      </w:r>
-      <w:r>
-        <w:rPr>
-          <w:rFonts w:ascii="Times New Roman" w:hAnsi="Times New Roman" w:cs="Times New Roman"/>
-        </w:rPr>
-        <w:t>. H2OSK1Funkcija.py suskaičiuoja</w:t>
-      </w:r>
-      <w:r>
-        <w:rPr>
-          <w:rFonts w:ascii="Times New Roman" w:hAnsi="Times New Roman" w:cs="Times New Roman"/>
-        </w:rPr>
-        <w:t xml:space="preserve"> „Rezultatai.xlsx“ lape „H2O esančius langelius:</w:t>
-      </w:r>
-    </w:p>
-    <w:p>
-      <w:pPr>
-        <w:spacing w:after="0"/>
-        <w:ind w:firstLine="284"/>
-        <w:jc w:val="both"/>
-        <w:rPr>
-          <w:rFonts w:ascii="Times New Roman" w:hAnsi="Times New Roman" w:cs="Times New Roman"/>
-        </w:rPr>
-      </w:pPr>
+      <w:r>
+        <w:rPr>
+          <w:rFonts w:ascii="Times New Roman" w:hAnsi="Times New Roman" w:cs="Times New Roman"/>
+        </w:rPr>
+        <w:t>atlieka visus skaičiavimus failo „Rezultatai.xlsx“ lape „Paėmimas“ išskyrus „</w:t>
+      </w:r>
+      <w:r>
+        <w:rPr>
+          <w:rFonts w:ascii="Times New Roman" w:hAnsi="Times New Roman" w:cs="Times New Roman"/>
+        </w:rPr>
+        <w:t>Srauto greitis ortakyje wor (m/s)</w:t>
+      </w:r>
+      <w:r>
+        <w:rPr>
+          <w:rFonts w:ascii="Times New Roman" w:hAnsi="Times New Roman" w:cs="Times New Roman"/>
+        </w:rPr>
+        <w:t xml:space="preserve">“ ir </w:t>
+      </w:r>
       <w:r>
         <w:rPr>
           <w:rFonts w:ascii="Times New Roman" w:hAnsi="Times New Roman" w:cs="Times New Roman"/>
@@ -987,24 +1053,14 @@
         <w:rPr>
           <w:rFonts w:ascii="Times New Roman" w:hAnsi="Times New Roman" w:cs="Times New Roman"/>
         </w:rPr>
-        <w:t>Atmosferinis slėgis, hPa</w:t>
-      </w:r>
-      <w:r>
-        <w:rPr>
-          <w:rFonts w:ascii="Times New Roman" w:hAnsi="Times New Roman" w:cs="Times New Roman"/>
-        </w:rPr>
-        <w:t>“ persikopijuoja iš lapo „Greitis“;</w:t>
-      </w:r>
-    </w:p>
-    <w:p>
-      <w:pPr>
-        <w:spacing w:after="0"/>
-        <w:ind w:firstLine="284"/>
-        <w:jc w:val="both"/>
-        <w:rPr>
-          <w:rFonts w:ascii="Times New Roman" w:hAnsi="Times New Roman" w:cs="Times New Roman"/>
-        </w:rPr>
-      </w:pPr>
+        <w:t>Izokinetiškumas (0,95-1,15)</w:t>
+      </w:r>
+      <w:r>
+        <w:rPr>
+          <w:rFonts w:ascii="Times New Roman" w:hAnsi="Times New Roman" w:cs="Times New Roman"/>
+        </w:rPr>
+        <w:t xml:space="preserve">“. Į lapą „Greitis“ perkelia </w:t>
+      </w:r>
       <w:r>
         <w:rPr>
           <w:rFonts w:ascii="Times New Roman" w:hAnsi="Times New Roman" w:cs="Times New Roman"/>
@@ -1015,21 +1071,88 @@
         <w:rPr>
           <w:rFonts w:ascii="Times New Roman" w:hAnsi="Times New Roman" w:cs="Times New Roman"/>
         </w:rPr>
-        <w:t xml:space="preserve">Dujų tūris normaliomis sąlygomis, </w:t>
-      </w:r>
-      <w:proofErr w:type="spellStart"/>
-      <w:r>
-        <w:rPr>
-          <w:rFonts w:ascii="Times New Roman" w:hAnsi="Times New Roman" w:cs="Times New Roman"/>
-        </w:rPr>
-        <w:t>Vn</w:t>
-      </w:r>
-      <w:proofErr w:type="spellEnd"/>
-      <w:r>
-        <w:rPr>
-          <w:rFonts w:ascii="Times New Roman" w:hAnsi="Times New Roman" w:cs="Times New Roman"/>
-        </w:rPr>
-        <w:t xml:space="preserve"> l.</w:t>
+        <w:t>Temperatūra ortakyje t, oC</w:t>
+      </w:r>
+      <w:r>
+        <w:rPr>
+          <w:rFonts w:ascii="Times New Roman" w:hAnsi="Times New Roman" w:cs="Times New Roman"/>
+        </w:rPr>
+        <w:t>“ reikšmes.</w:t>
+      </w:r>
+    </w:p>
+    <w:p>
+      <w:pPr>
+        <w:spacing w:after="0"/>
+        <w:jc w:val="both"/>
+        <w:rPr>
+          <w:rFonts w:ascii="Times New Roman" w:hAnsi="Times New Roman" w:cs="Times New Roman"/>
+        </w:rPr>
+      </w:pPr>
+    </w:p>
+    <w:p>
+      <w:pPr>
+        <w:spacing w:after="0"/>
+        <w:jc w:val="both"/>
+        <w:rPr>
+          <w:rFonts w:ascii="Times New Roman" w:hAnsi="Times New Roman" w:cs="Times New Roman"/>
+        </w:rPr>
+      </w:pPr>
+      <w:r>
+        <w:rPr>
+          <w:rFonts w:ascii="Times New Roman" w:hAnsi="Times New Roman" w:cs="Times New Roman"/>
+        </w:rPr>
+        <w:t>1</w:t>
+      </w:r>
+      <w:r>
+        <w:rPr>
+          <w:rFonts w:ascii="Times New Roman" w:hAnsi="Times New Roman" w:cs="Times New Roman"/>
+        </w:rPr>
+        <w:t>0</w:t>
+      </w:r>
+      <w:r>
+        <w:rPr>
+          <w:rFonts w:ascii="Times New Roman" w:hAnsi="Times New Roman" w:cs="Times New Roman"/>
+        </w:rPr>
+        <w:t>.</w:t>
+      </w:r>
+      <w:r>
+        <w:rPr>
+          <w:rFonts w:ascii="Times New Roman" w:hAnsi="Times New Roman" w:cs="Times New Roman"/>
+        </w:rPr>
+        <w:t xml:space="preserve"> </w:t>
+      </w:r>
+      <w:r>
+        <w:rPr>
+          <w:rFonts w:ascii="Times New Roman" w:hAnsi="Times New Roman" w:cs="Times New Roman"/>
+        </w:rPr>
+        <w:t>AerodinamikaSK1Funkcija.py</w:t>
+      </w:r>
+      <w:r>
+        <w:rPr>
+          <w:rFonts w:ascii="Times New Roman" w:hAnsi="Times New Roman" w:cs="Times New Roman"/>
+        </w:rPr>
+        <w:t xml:space="preserve"> suskaičiuoja šiuos stulpelius:</w:t>
+      </w:r>
+    </w:p>
+    <w:p>
+      <w:pPr>
+        <w:spacing w:after="0"/>
+        <w:jc w:val="both"/>
+        <w:rPr>
+          <w:rFonts w:ascii="Times New Roman" w:hAnsi="Times New Roman" w:cs="Times New Roman"/>
+        </w:rPr>
+      </w:pPr>
+      <w:r>
+        <w:rPr>
+          <w:rFonts w:ascii="Times New Roman" w:hAnsi="Times New Roman" w:cs="Times New Roman"/>
+        </w:rPr>
+        <w:t>„</w:t>
+      </w:r>
+      <w:r>
+        <w:rPr>
+          <w:rFonts w:ascii="Times New Roman" w:hAnsi="Times New Roman" w:cs="Times New Roman"/>
+        </w:rPr>
+        <w:t>Prasiurbtas dujų tūris Vm (m3)</w:t>
       </w:r>
       <w:r>
         <w:rPr>
@@ -1041,7 +1164,6 @@
     <w:p>
       <w:pPr>
         <w:spacing w:after="0"/>
-        <w:ind w:firstLine="284"/>
         <w:jc w:val="both"/>
         <w:rPr>
           <w:rFonts w:ascii="Times New Roman" w:hAnsi="Times New Roman" w:cs="Times New Roman"/>
@@ -1057,21 +1179,151 @@
         <w:rPr>
           <w:rFonts w:ascii="Times New Roman" w:hAnsi="Times New Roman" w:cs="Times New Roman"/>
         </w:rPr>
-        <w:t xml:space="preserve">Prasiurbtas dujų tūris normaliosiomis sąlygomis </w:t>
-      </w:r>
-      <w:proofErr w:type="spellStart"/>
-      <w:r>
-        <w:rPr>
-          <w:rFonts w:ascii="Times New Roman" w:hAnsi="Times New Roman" w:cs="Times New Roman"/>
-        </w:rPr>
-        <w:t>Vmn</w:t>
-      </w:r>
-      <w:proofErr w:type="spellEnd"/>
-      <w:r>
-        <w:rPr>
-          <w:rFonts w:ascii="Times New Roman" w:hAnsi="Times New Roman" w:cs="Times New Roman"/>
-        </w:rPr>
-        <w:t>, Nm3</w:t>
+        <w:t>Prasiurbtas dujų tūris normaliosiomis sąlygomis Vmn (Nm3)</w:t>
+      </w:r>
+      <w:r>
+        <w:rPr>
+          <w:rFonts w:ascii="Times New Roman" w:hAnsi="Times New Roman" w:cs="Times New Roman"/>
+        </w:rPr>
+        <w:t>“;</w:t>
+      </w:r>
+    </w:p>
+    <w:p>
+      <w:pPr>
+        <w:spacing w:after="0"/>
+        <w:jc w:val="both"/>
+        <w:rPr>
+          <w:rFonts w:ascii="Times New Roman" w:hAnsi="Times New Roman" w:cs="Times New Roman"/>
+        </w:rPr>
+      </w:pPr>
+      <w:r>
+        <w:rPr>
+          <w:rFonts w:ascii="Times New Roman" w:hAnsi="Times New Roman" w:cs="Times New Roman"/>
+        </w:rPr>
+        <w:t>„</w:t>
+      </w:r>
+      <w:r>
+        <w:rPr>
+          <w:rFonts w:ascii="Times New Roman" w:hAnsi="Times New Roman" w:cs="Times New Roman"/>
+        </w:rPr>
+        <w:t>Prasiurbto dujų tūrio normaliosiomis sąlygomis suma Vmn(sum) (Nm3)</w:t>
+      </w:r>
+      <w:r>
+        <w:rPr>
+          <w:rFonts w:ascii="Times New Roman" w:hAnsi="Times New Roman" w:cs="Times New Roman"/>
+        </w:rPr>
+        <w:t>“</w:t>
+      </w:r>
+      <w:r>
+        <w:rPr>
+          <w:rFonts w:ascii="Times New Roman" w:hAnsi="Times New Roman" w:cs="Times New Roman"/>
+        </w:rPr>
+        <w:t>, čia dar suskaičiuoja sumų sumas pabaigoje.</w:t>
+      </w:r>
+    </w:p>
+    <w:p>
+      <w:pPr>
+        <w:spacing w:after="0"/>
+        <w:jc w:val="both"/>
+        <w:rPr>
+          <w:rFonts w:ascii="Times New Roman" w:hAnsi="Times New Roman" w:cs="Times New Roman"/>
+        </w:rPr>
+      </w:pPr>
+      <w:r>
+        <w:rPr>
+          <w:rFonts w:ascii="Times New Roman" w:hAnsi="Times New Roman" w:cs="Times New Roman"/>
+        </w:rPr>
+        <w:t>„</w:t>
+      </w:r>
+      <w:r>
+        <w:rPr>
+          <w:rFonts w:ascii="Times New Roman" w:hAnsi="Times New Roman" w:cs="Times New Roman"/>
+        </w:rPr>
+        <w:t>Sausų dujų tankis normaliosioms sąlygomis qn (kg/m3)</w:t>
+      </w:r>
+      <w:r>
+        <w:rPr>
+          <w:rFonts w:ascii="Times New Roman" w:hAnsi="Times New Roman" w:cs="Times New Roman"/>
+        </w:rPr>
+        <w:t>“</w:t>
+      </w:r>
+      <w:r>
+        <w:rPr>
+          <w:rFonts w:ascii="Times New Roman" w:hAnsi="Times New Roman" w:cs="Times New Roman"/>
+        </w:rPr>
+        <w:t>, čia dar suskaičiuoja vidurkius ir vidurkių vidurkius</w:t>
+      </w:r>
+      <w:r>
+        <w:rPr>
+          <w:rFonts w:ascii="Times New Roman" w:hAnsi="Times New Roman" w:cs="Times New Roman"/>
+        </w:rPr>
+        <w:t xml:space="preserve"> pabaigoje. Vidurkių vidurkį perkelia į „H2O“ lapo </w:t>
+      </w:r>
+      <w:r>
+        <w:rPr>
+          <w:rFonts w:ascii="Times New Roman" w:hAnsi="Times New Roman" w:cs="Times New Roman"/>
+        </w:rPr>
+        <w:t>Sausų dujų tankis normaliosioms sąlygomis qn (kg/m3)</w:t>
+      </w:r>
+      <w:r>
+        <w:rPr>
+          <w:rFonts w:ascii="Times New Roman" w:hAnsi="Times New Roman" w:cs="Times New Roman"/>
+        </w:rPr>
+        <w:t>“ langelį.</w:t>
+      </w:r>
+    </w:p>
+    <w:p>
+      <w:pPr>
+        <w:spacing w:after="0"/>
+        <w:jc w:val="both"/>
+        <w:rPr>
+          <w:rFonts w:ascii="Times New Roman" w:hAnsi="Times New Roman" w:cs="Times New Roman"/>
+        </w:rPr>
+      </w:pPr>
+    </w:p>
+    <w:p>
+      <w:pPr>
+        <w:spacing w:after="0"/>
+        <w:jc w:val="both"/>
+        <w:rPr>
+          <w:rFonts w:ascii="Times New Roman" w:hAnsi="Times New Roman" w:cs="Times New Roman"/>
+        </w:rPr>
+      </w:pPr>
+      <w:r>
+        <w:rPr>
+          <w:rFonts w:ascii="Times New Roman" w:hAnsi="Times New Roman" w:cs="Times New Roman"/>
+        </w:rPr>
+        <w:t>1</w:t>
+      </w:r>
+      <w:r>
+        <w:rPr>
+          <w:rFonts w:ascii="Times New Roman" w:hAnsi="Times New Roman" w:cs="Times New Roman"/>
+        </w:rPr>
+        <w:t>1</w:t>
+      </w:r>
+      <w:r>
+        <w:rPr>
+          <w:rFonts w:ascii="Times New Roman" w:hAnsi="Times New Roman" w:cs="Times New Roman"/>
+        </w:rPr>
+        <w:t>. H2OSK2Funkcija.py</w:t>
+      </w:r>
+      <w:r>
+        <w:rPr>
+          <w:rFonts w:ascii="Times New Roman" w:hAnsi="Times New Roman" w:cs="Times New Roman"/>
+        </w:rPr>
+        <w:t xml:space="preserve"> suskaičiuoja vie</w:t>
+      </w:r>
+      <w:r>
+        <w:rPr>
+          <w:rFonts w:ascii="Times New Roman" w:hAnsi="Times New Roman" w:cs="Times New Roman"/>
+        </w:rPr>
+        <w:t>nintelę likusią reikšmę lape „H2O“ „</w:t>
+      </w:r>
+      <w:r>
+        <w:rPr>
+          <w:rFonts w:ascii="Times New Roman" w:hAnsi="Times New Roman" w:cs="Times New Roman"/>
+        </w:rPr>
+        <w:t>Drėgmės kiekis X (%) (izokinetinei sistemai)</w:t>
       </w:r>
       <w:r>
         <w:rPr>
@@ -1083,28 +1335,38 @@
     <w:p>
       <w:pPr>
         <w:spacing w:after="0"/>
-        <w:ind w:firstLine="284"/>
-        <w:jc w:val="both"/>
-        <w:rPr>
-          <w:rFonts w:ascii="Times New Roman" w:hAnsi="Times New Roman" w:cs="Times New Roman"/>
-        </w:rPr>
-      </w:pPr>
-      <w:r>
-        <w:rPr>
-          <w:rFonts w:ascii="Times New Roman" w:hAnsi="Times New Roman" w:cs="Times New Roman"/>
-        </w:rPr>
-        <w:t>Lieka neskaičiuoti, nes nėra duomenų:</w:t>
-      </w:r>
-    </w:p>
-    <w:p>
-      <w:pPr>
-        <w:spacing w:after="0"/>
-        <w:ind w:firstLine="284"/>
-        <w:jc w:val="both"/>
-        <w:rPr>
-          <w:rFonts w:ascii="Times New Roman" w:hAnsi="Times New Roman" w:cs="Times New Roman"/>
-        </w:rPr>
-      </w:pPr>
+        <w:jc w:val="both"/>
+        <w:rPr>
+          <w:rFonts w:ascii="Times New Roman" w:hAnsi="Times New Roman" w:cs="Times New Roman"/>
+        </w:rPr>
+      </w:pPr>
+    </w:p>
+    <w:p>
+      <w:pPr>
+        <w:spacing w:after="0"/>
+        <w:jc w:val="both"/>
+        <w:rPr>
+          <w:rFonts w:ascii="Times New Roman" w:hAnsi="Times New Roman" w:cs="Times New Roman"/>
+        </w:rPr>
+      </w:pPr>
+      <w:r>
+        <w:rPr>
+          <w:rFonts w:ascii="Times New Roman" w:hAnsi="Times New Roman" w:cs="Times New Roman"/>
+        </w:rPr>
+        <w:t>12. H2OSK3Funkcija.py</w:t>
+      </w:r>
+      <w:r>
+        <w:rPr>
+          <w:rFonts w:ascii="Times New Roman" w:hAnsi="Times New Roman" w:cs="Times New Roman"/>
+        </w:rPr>
+        <w:t xml:space="preserve"> </w:t>
+      </w:r>
+      <w:r>
+        <w:rPr>
+          <w:rFonts w:ascii="Times New Roman" w:hAnsi="Times New Roman" w:cs="Times New Roman"/>
+        </w:rPr>
+        <w:t xml:space="preserve">iš lapo „H2O“ į lapą „Aerodinamika“ perkelia </w:t>
+      </w:r>
       <w:r>
         <w:rPr>
           <w:rFonts w:ascii="Times New Roman" w:hAnsi="Times New Roman" w:cs="Times New Roman"/>
@@ -1115,21 +1377,121 @@
         <w:rPr>
           <w:rFonts w:ascii="Times New Roman" w:hAnsi="Times New Roman" w:cs="Times New Roman"/>
         </w:rPr>
-        <w:t xml:space="preserve">Sausų dujų tankis normaliosioms sąlygomis </w:t>
-      </w:r>
-      <w:proofErr w:type="spellStart"/>
-      <w:r>
-        <w:rPr>
-          <w:rFonts w:ascii="Times New Roman" w:hAnsi="Times New Roman" w:cs="Times New Roman"/>
-        </w:rPr>
-        <w:t>qn</w:t>
-      </w:r>
-      <w:proofErr w:type="spellEnd"/>
-      <w:r>
-        <w:rPr>
-          <w:rFonts w:ascii="Times New Roman" w:hAnsi="Times New Roman" w:cs="Times New Roman"/>
-        </w:rPr>
-        <w:t xml:space="preserve"> (kg/m3)</w:t>
+        <w:t>Drėgmės kiekis X (%)</w:t>
+      </w:r>
+      <w:r>
+        <w:rPr>
+          <w:rFonts w:ascii="Times New Roman" w:hAnsi="Times New Roman" w:cs="Times New Roman"/>
+        </w:rPr>
+        <w:t xml:space="preserve">“ reikšmes. Iš lapo „H2O“ į lapą „Greitis“ perkelia </w:t>
+      </w:r>
+      <w:r>
+        <w:rPr>
+          <w:rFonts w:ascii="Times New Roman" w:hAnsi="Times New Roman" w:cs="Times New Roman"/>
+        </w:rPr>
+        <w:t>„</w:t>
+      </w:r>
+      <w:r>
+        <w:rPr>
+          <w:rFonts w:ascii="Times New Roman" w:hAnsi="Times New Roman" w:cs="Times New Roman"/>
+        </w:rPr>
+        <w:t>Vandens kondensato masė m H2O, kg</w:t>
+      </w:r>
+      <w:r>
+        <w:rPr>
+          <w:rFonts w:ascii="Times New Roman" w:hAnsi="Times New Roman" w:cs="Times New Roman"/>
+        </w:rPr>
+        <w:t xml:space="preserve">“ ir </w:t>
+      </w:r>
+      <w:r>
+        <w:rPr>
+          <w:rFonts w:ascii="Times New Roman" w:hAnsi="Times New Roman" w:cs="Times New Roman"/>
+        </w:rPr>
+        <w:t>„</w:t>
+      </w:r>
+      <w:r>
+        <w:rPr>
+          <w:rFonts w:ascii="Times New Roman" w:hAnsi="Times New Roman" w:cs="Times New Roman"/>
+        </w:rPr>
+        <w:t>Prasiurbtas dujų tūris normaliosiomis sąlygomis Vmn, Nm3</w:t>
+      </w:r>
+      <w:r>
+        <w:rPr>
+          <w:rFonts w:ascii="Times New Roman" w:hAnsi="Times New Roman" w:cs="Times New Roman"/>
+        </w:rPr>
+        <w:t xml:space="preserve">“ reikšmes. Iš lapo „Aerodinamika“ į lapą „Greitis“ perkelia </w:t>
+      </w:r>
+      <w:r>
+        <w:rPr>
+          <w:rFonts w:ascii="Times New Roman" w:hAnsi="Times New Roman" w:cs="Times New Roman"/>
+        </w:rPr>
+        <w:t>„</w:t>
+      </w:r>
+      <w:r>
+        <w:rPr>
+          <w:rFonts w:ascii="Times New Roman" w:hAnsi="Times New Roman" w:cs="Times New Roman"/>
+        </w:rPr>
+        <w:t>Sausų dujų tankis normaliosioms sąlygomis qn, (kg/m3)</w:t>
+      </w:r>
+      <w:r>
+        <w:rPr>
+          <w:rFonts w:ascii="Times New Roman" w:hAnsi="Times New Roman" w:cs="Times New Roman"/>
+        </w:rPr>
+        <w:t>“ reikšmę.</w:t>
+      </w:r>
+    </w:p>
+    <w:p>
+      <w:pPr>
+        <w:spacing w:after="0"/>
+        <w:jc w:val="both"/>
+        <w:rPr>
+          <w:rFonts w:ascii="Times New Roman" w:hAnsi="Times New Roman" w:cs="Times New Roman"/>
+        </w:rPr>
+      </w:pPr>
+    </w:p>
+    <w:p>
+      <w:pPr>
+        <w:spacing w:after="0"/>
+        <w:jc w:val="both"/>
+        <w:rPr>
+          <w:rFonts w:ascii="Times New Roman" w:hAnsi="Times New Roman" w:cs="Times New Roman"/>
+        </w:rPr>
+      </w:pPr>
+      <w:r>
+        <w:rPr>
+          <w:rFonts w:ascii="Times New Roman" w:hAnsi="Times New Roman" w:cs="Times New Roman"/>
+        </w:rPr>
+        <w:t>13. AerodinamikaSK2Funkcija.py</w:t>
+      </w:r>
+      <w:r>
+        <w:rPr>
+          <w:rFonts w:ascii="Times New Roman" w:hAnsi="Times New Roman" w:cs="Times New Roman"/>
+        </w:rPr>
+        <w:t xml:space="preserve"> suskaičiuoja </w:t>
+      </w:r>
+      <w:r>
+        <w:rPr>
+          <w:rFonts w:ascii="Times New Roman" w:hAnsi="Times New Roman" w:cs="Times New Roman"/>
+        </w:rPr>
+        <w:t>„</w:t>
+      </w:r>
+      <w:r>
+        <w:rPr>
+          <w:rFonts w:ascii="Times New Roman" w:hAnsi="Times New Roman" w:cs="Times New Roman"/>
+        </w:rPr>
+        <w:t>Pratrauktas drėgnų dujų tūris realiomis sąlygomis Vmk (m3)</w:t>
+      </w:r>
+      <w:r>
+        <w:rPr>
+          <w:rFonts w:ascii="Times New Roman" w:hAnsi="Times New Roman" w:cs="Times New Roman"/>
+        </w:rPr>
+        <w:t>“ ir „</w:t>
+      </w:r>
+      <w:r>
+        <w:rPr>
+          <w:rFonts w:ascii="Times New Roman" w:hAnsi="Times New Roman" w:cs="Times New Roman"/>
+        </w:rPr>
+        <w:t>Dujų srauto greitis antgalyje v antg. (m/s)</w:t>
       </w:r>
       <w:r>
         <w:rPr>
@@ -1137,16 +1499,78 @@
         </w:rPr>
         <w:t>“</w:t>
       </w:r>
-    </w:p>
-    <w:p>
-      <w:pPr>
-        <w:spacing w:after="0"/>
-        <w:ind w:firstLine="284"/>
-        <w:jc w:val="both"/>
-        <w:rPr>
-          <w:rFonts w:ascii="Times New Roman" w:hAnsi="Times New Roman" w:cs="Times New Roman"/>
-        </w:rPr>
-      </w:pPr>
+      <w:r>
+        <w:rPr>
+          <w:rFonts w:ascii="Times New Roman" w:hAnsi="Times New Roman" w:cs="Times New Roman"/>
+        </w:rPr>
+        <w:t>.</w:t>
+      </w:r>
+    </w:p>
+    <w:p>
+      <w:pPr>
+        <w:spacing w:after="0"/>
+        <w:jc w:val="both"/>
+        <w:rPr>
+          <w:rFonts w:ascii="Times New Roman" w:hAnsi="Times New Roman" w:cs="Times New Roman"/>
+        </w:rPr>
+      </w:pPr>
+    </w:p>
+    <w:p>
+      <w:pPr>
+        <w:spacing w:after="0"/>
+        <w:jc w:val="both"/>
+        <w:rPr>
+          <w:rFonts w:ascii="Times New Roman" w:hAnsi="Times New Roman" w:cs="Times New Roman"/>
+        </w:rPr>
+      </w:pPr>
+      <w:r>
+        <w:rPr>
+          <w:rFonts w:ascii="Times New Roman" w:hAnsi="Times New Roman" w:cs="Times New Roman"/>
+        </w:rPr>
+        <w:t>12. GreitisSK1Funkcija.py</w:t>
+      </w:r>
+      <w:r>
+        <w:rPr>
+          <w:rFonts w:ascii="Times New Roman" w:hAnsi="Times New Roman" w:cs="Times New Roman"/>
+        </w:rPr>
+        <w:t xml:space="preserve"> suskaičiuoja </w:t>
+      </w:r>
+      <w:r>
+        <w:rPr>
+          <w:rFonts w:ascii="Times New Roman" w:hAnsi="Times New Roman" w:cs="Times New Roman"/>
+        </w:rPr>
+        <w:t>viską, kas skaičiuojama lape „Greitis“.</w:t>
+      </w:r>
+    </w:p>
+    <w:p>
+      <w:pPr>
+        <w:spacing w:after="0"/>
+        <w:jc w:val="both"/>
+        <w:rPr>
+          <w:rFonts w:ascii="Times New Roman" w:hAnsi="Times New Roman" w:cs="Times New Roman"/>
+        </w:rPr>
+      </w:pPr>
+    </w:p>
+    <w:p>
+      <w:pPr>
+        <w:spacing w:after="0"/>
+        <w:jc w:val="both"/>
+        <w:rPr>
+          <w:rFonts w:ascii="Times New Roman" w:hAnsi="Times New Roman" w:cs="Times New Roman"/>
+        </w:rPr>
+      </w:pPr>
+      <w:r>
+        <w:rPr>
+          <w:rFonts w:ascii="Times New Roman" w:hAnsi="Times New Roman" w:cs="Times New Roman"/>
+        </w:rPr>
+        <w:t>13. PaemimasSK2Funkcija.py</w:t>
+      </w:r>
+      <w:r>
+        <w:rPr>
+          <w:rFonts w:ascii="Times New Roman" w:hAnsi="Times New Roman" w:cs="Times New Roman"/>
+        </w:rPr>
+        <w:t xml:space="preserve"> perkelia greičių reikšmes iš lapo „Greitis“ į lapo „Paėmimas“ </w:t>
+      </w:r>
       <w:r>
         <w:rPr>
           <w:rFonts w:ascii="Times New Roman" w:hAnsi="Times New Roman" w:cs="Times New Roman"/>
@@ -1157,95 +1581,55 @@
         <w:rPr>
           <w:rFonts w:ascii="Times New Roman" w:hAnsi="Times New Roman" w:cs="Times New Roman"/>
         </w:rPr>
-        <w:t>Drėgmės kiekis X (%) (</w:t>
-      </w:r>
-      <w:proofErr w:type="spellStart"/>
-      <w:r>
-        <w:rPr>
-          <w:rFonts w:ascii="Times New Roman" w:hAnsi="Times New Roman" w:cs="Times New Roman"/>
-        </w:rPr>
-        <w:t>izokinetinei</w:t>
-      </w:r>
-      <w:proofErr w:type="spellEnd"/>
-      <w:r>
-        <w:rPr>
-          <w:rFonts w:ascii="Times New Roman" w:hAnsi="Times New Roman" w:cs="Times New Roman"/>
-        </w:rPr>
-        <w:t xml:space="preserve"> sistemai)</w:t>
-      </w:r>
-      <w:r>
-        <w:rPr>
-          <w:rFonts w:ascii="Times New Roman" w:hAnsi="Times New Roman" w:cs="Times New Roman"/>
-        </w:rPr>
-        <w:t>“.</w:t>
-      </w:r>
-    </w:p>
-    <w:p>
-      <w:pPr>
-        <w:spacing w:after="0"/>
-        <w:jc w:val="both"/>
-        <w:rPr>
-          <w:rFonts w:ascii="Times New Roman" w:hAnsi="Times New Roman" w:cs="Times New Roman"/>
-        </w:rPr>
-      </w:pPr>
-    </w:p>
-    <w:p>
-      <w:pPr>
-        <w:spacing w:after="0"/>
-        <w:jc w:val="both"/>
-        <w:rPr>
-          <w:rFonts w:ascii="Times New Roman" w:hAnsi="Times New Roman" w:cs="Times New Roman"/>
-        </w:rPr>
-      </w:pPr>
-      <w:r>
-        <w:rPr>
-          <w:rFonts w:ascii="Times New Roman" w:hAnsi="Times New Roman" w:cs="Times New Roman"/>
-        </w:rPr>
-        <w:t>9</w:t>
-      </w:r>
-      <w:r>
-        <w:rPr>
-          <w:rFonts w:ascii="Times New Roman" w:hAnsi="Times New Roman" w:cs="Times New Roman"/>
-        </w:rPr>
-        <w:t>. PaėmimasSK1Funkcija.py</w:t>
-      </w:r>
-      <w:r>
-        <w:rPr>
-          <w:rFonts w:ascii="Times New Roman" w:hAnsi="Times New Roman" w:cs="Times New Roman"/>
-        </w:rPr>
-        <w:t xml:space="preserve"> </w:t>
-      </w:r>
-      <w:r>
-        <w:rPr>
-          <w:rFonts w:ascii="Times New Roman" w:hAnsi="Times New Roman" w:cs="Times New Roman"/>
-        </w:rPr>
-        <w:t>atlieka visus skaičiavimus failo „Rezultatai.xlsx“ lape „Paėmimas“ išskyrus „</w:t>
-      </w:r>
-      <w:r>
-        <w:rPr>
-          <w:rFonts w:ascii="Times New Roman" w:hAnsi="Times New Roman" w:cs="Times New Roman"/>
-        </w:rPr>
-        <w:t xml:space="preserve">Srauto greitis ortakyje </w:t>
-      </w:r>
-      <w:proofErr w:type="spellStart"/>
-      <w:r>
-        <w:rPr>
-          <w:rFonts w:ascii="Times New Roman" w:hAnsi="Times New Roman" w:cs="Times New Roman"/>
-        </w:rPr>
-        <w:t>wor</w:t>
-      </w:r>
-      <w:proofErr w:type="spellEnd"/>
-      <w:r>
-        <w:rPr>
-          <w:rFonts w:ascii="Times New Roman" w:hAnsi="Times New Roman" w:cs="Times New Roman"/>
-        </w:rPr>
-        <w:t xml:space="preserve"> (m/s)</w:t>
-      </w:r>
-      <w:r>
-        <w:rPr>
-          <w:rFonts w:ascii="Times New Roman" w:hAnsi="Times New Roman" w:cs="Times New Roman"/>
-        </w:rPr>
-        <w:t xml:space="preserve">“ ir </w:t>
+        <w:t>Vidutinis srauto greitis ortakyje wor (m/s)</w:t>
+      </w:r>
+      <w:r>
+        <w:rPr>
+          <w:rFonts w:ascii="Times New Roman" w:hAnsi="Times New Roman" w:cs="Times New Roman"/>
+        </w:rPr>
+        <w:t>“ stulpelį.</w:t>
+      </w:r>
+    </w:p>
+    <w:p>
+      <w:pPr>
+        <w:spacing w:after="0"/>
+        <w:jc w:val="both"/>
+        <w:rPr>
+          <w:rFonts w:ascii="Times New Roman" w:hAnsi="Times New Roman" w:cs="Times New Roman"/>
+        </w:rPr>
+      </w:pPr>
+    </w:p>
+    <w:p>
+      <w:pPr>
+        <w:spacing w:after="0"/>
+        <w:jc w:val="both"/>
+        <w:rPr>
+          <w:rFonts w:ascii="Times New Roman" w:hAnsi="Times New Roman" w:cs="Times New Roman"/>
+        </w:rPr>
+      </w:pPr>
+      <w:r>
+        <w:rPr>
+          <w:rFonts w:ascii="Times New Roman" w:hAnsi="Times New Roman" w:cs="Times New Roman"/>
+        </w:rPr>
+        <w:t>14. AerodinamikaSK3Funkcija.py</w:t>
+      </w:r>
+      <w:r>
+        <w:rPr>
+          <w:rFonts w:ascii="Times New Roman" w:hAnsi="Times New Roman" w:cs="Times New Roman"/>
+        </w:rPr>
+        <w:t xml:space="preserve"> suskaičiuoja „</w:t>
+      </w:r>
+      <w:r>
+        <w:rPr>
+          <w:rFonts w:ascii="Times New Roman" w:hAnsi="Times New Roman" w:cs="Times New Roman"/>
+        </w:rPr>
+        <w:t>Izokinetiškumas (0,95-1,15)</w:t>
+      </w:r>
+      <w:r>
+        <w:rPr>
+          <w:rFonts w:ascii="Times New Roman" w:hAnsi="Times New Roman" w:cs="Times New Roman"/>
+        </w:rPr>
+        <w:t xml:space="preserve">“; </w:t>
       </w:r>
       <w:r>
         <w:rPr>
@@ -1253,799 +1637,11 @@
         </w:rPr>
         <w:t>„</w:t>
       </w:r>
-      <w:proofErr w:type="spellStart"/>
-      <w:r>
-        <w:rPr>
-          <w:rFonts w:ascii="Times New Roman" w:hAnsi="Times New Roman" w:cs="Times New Roman"/>
-        </w:rPr>
-        <w:t>Izokinetiškumas</w:t>
-      </w:r>
-      <w:proofErr w:type="spellEnd"/>
-      <w:r>
-        <w:rPr>
-          <w:rFonts w:ascii="Times New Roman" w:hAnsi="Times New Roman" w:cs="Times New Roman"/>
-        </w:rPr>
-        <w:t xml:space="preserve"> (0,95-1,15)</w:t>
-      </w:r>
-      <w:r>
-        <w:rPr>
-          <w:rFonts w:ascii="Times New Roman" w:hAnsi="Times New Roman" w:cs="Times New Roman"/>
-        </w:rPr>
-        <w:t xml:space="preserve">“. Į lapą „Greitis“ perkelia </w:t>
-      </w:r>
-      <w:r>
-        <w:rPr>
-          <w:rFonts w:ascii="Times New Roman" w:hAnsi="Times New Roman" w:cs="Times New Roman"/>
-        </w:rPr>
-        <w:t>„</w:t>
-      </w:r>
-      <w:r>
-        <w:rPr>
-          <w:rFonts w:ascii="Times New Roman" w:hAnsi="Times New Roman" w:cs="Times New Roman"/>
-        </w:rPr>
-        <w:t xml:space="preserve">Temperatūra ortakyje t, </w:t>
-      </w:r>
-      <w:proofErr w:type="spellStart"/>
-      <w:r>
-        <w:rPr>
-          <w:rFonts w:ascii="Times New Roman" w:hAnsi="Times New Roman" w:cs="Times New Roman"/>
-        </w:rPr>
-        <w:t>oC</w:t>
-      </w:r>
-      <w:proofErr w:type="spellEnd"/>
-      <w:r>
-        <w:rPr>
-          <w:rFonts w:ascii="Times New Roman" w:hAnsi="Times New Roman" w:cs="Times New Roman"/>
-        </w:rPr>
-        <w:t>“ reikšmes.</w:t>
-      </w:r>
-    </w:p>
-    <w:p>
-      <w:pPr>
-        <w:spacing w:after="0"/>
-        <w:jc w:val="both"/>
-        <w:rPr>
-          <w:rFonts w:ascii="Times New Roman" w:hAnsi="Times New Roman" w:cs="Times New Roman"/>
-        </w:rPr>
-      </w:pPr>
-    </w:p>
-    <w:p>
-      <w:pPr>
-        <w:spacing w:after="0"/>
-        <w:jc w:val="both"/>
-        <w:rPr>
-          <w:rFonts w:ascii="Times New Roman" w:hAnsi="Times New Roman" w:cs="Times New Roman"/>
-        </w:rPr>
-      </w:pPr>
-      <w:r>
-        <w:rPr>
-          <w:rFonts w:ascii="Times New Roman" w:hAnsi="Times New Roman" w:cs="Times New Roman"/>
-        </w:rPr>
-        <w:t>1</w:t>
-      </w:r>
-      <w:r>
-        <w:rPr>
-          <w:rFonts w:ascii="Times New Roman" w:hAnsi="Times New Roman" w:cs="Times New Roman"/>
-        </w:rPr>
-        <w:t>0</w:t>
-      </w:r>
-      <w:r>
-        <w:rPr>
-          <w:rFonts w:ascii="Times New Roman" w:hAnsi="Times New Roman" w:cs="Times New Roman"/>
-        </w:rPr>
-        <w:t>.</w:t>
-      </w:r>
-      <w:r>
-        <w:rPr>
-          <w:rFonts w:ascii="Times New Roman" w:hAnsi="Times New Roman" w:cs="Times New Roman"/>
-        </w:rPr>
-        <w:t xml:space="preserve"> </w:t>
-      </w:r>
-      <w:r>
-        <w:rPr>
-          <w:rFonts w:ascii="Times New Roman" w:hAnsi="Times New Roman" w:cs="Times New Roman"/>
-        </w:rPr>
-        <w:t>AerodinamikaSK1Funkcija.py</w:t>
-      </w:r>
-      <w:r>
-        <w:rPr>
-          <w:rFonts w:ascii="Times New Roman" w:hAnsi="Times New Roman" w:cs="Times New Roman"/>
-        </w:rPr>
-        <w:t xml:space="preserve"> suskaičiuoja šiuos stulpelius:</w:t>
-      </w:r>
-    </w:p>
-    <w:p>
-      <w:pPr>
-        <w:spacing w:after="0"/>
-        <w:jc w:val="both"/>
-        <w:rPr>
-          <w:rFonts w:ascii="Times New Roman" w:hAnsi="Times New Roman" w:cs="Times New Roman"/>
-        </w:rPr>
-      </w:pPr>
-      <w:r>
-        <w:rPr>
-          <w:rFonts w:ascii="Times New Roman" w:hAnsi="Times New Roman" w:cs="Times New Roman"/>
-        </w:rPr>
-        <w:t>„</w:t>
-      </w:r>
-      <w:r>
-        <w:rPr>
-          <w:rFonts w:ascii="Times New Roman" w:hAnsi="Times New Roman" w:cs="Times New Roman"/>
-        </w:rPr>
-        <w:t xml:space="preserve">Prasiurbtas dujų tūris </w:t>
-      </w:r>
-      <w:proofErr w:type="spellStart"/>
-      <w:r>
-        <w:rPr>
-          <w:rFonts w:ascii="Times New Roman" w:hAnsi="Times New Roman" w:cs="Times New Roman"/>
-        </w:rPr>
-        <w:t>Vm</w:t>
-      </w:r>
-      <w:proofErr w:type="spellEnd"/>
-      <w:r>
-        <w:rPr>
-          <w:rFonts w:ascii="Times New Roman" w:hAnsi="Times New Roman" w:cs="Times New Roman"/>
-        </w:rPr>
-        <w:t xml:space="preserve"> (m3)</w:t>
-      </w:r>
-      <w:r>
-        <w:rPr>
-          <w:rFonts w:ascii="Times New Roman" w:hAnsi="Times New Roman" w:cs="Times New Roman"/>
-        </w:rPr>
-        <w:t>“;</w:t>
-      </w:r>
-    </w:p>
-    <w:p>
-      <w:pPr>
-        <w:spacing w:after="0"/>
-        <w:jc w:val="both"/>
-        <w:rPr>
-          <w:rFonts w:ascii="Times New Roman" w:hAnsi="Times New Roman" w:cs="Times New Roman"/>
-        </w:rPr>
-      </w:pPr>
-      <w:r>
-        <w:rPr>
-          <w:rFonts w:ascii="Times New Roman" w:hAnsi="Times New Roman" w:cs="Times New Roman"/>
-        </w:rPr>
-        <w:t>„</w:t>
-      </w:r>
-      <w:r>
-        <w:rPr>
-          <w:rFonts w:ascii="Times New Roman" w:hAnsi="Times New Roman" w:cs="Times New Roman"/>
-        </w:rPr>
-        <w:t xml:space="preserve">Prasiurbtas dujų tūris normaliosiomis sąlygomis </w:t>
-      </w:r>
-      <w:proofErr w:type="spellStart"/>
-      <w:r>
-        <w:rPr>
-          <w:rFonts w:ascii="Times New Roman" w:hAnsi="Times New Roman" w:cs="Times New Roman"/>
-        </w:rPr>
-        <w:t>Vmn</w:t>
-      </w:r>
-      <w:proofErr w:type="spellEnd"/>
-      <w:r>
-        <w:rPr>
-          <w:rFonts w:ascii="Times New Roman" w:hAnsi="Times New Roman" w:cs="Times New Roman"/>
-        </w:rPr>
-        <w:t xml:space="preserve"> (Nm3)</w:t>
-      </w:r>
-      <w:r>
-        <w:rPr>
-          <w:rFonts w:ascii="Times New Roman" w:hAnsi="Times New Roman" w:cs="Times New Roman"/>
-        </w:rPr>
-        <w:t>“;</w:t>
-      </w:r>
-    </w:p>
-    <w:p>
-      <w:pPr>
-        <w:spacing w:after="0"/>
-        <w:jc w:val="both"/>
-        <w:rPr>
-          <w:rFonts w:ascii="Times New Roman" w:hAnsi="Times New Roman" w:cs="Times New Roman"/>
-        </w:rPr>
-      </w:pPr>
-      <w:r>
-        <w:rPr>
-          <w:rFonts w:ascii="Times New Roman" w:hAnsi="Times New Roman" w:cs="Times New Roman"/>
-        </w:rPr>
-        <w:t>„</w:t>
-      </w:r>
-      <w:r>
-        <w:rPr>
-          <w:rFonts w:ascii="Times New Roman" w:hAnsi="Times New Roman" w:cs="Times New Roman"/>
-        </w:rPr>
-        <w:t xml:space="preserve">Prasiurbto dujų tūrio normaliosiomis sąlygomis suma </w:t>
-      </w:r>
-      <w:proofErr w:type="spellStart"/>
-      <w:r>
-        <w:rPr>
-          <w:rFonts w:ascii="Times New Roman" w:hAnsi="Times New Roman" w:cs="Times New Roman"/>
-        </w:rPr>
-        <w:t>Vmn</w:t>
-      </w:r>
-      <w:proofErr w:type="spellEnd"/>
-      <w:r>
-        <w:rPr>
-          <w:rFonts w:ascii="Times New Roman" w:hAnsi="Times New Roman" w:cs="Times New Roman"/>
-        </w:rPr>
-        <w:t>(</w:t>
-      </w:r>
-      <w:proofErr w:type="spellStart"/>
-      <w:r>
-        <w:rPr>
-          <w:rFonts w:ascii="Times New Roman" w:hAnsi="Times New Roman" w:cs="Times New Roman"/>
-        </w:rPr>
-        <w:t>sum</w:t>
-      </w:r>
-      <w:proofErr w:type="spellEnd"/>
-      <w:r>
-        <w:rPr>
-          <w:rFonts w:ascii="Times New Roman" w:hAnsi="Times New Roman" w:cs="Times New Roman"/>
-        </w:rPr>
-        <w:t>) (Nm3)</w:t>
-      </w:r>
-      <w:r>
-        <w:rPr>
-          <w:rFonts w:ascii="Times New Roman" w:hAnsi="Times New Roman" w:cs="Times New Roman"/>
-        </w:rPr>
-        <w:t>“</w:t>
-      </w:r>
-      <w:r>
-        <w:rPr>
-          <w:rFonts w:ascii="Times New Roman" w:hAnsi="Times New Roman" w:cs="Times New Roman"/>
-        </w:rPr>
-        <w:t>, čia dar suskaičiuoja sumų sumas pabaigoje.</w:t>
-      </w:r>
-    </w:p>
-    <w:p>
-      <w:pPr>
-        <w:spacing w:after="0"/>
-        <w:jc w:val="both"/>
-        <w:rPr>
-          <w:rFonts w:ascii="Times New Roman" w:hAnsi="Times New Roman" w:cs="Times New Roman"/>
-        </w:rPr>
-      </w:pPr>
-      <w:r>
-        <w:rPr>
-          <w:rFonts w:ascii="Times New Roman" w:hAnsi="Times New Roman" w:cs="Times New Roman"/>
-        </w:rPr>
-        <w:t>„</w:t>
-      </w:r>
-      <w:r>
-        <w:rPr>
-          <w:rFonts w:ascii="Times New Roman" w:hAnsi="Times New Roman" w:cs="Times New Roman"/>
-        </w:rPr>
-        <w:t xml:space="preserve">Sausų dujų tankis normaliosioms sąlygomis </w:t>
-      </w:r>
-      <w:proofErr w:type="spellStart"/>
-      <w:r>
-        <w:rPr>
-          <w:rFonts w:ascii="Times New Roman" w:hAnsi="Times New Roman" w:cs="Times New Roman"/>
-        </w:rPr>
-        <w:t>qn</w:t>
-      </w:r>
-      <w:proofErr w:type="spellEnd"/>
-      <w:r>
-        <w:rPr>
-          <w:rFonts w:ascii="Times New Roman" w:hAnsi="Times New Roman" w:cs="Times New Roman"/>
-        </w:rPr>
-        <w:t xml:space="preserve"> (kg/m3)</w:t>
-      </w:r>
-      <w:r>
-        <w:rPr>
-          <w:rFonts w:ascii="Times New Roman" w:hAnsi="Times New Roman" w:cs="Times New Roman"/>
-        </w:rPr>
-        <w:t>“</w:t>
-      </w:r>
-      <w:r>
-        <w:rPr>
-          <w:rFonts w:ascii="Times New Roman" w:hAnsi="Times New Roman" w:cs="Times New Roman"/>
-        </w:rPr>
-        <w:t>, čia dar suskaičiuoja vidurkius ir vidurkių vidurkius</w:t>
-      </w:r>
-      <w:r>
-        <w:rPr>
-          <w:rFonts w:ascii="Times New Roman" w:hAnsi="Times New Roman" w:cs="Times New Roman"/>
-        </w:rPr>
-        <w:t xml:space="preserve"> pabaigoje. Vidurkių vidurkį perkelia į „H2O“ lapo </w:t>
-      </w:r>
-      <w:r>
-        <w:rPr>
-          <w:rFonts w:ascii="Times New Roman" w:hAnsi="Times New Roman" w:cs="Times New Roman"/>
-        </w:rPr>
-        <w:t xml:space="preserve">Sausų dujų tankis normaliosioms sąlygomis </w:t>
-      </w:r>
-      <w:proofErr w:type="spellStart"/>
-      <w:r>
-        <w:rPr>
-          <w:rFonts w:ascii="Times New Roman" w:hAnsi="Times New Roman" w:cs="Times New Roman"/>
-        </w:rPr>
-        <w:t>qn</w:t>
-      </w:r>
-      <w:proofErr w:type="spellEnd"/>
-      <w:r>
-        <w:rPr>
-          <w:rFonts w:ascii="Times New Roman" w:hAnsi="Times New Roman" w:cs="Times New Roman"/>
-        </w:rPr>
-        <w:t xml:space="preserve"> (kg/m3)</w:t>
-      </w:r>
-      <w:r>
-        <w:rPr>
-          <w:rFonts w:ascii="Times New Roman" w:hAnsi="Times New Roman" w:cs="Times New Roman"/>
-        </w:rPr>
-        <w:t>“ langelį.</w:t>
-      </w:r>
-    </w:p>
-    <w:p>
-      <w:pPr>
-        <w:spacing w:after="0"/>
-        <w:jc w:val="both"/>
-        <w:rPr>
-          <w:rFonts w:ascii="Times New Roman" w:hAnsi="Times New Roman" w:cs="Times New Roman"/>
-        </w:rPr>
-      </w:pPr>
-    </w:p>
-    <w:p>
-      <w:pPr>
-        <w:spacing w:after="0"/>
-        <w:jc w:val="both"/>
-        <w:rPr>
-          <w:rFonts w:ascii="Times New Roman" w:hAnsi="Times New Roman" w:cs="Times New Roman"/>
-        </w:rPr>
-      </w:pPr>
-      <w:r>
-        <w:rPr>
-          <w:rFonts w:ascii="Times New Roman" w:hAnsi="Times New Roman" w:cs="Times New Roman"/>
-        </w:rPr>
-        <w:t>1</w:t>
-      </w:r>
-      <w:r>
-        <w:rPr>
-          <w:rFonts w:ascii="Times New Roman" w:hAnsi="Times New Roman" w:cs="Times New Roman"/>
-        </w:rPr>
-        <w:t>1</w:t>
-      </w:r>
-      <w:r>
-        <w:rPr>
-          <w:rFonts w:ascii="Times New Roman" w:hAnsi="Times New Roman" w:cs="Times New Roman"/>
-        </w:rPr>
-        <w:t>. H2OSK2Funkcija.py</w:t>
-      </w:r>
-      <w:r>
-        <w:rPr>
-          <w:rFonts w:ascii="Times New Roman" w:hAnsi="Times New Roman" w:cs="Times New Roman"/>
-        </w:rPr>
-        <w:t xml:space="preserve"> suskaičiuoja vie</w:t>
-      </w:r>
-      <w:r>
-        <w:rPr>
-          <w:rFonts w:ascii="Times New Roman" w:hAnsi="Times New Roman" w:cs="Times New Roman"/>
-        </w:rPr>
-        <w:t>nintelę likusią reikšmę lape „H2O“ „</w:t>
-      </w:r>
-      <w:r>
-        <w:rPr>
-          <w:rFonts w:ascii="Times New Roman" w:hAnsi="Times New Roman" w:cs="Times New Roman"/>
-        </w:rPr>
-        <w:t>Drėgmės kiekis X (%) (</w:t>
-      </w:r>
-      <w:proofErr w:type="spellStart"/>
-      <w:r>
-        <w:rPr>
-          <w:rFonts w:ascii="Times New Roman" w:hAnsi="Times New Roman" w:cs="Times New Roman"/>
-        </w:rPr>
-        <w:t>izokinetinei</w:t>
-      </w:r>
-      <w:proofErr w:type="spellEnd"/>
-      <w:r>
-        <w:rPr>
-          <w:rFonts w:ascii="Times New Roman" w:hAnsi="Times New Roman" w:cs="Times New Roman"/>
-        </w:rPr>
-        <w:t xml:space="preserve"> sistemai)</w:t>
-      </w:r>
-      <w:r>
-        <w:rPr>
-          <w:rFonts w:ascii="Times New Roman" w:hAnsi="Times New Roman" w:cs="Times New Roman"/>
-        </w:rPr>
-        <w:t>“.</w:t>
-      </w:r>
-    </w:p>
-    <w:p>
-      <w:pPr>
-        <w:spacing w:after="0"/>
-        <w:jc w:val="both"/>
-        <w:rPr>
-          <w:rFonts w:ascii="Times New Roman" w:hAnsi="Times New Roman" w:cs="Times New Roman"/>
-        </w:rPr>
-      </w:pPr>
-    </w:p>
-    <w:p>
-      <w:pPr>
-        <w:spacing w:after="0"/>
-        <w:jc w:val="both"/>
-        <w:rPr>
-          <w:rFonts w:ascii="Times New Roman" w:hAnsi="Times New Roman" w:cs="Times New Roman"/>
-        </w:rPr>
-      </w:pPr>
-      <w:r>
-        <w:rPr>
-          <w:rFonts w:ascii="Times New Roman" w:hAnsi="Times New Roman" w:cs="Times New Roman"/>
-        </w:rPr>
-        <w:t>12. H2OSK3Funkcija.py</w:t>
-      </w:r>
-      <w:r>
-        <w:rPr>
-          <w:rFonts w:ascii="Times New Roman" w:hAnsi="Times New Roman" w:cs="Times New Roman"/>
-        </w:rPr>
-        <w:t xml:space="preserve"> </w:t>
-      </w:r>
-      <w:r>
-        <w:rPr>
-          <w:rFonts w:ascii="Times New Roman" w:hAnsi="Times New Roman" w:cs="Times New Roman"/>
-        </w:rPr>
-        <w:t xml:space="preserve">iš lapo „H2O“ į lapą „Aerodinamika“ perkelia </w:t>
-      </w:r>
-      <w:r>
-        <w:rPr>
-          <w:rFonts w:ascii="Times New Roman" w:hAnsi="Times New Roman" w:cs="Times New Roman"/>
-        </w:rPr>
-        <w:t>„</w:t>
-      </w:r>
-      <w:r>
-        <w:rPr>
-          <w:rFonts w:ascii="Times New Roman" w:hAnsi="Times New Roman" w:cs="Times New Roman"/>
-        </w:rPr>
-        <w:t>Drėgmės kiekis X (%)</w:t>
-      </w:r>
-      <w:r>
-        <w:rPr>
-          <w:rFonts w:ascii="Times New Roman" w:hAnsi="Times New Roman" w:cs="Times New Roman"/>
-        </w:rPr>
-        <w:t xml:space="preserve">“ reikšmes. Iš lapo „H2O“ į lapą „Greitis“ perkelia </w:t>
-      </w:r>
-      <w:r>
-        <w:rPr>
-          <w:rFonts w:ascii="Times New Roman" w:hAnsi="Times New Roman" w:cs="Times New Roman"/>
-        </w:rPr>
-        <w:t>„</w:t>
-      </w:r>
-      <w:r>
-        <w:rPr>
-          <w:rFonts w:ascii="Times New Roman" w:hAnsi="Times New Roman" w:cs="Times New Roman"/>
-        </w:rPr>
-        <w:t>Vandens kondensato masė m H2O, kg</w:t>
-      </w:r>
-      <w:r>
-        <w:rPr>
-          <w:rFonts w:ascii="Times New Roman" w:hAnsi="Times New Roman" w:cs="Times New Roman"/>
-        </w:rPr>
-        <w:t xml:space="preserve">“ ir </w:t>
-      </w:r>
-      <w:r>
-        <w:rPr>
-          <w:rFonts w:ascii="Times New Roman" w:hAnsi="Times New Roman" w:cs="Times New Roman"/>
-        </w:rPr>
-        <w:t>„</w:t>
-      </w:r>
-      <w:r>
-        <w:rPr>
-          <w:rFonts w:ascii="Times New Roman" w:hAnsi="Times New Roman" w:cs="Times New Roman"/>
-        </w:rPr>
-        <w:t xml:space="preserve">Prasiurbtas dujų tūris normaliosiomis sąlygomis </w:t>
-      </w:r>
-      <w:proofErr w:type="spellStart"/>
-      <w:r>
-        <w:rPr>
-          <w:rFonts w:ascii="Times New Roman" w:hAnsi="Times New Roman" w:cs="Times New Roman"/>
-        </w:rPr>
-        <w:t>Vmn</w:t>
-      </w:r>
-      <w:proofErr w:type="spellEnd"/>
-      <w:r>
-        <w:rPr>
-          <w:rFonts w:ascii="Times New Roman" w:hAnsi="Times New Roman" w:cs="Times New Roman"/>
-        </w:rPr>
-        <w:t>, Nm3</w:t>
-      </w:r>
-      <w:r>
-        <w:rPr>
-          <w:rFonts w:ascii="Times New Roman" w:hAnsi="Times New Roman" w:cs="Times New Roman"/>
-        </w:rPr>
-        <w:t xml:space="preserve">“ reikšmes. Iš lapo „Aerodinamika“ į lapą „Greitis“ perkelia </w:t>
-      </w:r>
-      <w:r>
-        <w:rPr>
-          <w:rFonts w:ascii="Times New Roman" w:hAnsi="Times New Roman" w:cs="Times New Roman"/>
-        </w:rPr>
-        <w:t>„</w:t>
-      </w:r>
-      <w:r>
-        <w:rPr>
-          <w:rFonts w:ascii="Times New Roman" w:hAnsi="Times New Roman" w:cs="Times New Roman"/>
-        </w:rPr>
-        <w:t xml:space="preserve">Sausų dujų tankis normaliosioms sąlygomis </w:t>
-      </w:r>
-      <w:proofErr w:type="spellStart"/>
-      <w:r>
-        <w:rPr>
-          <w:rFonts w:ascii="Times New Roman" w:hAnsi="Times New Roman" w:cs="Times New Roman"/>
-        </w:rPr>
-        <w:t>qn</w:t>
-      </w:r>
-      <w:proofErr w:type="spellEnd"/>
-      <w:r>
-        <w:rPr>
-          <w:rFonts w:ascii="Times New Roman" w:hAnsi="Times New Roman" w:cs="Times New Roman"/>
-        </w:rPr>
-        <w:t>, (kg/m3)</w:t>
-      </w:r>
-      <w:r>
-        <w:rPr>
-          <w:rFonts w:ascii="Times New Roman" w:hAnsi="Times New Roman" w:cs="Times New Roman"/>
-        </w:rPr>
-        <w:t>“ reikšmę.</w:t>
-      </w:r>
-    </w:p>
-    <w:p>
-      <w:pPr>
-        <w:spacing w:after="0"/>
-        <w:jc w:val="both"/>
-        <w:rPr>
-          <w:rFonts w:ascii="Times New Roman" w:hAnsi="Times New Roman" w:cs="Times New Roman"/>
-        </w:rPr>
-      </w:pPr>
-    </w:p>
-    <w:p>
-      <w:pPr>
-        <w:spacing w:after="0"/>
-        <w:jc w:val="both"/>
-        <w:rPr>
-          <w:rFonts w:ascii="Times New Roman" w:hAnsi="Times New Roman" w:cs="Times New Roman"/>
-        </w:rPr>
-      </w:pPr>
-      <w:r>
-        <w:rPr>
-          <w:rFonts w:ascii="Times New Roman" w:hAnsi="Times New Roman" w:cs="Times New Roman"/>
-        </w:rPr>
-        <w:t>13. AerodinamikaSK2Funkcija.py</w:t>
-      </w:r>
-      <w:r>
-        <w:rPr>
-          <w:rFonts w:ascii="Times New Roman" w:hAnsi="Times New Roman" w:cs="Times New Roman"/>
-        </w:rPr>
-        <w:t xml:space="preserve"> suskaičiuoja </w:t>
-      </w:r>
-      <w:r>
-        <w:rPr>
-          <w:rFonts w:ascii="Times New Roman" w:hAnsi="Times New Roman" w:cs="Times New Roman"/>
-        </w:rPr>
-        <w:t>„</w:t>
-      </w:r>
-      <w:r>
-        <w:rPr>
-          <w:rFonts w:ascii="Times New Roman" w:hAnsi="Times New Roman" w:cs="Times New Roman"/>
-        </w:rPr>
-        <w:t xml:space="preserve">Pratrauktas drėgnų dujų tūris realiomis sąlygomis </w:t>
-      </w:r>
-      <w:proofErr w:type="spellStart"/>
-      <w:r>
-        <w:rPr>
-          <w:rFonts w:ascii="Times New Roman" w:hAnsi="Times New Roman" w:cs="Times New Roman"/>
-        </w:rPr>
-        <w:t>Vmk</w:t>
-      </w:r>
-      <w:proofErr w:type="spellEnd"/>
-      <w:r>
-        <w:rPr>
-          <w:rFonts w:ascii="Times New Roman" w:hAnsi="Times New Roman" w:cs="Times New Roman"/>
-        </w:rPr>
-        <w:t xml:space="preserve"> (m3)</w:t>
-      </w:r>
-      <w:r>
-        <w:rPr>
-          <w:rFonts w:ascii="Times New Roman" w:hAnsi="Times New Roman" w:cs="Times New Roman"/>
-        </w:rPr>
-        <w:t>“ ir „</w:t>
-      </w:r>
-      <w:r>
-        <w:rPr>
-          <w:rFonts w:ascii="Times New Roman" w:hAnsi="Times New Roman" w:cs="Times New Roman"/>
-        </w:rPr>
-        <w:t xml:space="preserve">Dujų srauto greitis antgalyje v </w:t>
-      </w:r>
-      <w:proofErr w:type="spellStart"/>
-      <w:r>
-        <w:rPr>
-          <w:rFonts w:ascii="Times New Roman" w:hAnsi="Times New Roman" w:cs="Times New Roman"/>
-        </w:rPr>
-        <w:t>antg</w:t>
-      </w:r>
-      <w:proofErr w:type="spellEnd"/>
-      <w:r>
-        <w:rPr>
-          <w:rFonts w:ascii="Times New Roman" w:hAnsi="Times New Roman" w:cs="Times New Roman"/>
-        </w:rPr>
-        <w:t>. (m/s)</w:t>
-      </w:r>
-      <w:r>
-        <w:rPr>
-          <w:rFonts w:ascii="Times New Roman" w:hAnsi="Times New Roman" w:cs="Times New Roman"/>
-        </w:rPr>
-        <w:t>“</w:t>
-      </w:r>
-      <w:r>
-        <w:rPr>
-          <w:rFonts w:ascii="Times New Roman" w:hAnsi="Times New Roman" w:cs="Times New Roman"/>
-        </w:rPr>
-        <w:t>.</w:t>
-      </w:r>
-    </w:p>
-    <w:p>
-      <w:pPr>
-        <w:spacing w:after="0"/>
-        <w:jc w:val="both"/>
-        <w:rPr>
-          <w:rFonts w:ascii="Times New Roman" w:hAnsi="Times New Roman" w:cs="Times New Roman"/>
-        </w:rPr>
-      </w:pPr>
-    </w:p>
-    <w:p>
-      <w:pPr>
-        <w:spacing w:after="0"/>
-        <w:jc w:val="both"/>
-        <w:rPr>
-          <w:rFonts w:ascii="Times New Roman" w:hAnsi="Times New Roman" w:cs="Times New Roman"/>
-        </w:rPr>
-      </w:pPr>
-      <w:r>
-        <w:rPr>
-          <w:rFonts w:ascii="Times New Roman" w:hAnsi="Times New Roman" w:cs="Times New Roman"/>
-        </w:rPr>
-        <w:t>12. GreitisSK1Funkcija.py</w:t>
-      </w:r>
-      <w:r>
-        <w:rPr>
-          <w:rFonts w:ascii="Times New Roman" w:hAnsi="Times New Roman" w:cs="Times New Roman"/>
-        </w:rPr>
-        <w:t xml:space="preserve"> suskaičiuoja </w:t>
-      </w:r>
-      <w:r>
-        <w:rPr>
-          <w:rFonts w:ascii="Times New Roman" w:hAnsi="Times New Roman" w:cs="Times New Roman"/>
-        </w:rPr>
-        <w:t>viską, kas skaičiuojama lape „Greitis“.</w:t>
-      </w:r>
-    </w:p>
-    <w:p>
-      <w:pPr>
-        <w:spacing w:after="0"/>
-        <w:jc w:val="both"/>
-        <w:rPr>
-          <w:rFonts w:ascii="Times New Roman" w:hAnsi="Times New Roman" w:cs="Times New Roman"/>
-        </w:rPr>
-      </w:pPr>
-    </w:p>
-    <w:p>
-      <w:pPr>
-        <w:spacing w:after="0"/>
-        <w:jc w:val="both"/>
-        <w:rPr>
-          <w:rFonts w:ascii="Times New Roman" w:hAnsi="Times New Roman" w:cs="Times New Roman"/>
-        </w:rPr>
-      </w:pPr>
-      <w:r>
-        <w:rPr>
-          <w:rFonts w:ascii="Times New Roman" w:hAnsi="Times New Roman" w:cs="Times New Roman"/>
-        </w:rPr>
-        <w:t>13. PaemimasSK2Funkcija.py</w:t>
-      </w:r>
-      <w:r>
-        <w:rPr>
-          <w:rFonts w:ascii="Times New Roman" w:hAnsi="Times New Roman" w:cs="Times New Roman"/>
-        </w:rPr>
-        <w:t xml:space="preserve"> perkelia greičių reikšmes iš lapo „Greitis“ į lapo „Paėmimas“ </w:t>
-      </w:r>
-      <w:r>
-        <w:rPr>
-          <w:rFonts w:ascii="Times New Roman" w:hAnsi="Times New Roman" w:cs="Times New Roman"/>
-        </w:rPr>
-        <w:t>„</w:t>
-      </w:r>
-      <w:r>
-        <w:rPr>
-          <w:rFonts w:ascii="Times New Roman" w:hAnsi="Times New Roman" w:cs="Times New Roman"/>
-        </w:rPr>
-        <w:t xml:space="preserve">Vidutinis srauto greitis ortakyje </w:t>
-      </w:r>
-      <w:proofErr w:type="spellStart"/>
-      <w:r>
-        <w:rPr>
-          <w:rFonts w:ascii="Times New Roman" w:hAnsi="Times New Roman" w:cs="Times New Roman"/>
-        </w:rPr>
-        <w:t>wor</w:t>
-      </w:r>
-      <w:proofErr w:type="spellEnd"/>
-      <w:r>
-        <w:rPr>
-          <w:rFonts w:ascii="Times New Roman" w:hAnsi="Times New Roman" w:cs="Times New Roman"/>
-        </w:rPr>
-        <w:t xml:space="preserve"> (m/s)</w:t>
-      </w:r>
-      <w:r>
-        <w:rPr>
-          <w:rFonts w:ascii="Times New Roman" w:hAnsi="Times New Roman" w:cs="Times New Roman"/>
-        </w:rPr>
-        <w:t>“ stulpelį.</w:t>
-      </w:r>
-    </w:p>
-    <w:p>
-      <w:pPr>
-        <w:spacing w:after="0"/>
-        <w:jc w:val="both"/>
-        <w:rPr>
-          <w:rFonts w:ascii="Times New Roman" w:hAnsi="Times New Roman" w:cs="Times New Roman"/>
-        </w:rPr>
-      </w:pPr>
-    </w:p>
-    <w:p>
-      <w:pPr>
-        <w:spacing w:after="0"/>
-        <w:jc w:val="both"/>
-        <w:rPr>
-          <w:rFonts w:ascii="Times New Roman" w:hAnsi="Times New Roman" w:cs="Times New Roman"/>
-        </w:rPr>
-      </w:pPr>
-      <w:r>
-        <w:rPr>
-          <w:rFonts w:ascii="Times New Roman" w:hAnsi="Times New Roman" w:cs="Times New Roman"/>
-        </w:rPr>
-        <w:t>14. AerodinamikaSK3Funkcija.py</w:t>
-      </w:r>
-      <w:r>
-        <w:rPr>
-          <w:rFonts w:ascii="Times New Roman" w:hAnsi="Times New Roman" w:cs="Times New Roman"/>
-        </w:rPr>
-        <w:t xml:space="preserve"> suskaičiuoja „</w:t>
-      </w:r>
-      <w:proofErr w:type="spellStart"/>
-      <w:r>
-        <w:rPr>
-          <w:rFonts w:ascii="Times New Roman" w:hAnsi="Times New Roman" w:cs="Times New Roman"/>
-        </w:rPr>
-        <w:t>Izokinetiškumas</w:t>
-      </w:r>
-      <w:proofErr w:type="spellEnd"/>
-      <w:r>
-        <w:rPr>
-          <w:rFonts w:ascii="Times New Roman" w:hAnsi="Times New Roman" w:cs="Times New Roman"/>
-        </w:rPr>
-        <w:t xml:space="preserve"> (0,95-1,15)</w:t>
-      </w:r>
-      <w:r>
-        <w:rPr>
-          <w:rFonts w:ascii="Times New Roman" w:hAnsi="Times New Roman" w:cs="Times New Roman"/>
-        </w:rPr>
-        <w:t xml:space="preserve">“; </w:t>
-      </w:r>
-      <w:r>
-        <w:rPr>
-          <w:rFonts w:ascii="Times New Roman" w:hAnsi="Times New Roman" w:cs="Times New Roman"/>
-        </w:rPr>
-        <w:t>„</w:t>
-      </w:r>
-      <w:proofErr w:type="spellStart"/>
-      <w:r>
-        <w:rPr>
-          <w:rFonts w:ascii="Times New Roman" w:hAnsi="Times New Roman" w:cs="Times New Roman"/>
-        </w:rPr>
-        <w:t>Izokinetiškumo</w:t>
-      </w:r>
-      <w:proofErr w:type="spellEnd"/>
-      <w:r>
-        <w:rPr>
-          <w:rFonts w:ascii="Times New Roman" w:hAnsi="Times New Roman" w:cs="Times New Roman"/>
-        </w:rPr>
-        <w:t xml:space="preserve"> vidurkis (0,95-1,15)</w:t>
+      <w:r>
+        <w:rPr>
+          <w:rFonts w:ascii="Times New Roman" w:hAnsi="Times New Roman" w:cs="Times New Roman"/>
+        </w:rPr>
+        <w:t>Izokinetiškumo vidurkis (0,95-1,15)</w:t>
       </w:r>
       <w:r>
         <w:rPr>
@@ -2076,6 +1672,30 @@
           <w:rFonts w:ascii="Times New Roman" w:hAnsi="Times New Roman" w:cs="Times New Roman"/>
         </w:rPr>
         <w:lastRenderedPageBreak/>
+        <w:t>15. IzokinetiskumasFunkcija.py parenka siurbimo greičio ir antgalio kombinacijas geriausiam izokinetiškumui gauti.</w:t>
+      </w:r>
+    </w:p>
+    <w:p>
+      <w:pPr>
+        <w:spacing w:after="0"/>
+        <w:jc w:val="both"/>
+        <w:rPr>
+          <w:rFonts w:ascii="Times New Roman" w:hAnsi="Times New Roman" w:cs="Times New Roman"/>
+        </w:rPr>
+      </w:pPr>
+    </w:p>
+    <w:p>
+      <w:pPr>
+        <w:spacing w:after="0"/>
+        <w:jc w:val="both"/>
+        <w:rPr>
+          <w:rFonts w:ascii="Times New Roman" w:hAnsi="Times New Roman" w:cs="Times New Roman"/>
+        </w:rPr>
+      </w:pPr>
+      <w:r>
+        <w:rPr>
+          <w:rFonts w:ascii="Times New Roman" w:hAnsi="Times New Roman" w:cs="Times New Roman"/>
+        </w:rPr>
         <w:t>1</w:t>
       </w:r>
       <w:r>
@@ -3618,26 +3238,6 @@
 </file>
 
 <file path=customXml/item1.xml><?xml version="1.0" encoding="utf-8"?>
-<p:properties xmlns:p="http://schemas.microsoft.com/office/2006/metadata/properties" xmlns:xsi="http://www.w3.org/2001/XMLSchema-instance" xmlns:pc="http://schemas.microsoft.com/office/infopath/2007/PartnerControls">
-  <documentManagement>
-    <lcf76f155ced4ddcb4097134ff3c332f xmlns="453e7e53-5eb2-45cf-b2ab-34c867e554b8">
-      <Terms xmlns="http://schemas.microsoft.com/office/infopath/2007/PartnerControls"/>
-    </lcf76f155ced4ddcb4097134ff3c332f>
-    <TaxCatchAll xmlns="aa0d983d-359a-438c-9953-3af1a8ac0831" xsi:nil="true"/>
-  </documentManagement>
-</p:properties>
-</file>
-
-<file path=customXml/item2.xml><?xml version="1.0" encoding="utf-8"?>
-<?mso-contentType ?>
-<FormTemplates xmlns="http://schemas.microsoft.com/sharepoint/v3/contenttype/forms">
-  <Display>DocumentLibraryForm</Display>
-  <Edit>DocumentLibraryForm</Edit>
-  <New>DocumentLibraryForm</New>
-</FormTemplates>
-</file>
-
-<file path=customXml/item3.xml><?xml version="1.0" encoding="utf-8"?>
 <ct:contentTypeSchema xmlns:ct="http://schemas.microsoft.com/office/2006/metadata/contentType" xmlns:ma="http://schemas.microsoft.com/office/2006/metadata/properties/metaAttributes" ct:_="" ma:_="" ma:contentTypeName="Dokumentas" ma:contentTypeID="0x010100BAB57CF81AE55C4698AAD22D302297F0" ma:contentTypeVersion="18" ma:contentTypeDescription="Kurkite naują dokumentą." ma:contentTypeScope="" ma:versionID="49ab401eb4052690d2a2629974c22fd6">
   <xsd:schema xmlns:xsd="http://www.w3.org/2001/XMLSchema" xmlns:xs="http://www.w3.org/2001/XMLSchema" xmlns:p="http://schemas.microsoft.com/office/2006/metadata/properties" xmlns:ns2="453e7e53-5eb2-45cf-b2ab-34c867e554b8" xmlns:ns3="aa0d983d-359a-438c-9953-3af1a8ac0831" targetNamespace="http://schemas.microsoft.com/office/2006/metadata/properties" ma:root="true" ma:fieldsID="ab9969d50e0b13c63bc5bd0499c928dc" ns2:_="" ns3:_="">
     <xsd:import namespace="453e7e53-5eb2-45cf-b2ab-34c867e554b8"/>
@@ -3892,26 +3492,27 @@
 </ct:contentTypeSchema>
 </file>
 
-<file path=customXml/itemProps1.xml><?xml version="1.0" encoding="utf-8"?>
-<ds:datastoreItem xmlns:ds="http://schemas.openxmlformats.org/officeDocument/2006/customXml" ds:itemID="{52F8D590-B38F-4B4A-8BDD-FD59D16A4DE7}">
-  <ds:schemaRefs>
-    <ds:schemaRef ds:uri="http://schemas.microsoft.com/office/2006/metadata/properties"/>
-    <ds:schemaRef ds:uri="http://schemas.microsoft.com/office/infopath/2007/PartnerControls"/>
-    <ds:schemaRef ds:uri="453e7e53-5eb2-45cf-b2ab-34c867e554b8"/>
-    <ds:schemaRef ds:uri="aa0d983d-359a-438c-9953-3af1a8ac0831"/>
-  </ds:schemaRefs>
-</ds:datastoreItem>
+<file path=customXml/item2.xml><?xml version="1.0" encoding="utf-8"?>
+<?mso-contentType ?>
+<FormTemplates xmlns="http://schemas.microsoft.com/sharepoint/v3/contenttype/forms">
+  <Display>DocumentLibraryForm</Display>
+  <Edit>DocumentLibraryForm</Edit>
+  <New>DocumentLibraryForm</New>
+</FormTemplates>
 </file>
 
-<file path=customXml/itemProps2.xml><?xml version="1.0" encoding="utf-8"?>
-<ds:datastoreItem xmlns:ds="http://schemas.openxmlformats.org/officeDocument/2006/customXml" ds:itemID="{47D7D20A-5C87-427E-8B8D-3343B9C6406D}">
-  <ds:schemaRefs>
-    <ds:schemaRef ds:uri="http://schemas.microsoft.com/sharepoint/v3/contenttype/forms"/>
-  </ds:schemaRefs>
-</ds:datastoreItem>
+<file path=customXml/item3.xml><?xml version="1.0" encoding="utf-8"?>
+<p:properties xmlns:p="http://schemas.microsoft.com/office/2006/metadata/properties" xmlns:xsi="http://www.w3.org/2001/XMLSchema-instance" xmlns:pc="http://schemas.microsoft.com/office/infopath/2007/PartnerControls">
+  <documentManagement>
+    <lcf76f155ced4ddcb4097134ff3c332f xmlns="453e7e53-5eb2-45cf-b2ab-34c867e554b8">
+      <Terms xmlns="http://schemas.microsoft.com/office/infopath/2007/PartnerControls"/>
+    </lcf76f155ced4ddcb4097134ff3c332f>
+    <TaxCatchAll xmlns="aa0d983d-359a-438c-9953-3af1a8ac0831" xsi:nil="true"/>
+  </documentManagement>
+</p:properties>
 </file>
 
-<file path=customXml/itemProps3.xml><?xml version="1.0" encoding="utf-8"?>
+<file path=customXml/itemProps1.xml><?xml version="1.0" encoding="utf-8"?>
 <ds:datastoreItem xmlns:ds="http://schemas.openxmlformats.org/officeDocument/2006/customXml" ds:itemID="{CC52CDA6-DE27-4DDF-B41E-8471831E0206}">
   <ds:schemaRefs>
     <ds:schemaRef ds:uri="http://schemas.microsoft.com/office/2006/metadata/contentType"/>
@@ -3928,4 +3529,23 @@
     <ds:schemaRef ds:uri="http://schemas.microsoft.com/internal/obd"/>
   </ds:schemaRefs>
 </ds:datastoreItem>
+</file>
+
+<file path=customXml/itemProps2.xml><?xml version="1.0" encoding="utf-8"?>
+<ds:datastoreItem xmlns:ds="http://schemas.openxmlformats.org/officeDocument/2006/customXml" ds:itemID="{47D7D20A-5C87-427E-8B8D-3343B9C6406D}">
+  <ds:schemaRefs>
+    <ds:schemaRef ds:uri="http://schemas.microsoft.com/sharepoint/v3/contenttype/forms"/>
+  </ds:schemaRefs>
+</ds:datastoreItem>
+</file>
+
+<file path=customXml/itemProps3.xml><?xml version="1.0" encoding="utf-8"?>
+<ds:datastoreItem xmlns:ds="http://schemas.openxmlformats.org/officeDocument/2006/customXml" ds:itemID="{52F8D590-B38F-4B4A-8BDD-FD59D16A4DE7}">
+  <ds:schemaRefs>
+    <ds:schemaRef ds:uri="http://schemas.microsoft.com/office/2006/metadata/properties"/>
+    <ds:schemaRef ds:uri="http://schemas.microsoft.com/office/infopath/2007/PartnerControls"/>
+    <ds:schemaRef ds:uri="453e7e53-5eb2-45cf-b2ab-34c867e554b8"/>
+    <ds:schemaRef ds:uri="aa0d983d-359a-438c-9953-3af1a8ac0831"/>
+  </ds:schemaRefs>
+</ds:datastoreItem>
 </file>
</xml_diff>